<commit_message>
Diagrama de flujo de informacion
</commit_message>
<xml_diff>
--- a/ENTREGAS/Documento de Diseño del Sistema.docx
+++ b/ENTREGAS/Documento de Diseño del Sistema.docx
@@ -1,6 +1,6 @@
 
 <file path=word/document.xml><?xml version="1.0" encoding="utf-8"?>
-<w:document xmlns:wpc="http://schemas.microsoft.com/office/word/2010/wordprocessingCanvas" xmlns:cx="http://schemas.microsoft.com/office/drawing/2014/chartex" xmlns:cx1="http://schemas.microsoft.com/office/drawing/2015/9/8/chartex" xmlns:cx2="http://schemas.microsoft.com/office/drawing/2015/10/21/chartex" xmlns:cx3="http://schemas.microsoft.com/office/drawing/2016/5/9/chartex" xmlns:cx4="http://schemas.microsoft.com/office/drawing/2016/5/10/chartex" xmlns:cx5="http://schemas.microsoft.com/office/drawing/2016/5/11/chartex" xmlns:cx6="http://schemas.microsoft.com/office/drawing/2016/5/12/chartex" xmlns:cx7="http://schemas.microsoft.com/office/drawing/2016/5/13/chartex" xmlns:cx8="http://schemas.microsoft.com/office/drawing/2016/5/14/chartex" xmlns:mc="http://schemas.openxmlformats.org/markup-compatibility/2006" xmlns:aink="http://schemas.microsoft.com/office/drawing/2016/ink" xmlns:am3d="http://schemas.microsoft.com/office/drawing/2017/model3d" xmlns:o="urn:schemas-microsoft-com:office:office" xmlns:oel="http://schemas.microsoft.com/office/2019/extlst" xmlns:r="http://schemas.openxmlformats.org/officeDocument/2006/relationships" xmlns:m="http://schemas.openxmlformats.org/officeDocument/2006/math" xmlns:v="urn:schemas-microsoft-com:vml" xmlns:wp14="http://schemas.microsoft.com/office/word/2010/wordprocessingDrawing" xmlns:wp="http://schemas.openxmlformats.org/drawingml/2006/wordprocessingDrawing" xmlns:w10="urn:schemas-microsoft-com:office:word" xmlns:w="http://schemas.openxmlformats.org/wordprocessingml/2006/main" xmlns:w14="http://schemas.microsoft.com/office/word/2010/wordml" xmlns:w15="http://schemas.microsoft.com/office/word/2012/wordml" xmlns:w16cex="http://schemas.microsoft.com/office/word/2018/wordml/cex" xmlns:w16cid="http://schemas.microsoft.com/office/word/2016/wordml/cid" xmlns:w16="http://schemas.microsoft.com/office/word/2018/wordml" xmlns:w16sdtdh="http://schemas.microsoft.com/office/word/2020/wordml/sdtdatahash" xmlns:w16se="http://schemas.microsoft.com/office/word/2015/wordml/symex" xmlns:wpg="http://schemas.microsoft.com/office/word/2010/wordprocessingGroup" xmlns:wpi="http://schemas.microsoft.com/office/word/2010/wordprocessingInk" xmlns:wne="http://schemas.microsoft.com/office/word/2006/wordml" xmlns:wps="http://schemas.microsoft.com/office/word/2010/wordprocessingShape" mc:Ignorable="w14 w15 w16se w16cid w16 w16cex w16sdtdh wp14">
+<w:document xmlns:wpc="http://schemas.microsoft.com/office/word/2010/wordprocessingCanvas" xmlns:cx="http://schemas.microsoft.com/office/drawing/2014/chartex" xmlns:cx1="http://schemas.microsoft.com/office/drawing/2015/9/8/chartex" xmlns:cx2="http://schemas.microsoft.com/office/drawing/2015/10/21/chartex" xmlns:cx3="http://schemas.microsoft.com/office/drawing/2016/5/9/chartex" xmlns:cx4="http://schemas.microsoft.com/office/drawing/2016/5/10/chartex" xmlns:cx5="http://schemas.microsoft.com/office/drawing/2016/5/11/chartex" xmlns:cx6="http://schemas.microsoft.com/office/drawing/2016/5/12/chartex" xmlns:cx7="http://schemas.microsoft.com/office/drawing/2016/5/13/chartex" xmlns:cx8="http://schemas.microsoft.com/office/drawing/2016/5/14/chartex" xmlns:mc="http://schemas.openxmlformats.org/markup-compatibility/2006" xmlns:aink="http://schemas.microsoft.com/office/drawing/2016/ink" xmlns:am3d="http://schemas.microsoft.com/office/drawing/2017/model3d" xmlns:o="urn:schemas-microsoft-com:office:office" xmlns:oel="http://schemas.microsoft.com/office/2019/extlst" xmlns:r="http://schemas.openxmlformats.org/officeDocument/2006/relationships" xmlns:m="http://schemas.openxmlformats.org/officeDocument/2006/math" xmlns:v="urn:schemas-microsoft-com:vml" xmlns:wp14="http://schemas.microsoft.com/office/word/2010/wordprocessingDrawing" xmlns:wp="http://schemas.openxmlformats.org/drawingml/2006/wordprocessingDrawing" xmlns:w10="urn:schemas-microsoft-com:office:word" xmlns:w="http://schemas.openxmlformats.org/wordprocessingml/2006/main" xmlns:w14="http://schemas.microsoft.com/office/word/2010/wordml" xmlns:w15="http://schemas.microsoft.com/office/word/2012/wordml" xmlns:w16cex="http://schemas.microsoft.com/office/word/2018/wordml/cex" xmlns:w16cid="http://schemas.microsoft.com/office/word/2016/wordml/cid" xmlns:w16="http://schemas.microsoft.com/office/word/2018/wordml" xmlns:w16du="http://schemas.microsoft.com/office/word/2023/wordml/word16du" xmlns:w16sdtdh="http://schemas.microsoft.com/office/word/2020/wordml/sdtdatahash" xmlns:w16sdtfl="http://schemas.microsoft.com/office/word/2024/wordml/sdtformatlock" xmlns:w16se="http://schemas.microsoft.com/office/word/2015/wordml/symex" xmlns:wpg="http://schemas.microsoft.com/office/word/2010/wordprocessingGroup" xmlns:wpi="http://schemas.microsoft.com/office/word/2010/wordprocessingInk" xmlns:wne="http://schemas.microsoft.com/office/word/2006/wordml" xmlns:wps="http://schemas.microsoft.com/office/word/2010/wordprocessingShape" mc:Ignorable="w14 w15 w16se w16cid w16 w16cex w16sdtdh w16sdtfl w16du wp14">
   <w:body>
     <w:p>
       <w:pPr>
@@ -70,6 +70,182 @@
           <w:bCs/>
         </w:rPr>
       </w:pPr>
+    </w:p>
+    <w:p>
+      <w:pPr>
+        <w:rPr>
+          <w:b/>
+          <w:bCs/>
+        </w:rPr>
+      </w:pPr>
+      <w:r>
+        <w:rPr>
+          <w:b/>
+          <w:bCs/>
+        </w:rPr>
+        <w:t>2. Diagrama de flujo de información.</w:t>
+      </w:r>
+    </w:p>
+    <w:p>
+      <w:pPr>
+        <w:rPr>
+          <w:b/>
+          <w:bCs/>
+        </w:rPr>
+      </w:pPr>
+      <w:r>
+        <w:rPr>
+          <w:b/>
+          <w:bCs/>
+          <w:noProof/>
+        </w:rPr>
+        <w:drawing>
+          <wp:inline distT="0" distB="0" distL="0" distR="0" wp14:anchorId="4058E23C" wp14:editId="4DEF242C">
+            <wp:extent cx="5612130" cy="3397250"/>
+            <wp:effectExtent l="0" t="0" r="7620" b="0"/>
+            <wp:docPr id="485364678" name="Imagen 1"/>
+            <wp:cNvGraphicFramePr>
+              <a:graphicFrameLocks xmlns:a="http://schemas.openxmlformats.org/drawingml/2006/main" noChangeAspect="1"/>
+            </wp:cNvGraphicFramePr>
+            <a:graphic xmlns:a="http://schemas.openxmlformats.org/drawingml/2006/main">
+              <a:graphicData uri="http://schemas.openxmlformats.org/drawingml/2006/picture">
+                <pic:pic xmlns:pic="http://schemas.openxmlformats.org/drawingml/2006/picture">
+                  <pic:nvPicPr>
+                    <pic:cNvPr id="485364678" name="Imagen 485364678"/>
+                    <pic:cNvPicPr/>
+                  </pic:nvPicPr>
+                  <pic:blipFill>
+                    <a:blip r:embed="rId4">
+                      <a:extLst>
+                        <a:ext uri="{28A0092B-C50C-407E-A947-70E740481C1C}">
+                          <a14:useLocalDpi xmlns:a14="http://schemas.microsoft.com/office/drawing/2010/main" val="0"/>
+                        </a:ext>
+                      </a:extLst>
+                    </a:blip>
+                    <a:stretch>
+                      <a:fillRect/>
+                    </a:stretch>
+                  </pic:blipFill>
+                  <pic:spPr>
+                    <a:xfrm>
+                      <a:off x="0" y="0"/>
+                      <a:ext cx="5612130" cy="3397250"/>
+                    </a:xfrm>
+                    <a:prstGeom prst="rect">
+                      <a:avLst/>
+                    </a:prstGeom>
+                  </pic:spPr>
+                </pic:pic>
+              </a:graphicData>
+            </a:graphic>
+          </wp:inline>
+        </w:drawing>
+      </w:r>
+      <w:r>
+        <w:rPr>
+          <w:b/>
+          <w:bCs/>
+        </w:rPr>
+        <w:t xml:space="preserve"> </w:t>
+      </w:r>
+    </w:p>
+    <w:p>
+      <w:pPr>
+        <w:rPr>
+          <w:b/>
+          <w:bCs/>
+        </w:rPr>
+      </w:pPr>
+      <w:r>
+        <w:rPr>
+          <w:b/>
+          <w:bCs/>
+        </w:rPr>
+        <w:t>Diagrama de Flujo de Información – EMPLANORTE</w:t>
+      </w:r>
+    </w:p>
+    <w:p>
+      <w:pPr>
+        <w:rPr>
+          <w:b/>
+          <w:bCs/>
+        </w:rPr>
+      </w:pPr>
+      <w:r>
+        <w:rPr>
+          <w:b/>
+          <w:bCs/>
+        </w:rPr>
+        <w:t>El diagrama muestra como fluye la información del sistema:</w:t>
+      </w:r>
+    </w:p>
+    <w:p>
+      <w:pPr>
+        <w:rPr>
+          <w:b/>
+          <w:bCs/>
+        </w:rPr>
+      </w:pPr>
+      <w:r>
+        <w:rPr>
+          <w:b/>
+          <w:bCs/>
+        </w:rPr>
+        <w:t xml:space="preserve">Administrador – el Administrador hace los registros, consultas y </w:t>
+      </w:r>
+      <w:proofErr w:type="spellStart"/>
+      <w:r>
+        <w:rPr>
+          <w:b/>
+          <w:bCs/>
+        </w:rPr>
+        <w:t>envio</w:t>
+      </w:r>
+      <w:proofErr w:type="spellEnd"/>
+      <w:r>
+        <w:rPr>
+          <w:b/>
+          <w:bCs/>
+        </w:rPr>
+        <w:t xml:space="preserve"> de datos que pasan por cada </w:t>
+      </w:r>
+      <w:r>
+        <w:rPr>
+          <w:b/>
+          <w:bCs/>
+        </w:rPr>
+        <w:t>módulo</w:t>
+      </w:r>
+      <w:r>
+        <w:rPr>
+          <w:b/>
+          <w:bCs/>
+        </w:rPr>
+        <w:t xml:space="preserve"> del sistema</w:t>
+      </w:r>
+    </w:p>
+    <w:p>
+      <w:pPr>
+        <w:rPr>
+          <w:b/>
+          <w:bCs/>
+        </w:rPr>
+      </w:pPr>
+      <w:r>
+        <w:rPr>
+          <w:b/>
+          <w:bCs/>
+        </w:rPr>
+        <w:t>Base de Datos – La base de datos almacena cada dato, los administra y lo filtra según las necesidades del administrador.</w:t>
+      </w:r>
+    </w:p>
+    <w:p>
+      <w:pPr>
+        <w:rPr>
+          <w:b/>
+          <w:bCs/>
+        </w:rPr>
+      </w:pPr>
       <w:r>
         <w:rPr>
           <w:b/>
@@ -91,6 +267,7 @@
           <w:bCs/>
           <w:noProof/>
         </w:rPr>
+        <w:lastRenderedPageBreak/>
         <w:drawing>
           <wp:inline distT="0" distB="0" distL="0" distR="0" wp14:anchorId="033A7E9C" wp14:editId="074E7DBD">
             <wp:extent cx="5612130" cy="3035300"/>
@@ -107,7 +284,7 @@
                     <pic:cNvPicPr/>
                   </pic:nvPicPr>
                   <pic:blipFill>
-                    <a:blip r:embed="rId4" cstate="print">
+                    <a:blip r:embed="rId5" cstate="print">
                       <a:extLst>
                         <a:ext uri="{28A0092B-C50C-407E-A947-70E740481C1C}">
                           <a14:useLocalDpi xmlns:a14="http://schemas.microsoft.com/office/drawing/2010/main" val="0"/>
@@ -209,22 +386,14 @@
       </w:r>
       <w:proofErr w:type="spellEnd"/>
       <w:r>
-        <w:t xml:space="preserve"> en Java con Spring </w:t>
+        <w:t xml:space="preserve"> en Java con Spring Boot (que ejecuta toda la lógica del negocio). Aquí se despliegan los 9 módulos: </w:t>
       </w:r>
       <w:proofErr w:type="spellStart"/>
       <w:r>
-        <w:t>Boot</w:t>
+        <w:t>Dashboard</w:t>
       </w:r>
       <w:proofErr w:type="spellEnd"/>
       <w:r>
-        <w:t xml:space="preserve"> (que ejecuta toda la lógica del negocio). Aquí se despliegan los 9 módulos: </w:t>
-      </w:r>
-      <w:proofErr w:type="spellStart"/>
-      <w:r>
-        <w:t>Dashboard</w:t>
-      </w:r>
-      <w:proofErr w:type="spellEnd"/>
-      <w:r>
         <w:t>, Ventas, Inventario, Clientes, Cotizaciones, Gastos, Estadísticas, Reportes y Autenticación.</w:t>
       </w:r>
     </w:p>
@@ -234,7 +403,6 @@
           <w:b/>
           <w:bCs/>
         </w:rPr>
-        <w:lastRenderedPageBreak/>
         <w:t>Servidor de Base de Datos</w:t>
       </w:r>
       <w:r>
@@ -294,7 +462,7 @@
 </file>
 
 <file path=word/styles.xml><?xml version="1.0" encoding="utf-8"?>
-<w:styles xmlns:mc="http://schemas.openxmlformats.org/markup-compatibility/2006" xmlns:r="http://schemas.openxmlformats.org/officeDocument/2006/relationships" xmlns:w="http://schemas.openxmlformats.org/wordprocessingml/2006/main" xmlns:w14="http://schemas.microsoft.com/office/word/2010/wordml" xmlns:w15="http://schemas.microsoft.com/office/word/2012/wordml" xmlns:w16cex="http://schemas.microsoft.com/office/word/2018/wordml/cex" xmlns:w16cid="http://schemas.microsoft.com/office/word/2016/wordml/cid" xmlns:w16="http://schemas.microsoft.com/office/word/2018/wordml" xmlns:w16sdtdh="http://schemas.microsoft.com/office/word/2020/wordml/sdtdatahash" xmlns:w16se="http://schemas.microsoft.com/office/word/2015/wordml/symex" mc:Ignorable="w14 w15 w16se w16cid w16 w16cex w16sdtdh">
+<w:styles xmlns:mc="http://schemas.openxmlformats.org/markup-compatibility/2006" xmlns:r="http://schemas.openxmlformats.org/officeDocument/2006/relationships" xmlns:w="http://schemas.openxmlformats.org/wordprocessingml/2006/main" xmlns:w14="http://schemas.microsoft.com/office/word/2010/wordml" xmlns:w15="http://schemas.microsoft.com/office/word/2012/wordml" xmlns:w16cex="http://schemas.microsoft.com/office/word/2018/wordml/cex" xmlns:w16cid="http://schemas.microsoft.com/office/word/2016/wordml/cid" xmlns:w16="http://schemas.microsoft.com/office/word/2018/wordml" xmlns:w16du="http://schemas.microsoft.com/office/word/2023/wordml/word16du" xmlns:w16sdtdh="http://schemas.microsoft.com/office/word/2020/wordml/sdtdatahash" xmlns:w16sdtfl="http://schemas.microsoft.com/office/word/2024/wordml/sdtformatlock" xmlns:w16se="http://schemas.microsoft.com/office/word/2015/wordml/symex" mc:Ignorable="w14 w15 w16se w16cid w16 w16cex w16sdtdh w16sdtfl w16du">
   <w:docDefaults>
     <w:rPrDefault>
       <w:rPr>
@@ -896,6 +1064,7 @@
   <w:style w:type="character" w:default="1" w:styleId="Fuentedeprrafopredeter">
     <w:name w:val="Default Paragraph Font"/>
     <w:uiPriority w:val="1"/>
+    <w:semiHidden/>
     <w:unhideWhenUsed/>
   </w:style>
   <w:style w:type="table" w:default="1" w:styleId="Tablanormal">

</xml_diff>

<commit_message>
actividad 3 actualizada word
</commit_message>
<xml_diff>
--- a/ENTREGAS/Documento de Diseño del Sistema.docx
+++ b/ENTREGAS/Documento de Diseño del Sistema.docx
@@ -20,6 +20,228 @@
     </w:p>
     <w:p>
       <w:pPr>
+        <w:rPr>
+          <w:b/>
+          <w:bCs/>
+        </w:rPr>
+      </w:pPr>
+      <w:r>
+        <w:rPr>
+          <w:b/>
+          <w:bCs/>
+        </w:rPr>
+        <w:t xml:space="preserve">ACTIVIDAD 3 </w:t>
+      </w:r>
+    </w:p>
+    <w:p>
+      <w:pPr>
+        <w:rPr>
+          <w:b/>
+          <w:bCs/>
+        </w:rPr>
+      </w:pPr>
+      <w:r>
+        <w:rPr>
+          <w:b/>
+          <w:bCs/>
+        </w:rPr>
+        <w:t>Proyecto: Sistema Web de Gestión Comercial, Inventario y Reportes para EMPLANORTE S.A.S.</w:t>
+      </w:r>
+    </w:p>
+    <w:p>
+      <w:pPr>
+        <w:rPr>
+          <w:b/>
+          <w:bCs/>
+        </w:rPr>
+      </w:pPr>
+      <w:r>
+        <w:rPr>
+          <w:b/>
+          <w:bCs/>
+        </w:rPr>
+        <w:t>Integrantes:</w:t>
+      </w:r>
+    </w:p>
+    <w:p>
+      <w:pPr>
+        <w:pStyle w:val="ListParagraph"/>
+        <w:numPr>
+          <w:ilvl w:val="0"/>
+          <w:numId w:val="2"/>
+        </w:numPr>
+      </w:pPr>
+      <w:r>
+        <w:t xml:space="preserve">Salomé Amaya Rios </w:t>
+      </w:r>
+    </w:p>
+    <w:p>
+      <w:pPr>
+        <w:pStyle w:val="ListParagraph"/>
+        <w:numPr>
+          <w:ilvl w:val="0"/>
+          <w:numId w:val="2"/>
+        </w:numPr>
+      </w:pPr>
+      <w:proofErr w:type="spellStart"/>
+      <w:r>
+        <w:t>Duvan</w:t>
+      </w:r>
+      <w:proofErr w:type="spellEnd"/>
+      <w:r>
+        <w:t xml:space="preserve"> </w:t>
+      </w:r>
+      <w:proofErr w:type="spellStart"/>
+      <w:r>
+        <w:t>Manza</w:t>
+      </w:r>
+      <w:proofErr w:type="spellEnd"/>
+    </w:p>
+    <w:p>
+      <w:pPr>
+        <w:pStyle w:val="ListParagraph"/>
+        <w:numPr>
+          <w:ilvl w:val="0"/>
+          <w:numId w:val="2"/>
+        </w:numPr>
+      </w:pPr>
+      <w:r>
+        <w:t xml:space="preserve">Luis </w:t>
+      </w:r>
+      <w:proofErr w:type="spellStart"/>
+      <w:r>
+        <w:t>Chacon</w:t>
+      </w:r>
+      <w:proofErr w:type="spellEnd"/>
+    </w:p>
+    <w:p>
+      <w:pPr>
+        <w:rPr>
+          <w:b/>
+          <w:bCs/>
+        </w:rPr>
+      </w:pPr>
+    </w:p>
+    <w:p>
+      <w:pPr>
+        <w:pStyle w:val="ListParagraph"/>
+        <w:numPr>
+          <w:ilvl w:val="0"/>
+          <w:numId w:val="3"/>
+        </w:numPr>
+        <w:rPr>
+          <w:b/>
+          <w:bCs/>
+        </w:rPr>
+      </w:pPr>
+      <w:r>
+        <w:rPr>
+          <w:b/>
+          <w:bCs/>
+        </w:rPr>
+        <w:t>Descripción general del sistema + Diagrama de casos de uso general (PRIMERA ACTIVIDAD ARCHIVO 1)</w:t>
+      </w:r>
+    </w:p>
+    <w:p>
+      <w:r>
+        <w:t>El sistema EMPLANORTE es una aplicación web orientada a la gestión comercial, inventario y control financiero de un negocio de envases plásticos. Permite centralizar procesos como registro de productos, ventas, clientes, gastos, cotizaciones y generación de reportes.</w:t>
+      </w:r>
+    </w:p>
+    <w:p>
+      <w:r>
+        <w:t>El sistema cuenta con un único actor principal, el Administrador, quien interactúa con todas las funcionalidades del sistema.</w:t>
+      </w:r>
+    </w:p>
+    <w:p>
+      <w:pPr>
+        <w:spacing w:before="100" w:beforeAutospacing="1" w:after="100" w:afterAutospacing="1" w:line="240" w:lineRule="auto"/>
+        <w:rPr>
+          <w:rFonts w:ascii="Times New Roman" w:eastAsia="Times New Roman" w:hAnsi="Times New Roman" w:cs="Times New Roman"/>
+          <w:kern w:val="0"/>
+          <w14:ligatures w14:val="none"/>
+        </w:rPr>
+      </w:pPr>
+      <w:r>
+        <w:rPr>
+          <w:rFonts w:ascii="Times New Roman" w:eastAsia="Times New Roman" w:hAnsi="Times New Roman" w:cs="Times New Roman"/>
+          <w:kern w:val="0"/>
+          <w14:ligatures w14:val="none"/>
+        </w:rPr>
+        <w:tab/>
+      </w:r>
+    </w:p>
+    <w:p>
+      <w:pPr>
+        <w:pStyle w:val="ListParagraph"/>
+        <w:numPr>
+          <w:ilvl w:val="0"/>
+          <w:numId w:val="3"/>
+        </w:numPr>
+        <w:rPr>
+          <w:b/>
+          <w:bCs/>
+        </w:rPr>
+      </w:pPr>
+      <w:r>
+        <w:rPr>
+          <w:b/>
+          <w:bCs/>
+        </w:rPr>
+        <w:t xml:space="preserve">Diagrama de secuencia </w:t>
+      </w:r>
+    </w:p>
+    <w:p>
+      <w:pPr>
+        <w:rPr>
+          <w:b/>
+          <w:bCs/>
+        </w:rPr>
+      </w:pPr>
+      <w:r>
+        <w:rPr>
+          <w:noProof/>
+          <w:lang w:val="es-ES_tradnl"/>
+        </w:rPr>
+        <w:lastRenderedPageBreak/>
+        <w:drawing>
+          <wp:inline distT="0" distB="0" distL="0" distR="0" wp14:anchorId="21A3E7AB" wp14:editId="27146B6B">
+            <wp:extent cx="5612130" cy="6898843"/>
+            <wp:effectExtent l="0" t="0" r="1270" b="0"/>
+            <wp:docPr id="1902034951" name="Picture 1"/>
+            <wp:cNvGraphicFramePr>
+              <a:graphicFrameLocks xmlns:a="http://schemas.openxmlformats.org/drawingml/2006/main" noChangeAspect="1"/>
+            </wp:cNvGraphicFramePr>
+            <a:graphic xmlns:a="http://schemas.openxmlformats.org/drawingml/2006/main">
+              <a:graphicData uri="http://schemas.openxmlformats.org/drawingml/2006/picture">
+                <pic:pic xmlns:pic="http://schemas.openxmlformats.org/drawingml/2006/picture">
+                  <pic:nvPicPr>
+                    <pic:cNvPr id="1902034951" name=""/>
+                    <pic:cNvPicPr/>
+                  </pic:nvPicPr>
+                  <pic:blipFill>
+                    <a:blip r:embed="rId5"/>
+                    <a:stretch>
+                      <a:fillRect/>
+                    </a:stretch>
+                  </pic:blipFill>
+                  <pic:spPr>
+                    <a:xfrm>
+                      <a:off x="0" y="0"/>
+                      <a:ext cx="5612130" cy="6898843"/>
+                    </a:xfrm>
+                    <a:prstGeom prst="rect">
+                      <a:avLst/>
+                    </a:prstGeom>
+                  </pic:spPr>
+                </pic:pic>
+              </a:graphicData>
+            </a:graphic>
+          </wp:inline>
+        </w:drawing>
+      </w:r>
+    </w:p>
+    <w:p>
+      <w:pPr>
         <w:jc w:val="center"/>
         <w:rPr>
           <w:b/>
@@ -34,56 +256,25 @@
           <w:bCs/>
         </w:rPr>
       </w:pPr>
-      <w:r>
-        <w:rPr>
-          <w:b/>
-          <w:bCs/>
-        </w:rPr>
-        <w:t>Objetivo de la actividad</w:t>
-      </w:r>
-    </w:p>
-    <w:p>
-      <w:r>
-        <w:t>Representar el sistema mediante modelos que permitan comprender su estructura, comportamiento y organización de los datos.</w:t>
-      </w:r>
-    </w:p>
-    <w:p/>
-    <w:p>
-      <w:pPr>
-        <w:rPr>
-          <w:b/>
-          <w:bCs/>
-        </w:rPr>
-      </w:pPr>
-      <w:r>
-        <w:rPr>
-          <w:b/>
-          <w:bCs/>
-        </w:rPr>
-        <w:t>Entregables de la actividad</w:t>
-      </w:r>
-    </w:p>
-    <w:p>
-      <w:pPr>
-        <w:rPr>
-          <w:b/>
-          <w:bCs/>
-        </w:rPr>
-      </w:pPr>
-    </w:p>
-    <w:p>
-      <w:pPr>
-        <w:rPr>
-          <w:b/>
-          <w:bCs/>
-        </w:rPr>
-      </w:pPr>
-      <w:r>
-        <w:rPr>
-          <w:b/>
-          <w:bCs/>
-        </w:rPr>
-        <w:t>2. Diagrama de flujo de información.</w:t>
+    </w:p>
+    <w:p>
+      <w:pPr>
+        <w:pStyle w:val="ListParagraph"/>
+        <w:numPr>
+          <w:ilvl w:val="0"/>
+          <w:numId w:val="3"/>
+        </w:numPr>
+        <w:rPr>
+          <w:b/>
+          <w:bCs/>
+        </w:rPr>
+      </w:pPr>
+      <w:r>
+        <w:rPr>
+          <w:b/>
+          <w:bCs/>
+        </w:rPr>
+        <w:t xml:space="preserve"> Diagrama de flujo de información.</w:t>
       </w:r>
     </w:p>
     <w:p>
@@ -99,6 +290,7 @@
           <w:bCs/>
           <w:noProof/>
         </w:rPr>
+        <w:lastRenderedPageBreak/>
         <w:drawing>
           <wp:inline distT="0" distB="0" distL="0" distR="0" wp14:anchorId="4058E23C" wp14:editId="4DEF242C">
             <wp:extent cx="5612130" cy="3397250"/>
@@ -115,7 +307,7 @@
                     <pic:cNvPicPr/>
                   </pic:nvPicPr>
                   <pic:blipFill>
-                    <a:blip r:embed="rId4">
+                    <a:blip r:embed="rId6">
                       <a:extLst>
                         <a:ext uri="{28A0092B-C50C-407E-A947-70E740481C1C}">
                           <a14:useLocalDpi xmlns:a14="http://schemas.microsoft.com/office/drawing/2010/main" val="0"/>
@@ -246,12 +438,196 @@
           <w:bCs/>
         </w:rPr>
       </w:pPr>
-      <w:r>
-        <w:rPr>
-          <w:b/>
-          <w:bCs/>
-        </w:rPr>
-        <w:t>6. Diagrama de despliegue</w:t>
+    </w:p>
+    <w:p>
+      <w:pPr>
+        <w:pStyle w:val="ListParagraph"/>
+        <w:numPr>
+          <w:ilvl w:val="0"/>
+          <w:numId w:val="3"/>
+        </w:numPr>
+        <w:spacing w:before="100" w:beforeAutospacing="1" w:after="100" w:afterAutospacing="1" w:line="240" w:lineRule="auto"/>
+        <w:outlineLvl w:val="0"/>
+        <w:rPr>
+          <w:rFonts w:eastAsia="Times New Roman" w:cs="Times New Roman"/>
+          <w:b/>
+          <w:bCs/>
+          <w:kern w:val="36"/>
+          <w14:ligatures w14:val="none"/>
+        </w:rPr>
+      </w:pPr>
+      <w:r>
+        <w:rPr>
+          <w:rFonts w:eastAsia="Times New Roman" w:cs="Times New Roman"/>
+          <w:b/>
+          <w:bCs/>
+          <w:kern w:val="36"/>
+          <w14:ligatures w14:val="none"/>
+        </w:rPr>
+        <w:t xml:space="preserve"> Arquitectura del sistema</w:t>
+      </w:r>
+    </w:p>
+    <w:p>
+      <w:pPr>
+        <w:spacing w:before="100" w:beforeAutospacing="1" w:after="100" w:afterAutospacing="1" w:line="240" w:lineRule="auto"/>
+        <w:outlineLvl w:val="2"/>
+        <w:rPr>
+          <w:rFonts w:eastAsia="Times New Roman" w:cs="Times New Roman"/>
+          <w:b/>
+          <w:bCs/>
+          <w:kern w:val="0"/>
+          <w14:ligatures w14:val="none"/>
+        </w:rPr>
+      </w:pPr>
+      <w:r>
+        <w:rPr>
+          <w:rFonts w:eastAsia="Times New Roman" w:cs="Times New Roman"/>
+          <w:b/>
+          <w:bCs/>
+          <w:kern w:val="0"/>
+          <w14:ligatures w14:val="none"/>
+        </w:rPr>
+        <w:t>Tipo de arquitectura:</w:t>
+      </w:r>
+    </w:p>
+    <w:p>
+      <w:pPr>
+        <w:spacing w:before="100" w:beforeAutospacing="1" w:after="100" w:afterAutospacing="1" w:line="240" w:lineRule="auto"/>
+        <w:rPr>
+          <w:rFonts w:eastAsia="Times New Roman" w:cs="Times New Roman"/>
+          <w:kern w:val="0"/>
+          <w14:ligatures w14:val="none"/>
+        </w:rPr>
+      </w:pPr>
+      <w:r>
+        <w:rPr>
+          <w:rFonts w:eastAsia="Times New Roman" w:cs="Times New Roman"/>
+          <w:kern w:val="0"/>
+          <w14:ligatures w14:val="none"/>
+        </w:rPr>
+        <w:t>Arquitectura en tres capas</w:t>
+      </w:r>
+    </w:p>
+    <w:p>
+      <w:pPr>
+        <w:pStyle w:val="NormalWeb"/>
+        <w:rPr>
+          <w:rFonts w:asciiTheme="minorHAnsi" w:hAnsiTheme="minorHAnsi"/>
+        </w:rPr>
+      </w:pPr>
+      <w:r>
+        <w:rPr>
+          <w:rFonts w:asciiTheme="minorHAnsi" w:hAnsiTheme="minorHAnsi"/>
+        </w:rPr>
+        <w:t>El sistema EMPLANORTE se basa en una arquitectura en tres capas, la cual permite organizar el funcionamiento del sistema de manera estructurada y eficiente. Esta arquitectura divide el sistema en capa de presentación, capa lógica y capa de datos, facilitando el mantenimiento, escalabilidad y seguridad de la aplicación.</w:t>
+      </w:r>
+    </w:p>
+    <w:p>
+      <w:pPr>
+        <w:pStyle w:val="NormalWeb"/>
+        <w:rPr>
+          <w:rFonts w:asciiTheme="minorHAnsi" w:hAnsiTheme="minorHAnsi"/>
+        </w:rPr>
+      </w:pPr>
+      <w:r>
+        <w:rPr>
+          <w:rFonts w:asciiTheme="minorHAnsi" w:hAnsiTheme="minorHAnsi"/>
+        </w:rPr>
+        <w:t xml:space="preserve">La capa de presentación corresponde a la interfaz web con la que interactúa el administrador, permitiéndole registrar productos, ventas, clientes, gastos y consultar reportes. La capa lógica se encarga de procesar la información, realizar cálculos </w:t>
+      </w:r>
+      <w:r>
+        <w:rPr>
+          <w:rFonts w:asciiTheme="minorHAnsi" w:hAnsiTheme="minorHAnsi"/>
+        </w:rPr>
+        <w:lastRenderedPageBreak/>
+        <w:t>como el total de ventas y ganancias, validar datos y gestionar las reglas del negocio. Finalmente, la capa de datos almacena toda la información en la base de datos, garantizando la integridad y disponibilidad de los datos.</w:t>
+      </w:r>
+    </w:p>
+    <w:p>
+      <w:pPr>
+        <w:pStyle w:val="NormalWeb"/>
+        <w:rPr>
+          <w:rFonts w:asciiTheme="minorHAnsi" w:hAnsiTheme="minorHAnsi"/>
+        </w:rPr>
+      </w:pPr>
+      <w:r>
+        <w:rPr>
+          <w:rFonts w:asciiTheme="minorHAnsi" w:hAnsiTheme="minorHAnsi"/>
+        </w:rPr>
+        <w:t>Este tipo de arquitectura permite que el sistema funcione de manera organizada, separando responsabilidades y facilitando futuras mejoras o integraciones.</w:t>
+      </w:r>
+    </w:p>
+    <w:p>
+      <w:pPr>
+        <w:pStyle w:val="ListParagraph"/>
+      </w:pPr>
+      <w:r>
+        <w:rPr>
+          <w:noProof/>
+        </w:rPr>
+        <w:drawing>
+          <wp:inline distT="0" distB="0" distL="0" distR="0" wp14:anchorId="2FF88003" wp14:editId="6B53ACDB">
+            <wp:extent cx="2237361" cy="3272558"/>
+            <wp:effectExtent l="0" t="0" r="0" b="4445"/>
+            <wp:docPr id="2080711857" name="Picture 1"/>
+            <wp:cNvGraphicFramePr>
+              <a:graphicFrameLocks xmlns:a="http://schemas.openxmlformats.org/drawingml/2006/main" noChangeAspect="1"/>
+            </wp:cNvGraphicFramePr>
+            <a:graphic xmlns:a="http://schemas.openxmlformats.org/drawingml/2006/main">
+              <a:graphicData uri="http://schemas.openxmlformats.org/drawingml/2006/picture">
+                <pic:pic xmlns:pic="http://schemas.openxmlformats.org/drawingml/2006/picture">
+                  <pic:nvPicPr>
+                    <pic:cNvPr id="2080711857" name=""/>
+                    <pic:cNvPicPr/>
+                  </pic:nvPicPr>
+                  <pic:blipFill>
+                    <a:blip r:embed="rId7"/>
+                    <a:stretch>
+                      <a:fillRect/>
+                    </a:stretch>
+                  </pic:blipFill>
+                  <pic:spPr>
+                    <a:xfrm>
+                      <a:off x="0" y="0"/>
+                      <a:ext cx="2239428" cy="3275581"/>
+                    </a:xfrm>
+                    <a:prstGeom prst="rect">
+                      <a:avLst/>
+                    </a:prstGeom>
+                  </pic:spPr>
+                </pic:pic>
+              </a:graphicData>
+            </a:graphic>
+          </wp:inline>
+        </w:drawing>
+      </w:r>
+    </w:p>
+    <w:p>
+      <w:pPr>
+        <w:rPr>
+          <w:b/>
+          <w:bCs/>
+        </w:rPr>
+      </w:pPr>
+    </w:p>
+    <w:p>
+      <w:pPr>
+        <w:pStyle w:val="ListParagraph"/>
+        <w:numPr>
+          <w:ilvl w:val="0"/>
+          <w:numId w:val="3"/>
+        </w:numPr>
+        <w:rPr>
+          <w:b/>
+          <w:bCs/>
+        </w:rPr>
+      </w:pPr>
+      <w:r>
+        <w:rPr>
+          <w:b/>
+          <w:bCs/>
+        </w:rPr>
+        <w:t>Diagrama de despliegue</w:t>
       </w:r>
     </w:p>
     <w:p>
@@ -284,7 +660,7 @@
                     <pic:cNvPicPr/>
                   </pic:nvPicPr>
                   <pic:blipFill>
-                    <a:blip r:embed="rId5" cstate="print">
+                    <a:blip r:embed="rId8" cstate="print">
                       <a:extLst>
                         <a:ext uri="{28A0092B-C50C-407E-A947-70E740481C1C}">
                           <a14:useLocalDpi xmlns:a14="http://schemas.microsoft.com/office/drawing/2010/main" val="0"/>
@@ -459,6 +835,335 @@
     </w:sectPr>
   </w:body>
 </w:document>
+</file>
+
+<file path=word/numbering.xml><?xml version="1.0" encoding="utf-8"?>
+<w:numbering xmlns:wpc="http://schemas.microsoft.com/office/word/2010/wordprocessingCanvas" xmlns:cx="http://schemas.microsoft.com/office/drawing/2014/chartex" xmlns:cx1="http://schemas.microsoft.com/office/drawing/2015/9/8/chartex" xmlns:cx2="http://schemas.microsoft.com/office/drawing/2015/10/21/chartex" xmlns:cx3="http://schemas.microsoft.com/office/drawing/2016/5/9/chartex" xmlns:cx4="http://schemas.microsoft.com/office/drawing/2016/5/10/chartex" xmlns:cx5="http://schemas.microsoft.com/office/drawing/2016/5/11/chartex" xmlns:cx6="http://schemas.microsoft.com/office/drawing/2016/5/12/chartex" xmlns:cx7="http://schemas.microsoft.com/office/drawing/2016/5/13/chartex" xmlns:cx8="http://schemas.microsoft.com/office/drawing/2016/5/14/chartex" xmlns:mc="http://schemas.openxmlformats.org/markup-compatibility/2006" xmlns:aink="http://schemas.microsoft.com/office/drawing/2016/ink" xmlns:am3d="http://schemas.microsoft.com/office/drawing/2017/model3d" xmlns:o="urn:schemas-microsoft-com:office:office" xmlns:oel="http://schemas.microsoft.com/office/2019/extlst" xmlns:r="http://schemas.openxmlformats.org/officeDocument/2006/relationships" xmlns:m="http://schemas.openxmlformats.org/officeDocument/2006/math" xmlns:v="urn:schemas-microsoft-com:vml" xmlns:wp14="http://schemas.microsoft.com/office/word/2010/wordprocessingDrawing" xmlns:wp="http://schemas.openxmlformats.org/drawingml/2006/wordprocessingDrawing" xmlns:w10="urn:schemas-microsoft-com:office:word" xmlns:w="http://schemas.openxmlformats.org/wordprocessingml/2006/main" xmlns:w14="http://schemas.microsoft.com/office/word/2010/wordml" xmlns:w15="http://schemas.microsoft.com/office/word/2012/wordml" xmlns:w16cex="http://schemas.microsoft.com/office/word/2018/wordml/cex" xmlns:w16cid="http://schemas.microsoft.com/office/word/2016/wordml/cid" xmlns:w16="http://schemas.microsoft.com/office/word/2018/wordml" xmlns:w16du="http://schemas.microsoft.com/office/word/2023/wordml/word16du" xmlns:w16sdtdh="http://schemas.microsoft.com/office/word/2020/wordml/sdtdatahash" xmlns:w16sdtfl="http://schemas.microsoft.com/office/word/2024/wordml/sdtformatlock" xmlns:w16se="http://schemas.microsoft.com/office/word/2015/wordml/symex" xmlns:wpg="http://schemas.microsoft.com/office/word/2010/wordprocessingGroup" xmlns:wpi="http://schemas.microsoft.com/office/word/2010/wordprocessingInk" xmlns:wne="http://schemas.microsoft.com/office/word/2006/wordml" xmlns:wps="http://schemas.microsoft.com/office/word/2010/wordprocessingShape" mc:Ignorable="w14 w15 w16se w16cid w16 w16cex w16sdtdh w16sdtfl w16du wp14">
+  <w:abstractNum w:abstractNumId="0" w15:restartNumberingAfterBreak="0">
+    <w:nsid w:val="3C315275"/>
+    <w:multiLevelType w:val="hybridMultilevel"/>
+    <w:tmpl w:val="55201092"/>
+    <w:lvl w:ilvl="0" w:tplc="04090001">
+      <w:start w:val="1"/>
+      <w:numFmt w:val="bullet"/>
+      <w:lvlText w:val=""/>
+      <w:lvlJc w:val="left"/>
+      <w:pPr>
+        <w:ind w:left="720" w:hanging="360"/>
+      </w:pPr>
+      <w:rPr>
+        <w:rFonts w:ascii="Symbol" w:hAnsi="Symbol" w:hint="default"/>
+      </w:rPr>
+    </w:lvl>
+    <w:lvl w:ilvl="1" w:tplc="04090003" w:tentative="1">
+      <w:start w:val="1"/>
+      <w:numFmt w:val="bullet"/>
+      <w:lvlText w:val="o"/>
+      <w:lvlJc w:val="left"/>
+      <w:pPr>
+        <w:ind w:left="1440" w:hanging="360"/>
+      </w:pPr>
+      <w:rPr>
+        <w:rFonts w:ascii="Courier New" w:hAnsi="Courier New" w:cs="Courier New" w:hint="default"/>
+      </w:rPr>
+    </w:lvl>
+    <w:lvl w:ilvl="2" w:tplc="04090005" w:tentative="1">
+      <w:start w:val="1"/>
+      <w:numFmt w:val="bullet"/>
+      <w:lvlText w:val=""/>
+      <w:lvlJc w:val="left"/>
+      <w:pPr>
+        <w:ind w:left="2160" w:hanging="360"/>
+      </w:pPr>
+      <w:rPr>
+        <w:rFonts w:ascii="Wingdings" w:hAnsi="Wingdings" w:hint="default"/>
+      </w:rPr>
+    </w:lvl>
+    <w:lvl w:ilvl="3" w:tplc="04090001" w:tentative="1">
+      <w:start w:val="1"/>
+      <w:numFmt w:val="bullet"/>
+      <w:lvlText w:val=""/>
+      <w:lvlJc w:val="left"/>
+      <w:pPr>
+        <w:ind w:left="2880" w:hanging="360"/>
+      </w:pPr>
+      <w:rPr>
+        <w:rFonts w:ascii="Symbol" w:hAnsi="Symbol" w:hint="default"/>
+      </w:rPr>
+    </w:lvl>
+    <w:lvl w:ilvl="4" w:tplc="04090003" w:tentative="1">
+      <w:start w:val="1"/>
+      <w:numFmt w:val="bullet"/>
+      <w:lvlText w:val="o"/>
+      <w:lvlJc w:val="left"/>
+      <w:pPr>
+        <w:ind w:left="3600" w:hanging="360"/>
+      </w:pPr>
+      <w:rPr>
+        <w:rFonts w:ascii="Courier New" w:hAnsi="Courier New" w:cs="Courier New" w:hint="default"/>
+      </w:rPr>
+    </w:lvl>
+    <w:lvl w:ilvl="5" w:tplc="04090005" w:tentative="1">
+      <w:start w:val="1"/>
+      <w:numFmt w:val="bullet"/>
+      <w:lvlText w:val=""/>
+      <w:lvlJc w:val="left"/>
+      <w:pPr>
+        <w:ind w:left="4320" w:hanging="360"/>
+      </w:pPr>
+      <w:rPr>
+        <w:rFonts w:ascii="Wingdings" w:hAnsi="Wingdings" w:hint="default"/>
+      </w:rPr>
+    </w:lvl>
+    <w:lvl w:ilvl="6" w:tplc="04090001" w:tentative="1">
+      <w:start w:val="1"/>
+      <w:numFmt w:val="bullet"/>
+      <w:lvlText w:val=""/>
+      <w:lvlJc w:val="left"/>
+      <w:pPr>
+        <w:ind w:left="5040" w:hanging="360"/>
+      </w:pPr>
+      <w:rPr>
+        <w:rFonts w:ascii="Symbol" w:hAnsi="Symbol" w:hint="default"/>
+      </w:rPr>
+    </w:lvl>
+    <w:lvl w:ilvl="7" w:tplc="04090003" w:tentative="1">
+      <w:start w:val="1"/>
+      <w:numFmt w:val="bullet"/>
+      <w:lvlText w:val="o"/>
+      <w:lvlJc w:val="left"/>
+      <w:pPr>
+        <w:ind w:left="5760" w:hanging="360"/>
+      </w:pPr>
+      <w:rPr>
+        <w:rFonts w:ascii="Courier New" w:hAnsi="Courier New" w:cs="Courier New" w:hint="default"/>
+      </w:rPr>
+    </w:lvl>
+    <w:lvl w:ilvl="8" w:tplc="04090005" w:tentative="1">
+      <w:start w:val="1"/>
+      <w:numFmt w:val="bullet"/>
+      <w:lvlText w:val=""/>
+      <w:lvlJc w:val="left"/>
+      <w:pPr>
+        <w:ind w:left="6480" w:hanging="360"/>
+      </w:pPr>
+      <w:rPr>
+        <w:rFonts w:ascii="Wingdings" w:hAnsi="Wingdings" w:hint="default"/>
+      </w:rPr>
+    </w:lvl>
+  </w:abstractNum>
+  <w:abstractNum w:abstractNumId="1" w15:restartNumberingAfterBreak="0">
+    <w:nsid w:val="63AE4A21"/>
+    <w:multiLevelType w:val="hybridMultilevel"/>
+    <w:tmpl w:val="AB0C81BC"/>
+    <w:lvl w:ilvl="0" w:tplc="0409000F">
+      <w:start w:val="1"/>
+      <w:numFmt w:val="decimal"/>
+      <w:lvlText w:val="%1."/>
+      <w:lvlJc w:val="left"/>
+      <w:pPr>
+        <w:ind w:left="720" w:hanging="360"/>
+      </w:pPr>
+      <w:rPr>
+        <w:rFonts w:hint="default"/>
+      </w:rPr>
+    </w:lvl>
+    <w:lvl w:ilvl="1" w:tplc="04090019" w:tentative="1">
+      <w:start w:val="1"/>
+      <w:numFmt w:val="lowerLetter"/>
+      <w:lvlText w:val="%2."/>
+      <w:lvlJc w:val="left"/>
+      <w:pPr>
+        <w:ind w:left="1440" w:hanging="360"/>
+      </w:pPr>
+    </w:lvl>
+    <w:lvl w:ilvl="2" w:tplc="0409001B" w:tentative="1">
+      <w:start w:val="1"/>
+      <w:numFmt w:val="lowerRoman"/>
+      <w:lvlText w:val="%3."/>
+      <w:lvlJc w:val="right"/>
+      <w:pPr>
+        <w:ind w:left="2160" w:hanging="180"/>
+      </w:pPr>
+    </w:lvl>
+    <w:lvl w:ilvl="3" w:tplc="0409000F" w:tentative="1">
+      <w:start w:val="1"/>
+      <w:numFmt w:val="decimal"/>
+      <w:lvlText w:val="%4."/>
+      <w:lvlJc w:val="left"/>
+      <w:pPr>
+        <w:ind w:left="2880" w:hanging="360"/>
+      </w:pPr>
+    </w:lvl>
+    <w:lvl w:ilvl="4" w:tplc="04090019" w:tentative="1">
+      <w:start w:val="1"/>
+      <w:numFmt w:val="lowerLetter"/>
+      <w:lvlText w:val="%5."/>
+      <w:lvlJc w:val="left"/>
+      <w:pPr>
+        <w:ind w:left="3600" w:hanging="360"/>
+      </w:pPr>
+    </w:lvl>
+    <w:lvl w:ilvl="5" w:tplc="0409001B" w:tentative="1">
+      <w:start w:val="1"/>
+      <w:numFmt w:val="lowerRoman"/>
+      <w:lvlText w:val="%6."/>
+      <w:lvlJc w:val="right"/>
+      <w:pPr>
+        <w:ind w:left="4320" w:hanging="180"/>
+      </w:pPr>
+    </w:lvl>
+    <w:lvl w:ilvl="6" w:tplc="0409000F" w:tentative="1">
+      <w:start w:val="1"/>
+      <w:numFmt w:val="decimal"/>
+      <w:lvlText w:val="%7."/>
+      <w:lvlJc w:val="left"/>
+      <w:pPr>
+        <w:ind w:left="5040" w:hanging="360"/>
+      </w:pPr>
+    </w:lvl>
+    <w:lvl w:ilvl="7" w:tplc="04090019" w:tentative="1">
+      <w:start w:val="1"/>
+      <w:numFmt w:val="lowerLetter"/>
+      <w:lvlText w:val="%8."/>
+      <w:lvlJc w:val="left"/>
+      <w:pPr>
+        <w:ind w:left="5760" w:hanging="360"/>
+      </w:pPr>
+    </w:lvl>
+    <w:lvl w:ilvl="8" w:tplc="0409001B" w:tentative="1">
+      <w:start w:val="1"/>
+      <w:numFmt w:val="lowerRoman"/>
+      <w:lvlText w:val="%9."/>
+      <w:lvlJc w:val="right"/>
+      <w:pPr>
+        <w:ind w:left="6480" w:hanging="180"/>
+      </w:pPr>
+    </w:lvl>
+  </w:abstractNum>
+  <w:abstractNum w:abstractNumId="2" w15:restartNumberingAfterBreak="0">
+    <w:nsid w:val="78470C7A"/>
+    <w:multiLevelType w:val="hybridMultilevel"/>
+    <w:tmpl w:val="D234A6A2"/>
+    <w:lvl w:ilvl="0" w:tplc="04090001">
+      <w:start w:val="1"/>
+      <w:numFmt w:val="bullet"/>
+      <w:lvlText w:val=""/>
+      <w:lvlJc w:val="left"/>
+      <w:pPr>
+        <w:ind w:left="720" w:hanging="360"/>
+      </w:pPr>
+      <w:rPr>
+        <w:rFonts w:ascii="Symbol" w:hAnsi="Symbol" w:hint="default"/>
+      </w:rPr>
+    </w:lvl>
+    <w:lvl w:ilvl="1" w:tplc="04090003" w:tentative="1">
+      <w:start w:val="1"/>
+      <w:numFmt w:val="bullet"/>
+      <w:lvlText w:val="o"/>
+      <w:lvlJc w:val="left"/>
+      <w:pPr>
+        <w:ind w:left="1440" w:hanging="360"/>
+      </w:pPr>
+      <w:rPr>
+        <w:rFonts w:ascii="Courier New" w:hAnsi="Courier New" w:cs="Courier New" w:hint="default"/>
+      </w:rPr>
+    </w:lvl>
+    <w:lvl w:ilvl="2" w:tplc="04090005" w:tentative="1">
+      <w:start w:val="1"/>
+      <w:numFmt w:val="bullet"/>
+      <w:lvlText w:val=""/>
+      <w:lvlJc w:val="left"/>
+      <w:pPr>
+        <w:ind w:left="2160" w:hanging="360"/>
+      </w:pPr>
+      <w:rPr>
+        <w:rFonts w:ascii="Wingdings" w:hAnsi="Wingdings" w:hint="default"/>
+      </w:rPr>
+    </w:lvl>
+    <w:lvl w:ilvl="3" w:tplc="04090001" w:tentative="1">
+      <w:start w:val="1"/>
+      <w:numFmt w:val="bullet"/>
+      <w:lvlText w:val=""/>
+      <w:lvlJc w:val="left"/>
+      <w:pPr>
+        <w:ind w:left="2880" w:hanging="360"/>
+      </w:pPr>
+      <w:rPr>
+        <w:rFonts w:ascii="Symbol" w:hAnsi="Symbol" w:hint="default"/>
+      </w:rPr>
+    </w:lvl>
+    <w:lvl w:ilvl="4" w:tplc="04090003" w:tentative="1">
+      <w:start w:val="1"/>
+      <w:numFmt w:val="bullet"/>
+      <w:lvlText w:val="o"/>
+      <w:lvlJc w:val="left"/>
+      <w:pPr>
+        <w:ind w:left="3600" w:hanging="360"/>
+      </w:pPr>
+      <w:rPr>
+        <w:rFonts w:ascii="Courier New" w:hAnsi="Courier New" w:cs="Courier New" w:hint="default"/>
+      </w:rPr>
+    </w:lvl>
+    <w:lvl w:ilvl="5" w:tplc="04090005" w:tentative="1">
+      <w:start w:val="1"/>
+      <w:numFmt w:val="bullet"/>
+      <w:lvlText w:val=""/>
+      <w:lvlJc w:val="left"/>
+      <w:pPr>
+        <w:ind w:left="4320" w:hanging="360"/>
+      </w:pPr>
+      <w:rPr>
+        <w:rFonts w:ascii="Wingdings" w:hAnsi="Wingdings" w:hint="default"/>
+      </w:rPr>
+    </w:lvl>
+    <w:lvl w:ilvl="6" w:tplc="04090001" w:tentative="1">
+      <w:start w:val="1"/>
+      <w:numFmt w:val="bullet"/>
+      <w:lvlText w:val=""/>
+      <w:lvlJc w:val="left"/>
+      <w:pPr>
+        <w:ind w:left="5040" w:hanging="360"/>
+      </w:pPr>
+      <w:rPr>
+        <w:rFonts w:ascii="Symbol" w:hAnsi="Symbol" w:hint="default"/>
+      </w:rPr>
+    </w:lvl>
+    <w:lvl w:ilvl="7" w:tplc="04090003" w:tentative="1">
+      <w:start w:val="1"/>
+      <w:numFmt w:val="bullet"/>
+      <w:lvlText w:val="o"/>
+      <w:lvlJc w:val="left"/>
+      <w:pPr>
+        <w:ind w:left="5760" w:hanging="360"/>
+      </w:pPr>
+      <w:rPr>
+        <w:rFonts w:ascii="Courier New" w:hAnsi="Courier New" w:cs="Courier New" w:hint="default"/>
+      </w:rPr>
+    </w:lvl>
+    <w:lvl w:ilvl="8" w:tplc="04090005" w:tentative="1">
+      <w:start w:val="1"/>
+      <w:numFmt w:val="bullet"/>
+      <w:lvlText w:val=""/>
+      <w:lvlJc w:val="left"/>
+      <w:pPr>
+        <w:ind w:left="6480" w:hanging="360"/>
+      </w:pPr>
+      <w:rPr>
+        <w:rFonts w:ascii="Wingdings" w:hAnsi="Wingdings" w:hint="default"/>
+      </w:rPr>
+    </w:lvl>
+  </w:abstractNum>
+  <w:num w:numId="1" w16cid:durableId="2072918953">
+    <w:abstractNumId w:val="2"/>
+  </w:num>
+  <w:num w:numId="2" w16cid:durableId="531721828">
+    <w:abstractNumId w:val="0"/>
+  </w:num>
+  <w:num w:numId="3" w16cid:durableId="1537039708">
+    <w:abstractNumId w:val="1"/>
+  </w:num>
+</w:numbering>
 </file>
 
 <file path=word/styles.xml><?xml version="1.0" encoding="utf-8"?>
@@ -862,11 +1567,11 @@
     <w:name w:val="Normal"/>
     <w:qFormat/>
   </w:style>
-  <w:style w:type="paragraph" w:styleId="Ttulo1">
+  <w:style w:type="paragraph" w:styleId="Heading1">
     <w:name w:val="heading 1"/>
     <w:basedOn w:val="Normal"/>
     <w:next w:val="Normal"/>
-    <w:link w:val="Ttulo1Car"/>
+    <w:link w:val="Heading1Char"/>
     <w:uiPriority w:val="9"/>
     <w:qFormat/>
     <w:rsid w:val="00742792"/>
@@ -883,11 +1588,11 @@
       <w:szCs w:val="40"/>
     </w:rPr>
   </w:style>
-  <w:style w:type="paragraph" w:styleId="Ttulo2">
+  <w:style w:type="paragraph" w:styleId="Heading2">
     <w:name w:val="heading 2"/>
     <w:basedOn w:val="Normal"/>
     <w:next w:val="Normal"/>
-    <w:link w:val="Ttulo2Car"/>
+    <w:link w:val="Heading2Char"/>
     <w:uiPriority w:val="9"/>
     <w:semiHidden/>
     <w:unhideWhenUsed/>
@@ -906,11 +1611,11 @@
       <w:szCs w:val="32"/>
     </w:rPr>
   </w:style>
-  <w:style w:type="paragraph" w:styleId="Ttulo3">
+  <w:style w:type="paragraph" w:styleId="Heading3">
     <w:name w:val="heading 3"/>
     <w:basedOn w:val="Normal"/>
     <w:next w:val="Normal"/>
-    <w:link w:val="Ttulo3Car"/>
+    <w:link w:val="Heading3Char"/>
     <w:uiPriority w:val="9"/>
     <w:semiHidden/>
     <w:unhideWhenUsed/>
@@ -929,11 +1634,11 @@
       <w:szCs w:val="28"/>
     </w:rPr>
   </w:style>
-  <w:style w:type="paragraph" w:styleId="Ttulo4">
+  <w:style w:type="paragraph" w:styleId="Heading4">
     <w:name w:val="heading 4"/>
     <w:basedOn w:val="Normal"/>
     <w:next w:val="Normal"/>
-    <w:link w:val="Ttulo4Car"/>
+    <w:link w:val="Heading4Char"/>
     <w:uiPriority w:val="9"/>
     <w:semiHidden/>
     <w:unhideWhenUsed/>
@@ -952,11 +1657,11 @@
       <w:color w:val="0F4761" w:themeColor="accent1" w:themeShade="BF"/>
     </w:rPr>
   </w:style>
-  <w:style w:type="paragraph" w:styleId="Ttulo5">
+  <w:style w:type="paragraph" w:styleId="Heading5">
     <w:name w:val="heading 5"/>
     <w:basedOn w:val="Normal"/>
     <w:next w:val="Normal"/>
-    <w:link w:val="Ttulo5Car"/>
+    <w:link w:val="Heading5Char"/>
     <w:uiPriority w:val="9"/>
     <w:semiHidden/>
     <w:unhideWhenUsed/>
@@ -973,11 +1678,11 @@
       <w:color w:val="0F4761" w:themeColor="accent1" w:themeShade="BF"/>
     </w:rPr>
   </w:style>
-  <w:style w:type="paragraph" w:styleId="Ttulo6">
+  <w:style w:type="paragraph" w:styleId="Heading6">
     <w:name w:val="heading 6"/>
     <w:basedOn w:val="Normal"/>
     <w:next w:val="Normal"/>
-    <w:link w:val="Ttulo6Car"/>
+    <w:link w:val="Heading6Char"/>
     <w:uiPriority w:val="9"/>
     <w:semiHidden/>
     <w:unhideWhenUsed/>
@@ -996,11 +1701,11 @@
       <w:color w:val="595959" w:themeColor="text1" w:themeTint="A6"/>
     </w:rPr>
   </w:style>
-  <w:style w:type="paragraph" w:styleId="Ttulo7">
+  <w:style w:type="paragraph" w:styleId="Heading7">
     <w:name w:val="heading 7"/>
     <w:basedOn w:val="Normal"/>
     <w:next w:val="Normal"/>
-    <w:link w:val="Ttulo7Car"/>
+    <w:link w:val="Heading7Char"/>
     <w:uiPriority w:val="9"/>
     <w:semiHidden/>
     <w:unhideWhenUsed/>
@@ -1017,11 +1722,11 @@
       <w:color w:val="595959" w:themeColor="text1" w:themeTint="A6"/>
     </w:rPr>
   </w:style>
-  <w:style w:type="paragraph" w:styleId="Ttulo8">
+  <w:style w:type="paragraph" w:styleId="Heading8">
     <w:name w:val="heading 8"/>
     <w:basedOn w:val="Normal"/>
     <w:next w:val="Normal"/>
-    <w:link w:val="Ttulo8Car"/>
+    <w:link w:val="Heading8Char"/>
     <w:uiPriority w:val="9"/>
     <w:semiHidden/>
     <w:unhideWhenUsed/>
@@ -1040,11 +1745,11 @@
       <w:color w:val="272727" w:themeColor="text1" w:themeTint="D8"/>
     </w:rPr>
   </w:style>
-  <w:style w:type="paragraph" w:styleId="Ttulo9">
+  <w:style w:type="paragraph" w:styleId="Heading9">
     <w:name w:val="heading 9"/>
     <w:basedOn w:val="Normal"/>
     <w:next w:val="Normal"/>
-    <w:link w:val="Ttulo9Car"/>
+    <w:link w:val="Heading9Char"/>
     <w:uiPriority w:val="9"/>
     <w:semiHidden/>
     <w:unhideWhenUsed/>
@@ -1061,13 +1766,13 @@
       <w:color w:val="272727" w:themeColor="text1" w:themeTint="D8"/>
     </w:rPr>
   </w:style>
-  <w:style w:type="character" w:default="1" w:styleId="Fuentedeprrafopredeter">
+  <w:style w:type="character" w:default="1" w:styleId="DefaultParagraphFont">
     <w:name w:val="Default Paragraph Font"/>
     <w:uiPriority w:val="1"/>
     <w:semiHidden/>
     <w:unhideWhenUsed/>
   </w:style>
-  <w:style w:type="table" w:default="1" w:styleId="Tablanormal">
+  <w:style w:type="table" w:default="1" w:styleId="TableNormal">
     <w:name w:val="Normal Table"/>
     <w:uiPriority w:val="99"/>
     <w:semiHidden/>
@@ -1082,16 +1787,16 @@
       </w:tblCellMar>
     </w:tblPr>
   </w:style>
-  <w:style w:type="numbering" w:default="1" w:styleId="Sinlista">
+  <w:style w:type="numbering" w:default="1" w:styleId="NoList">
     <w:name w:val="No List"/>
     <w:uiPriority w:val="99"/>
     <w:semiHidden/>
     <w:unhideWhenUsed/>
   </w:style>
-  <w:style w:type="character" w:customStyle="1" w:styleId="Ttulo1Car">
-    <w:name w:val="Título 1 Car"/>
-    <w:basedOn w:val="Fuentedeprrafopredeter"/>
-    <w:link w:val="Ttulo1"/>
+  <w:style w:type="character" w:customStyle="1" w:styleId="Heading1Char">
+    <w:name w:val="Heading 1 Char"/>
+    <w:basedOn w:val="DefaultParagraphFont"/>
+    <w:link w:val="Heading1"/>
     <w:uiPriority w:val="9"/>
     <w:rsid w:val="00742792"/>
     <w:rPr>
@@ -1101,10 +1806,10 @@
       <w:szCs w:val="40"/>
     </w:rPr>
   </w:style>
-  <w:style w:type="character" w:customStyle="1" w:styleId="Ttulo2Car">
-    <w:name w:val="Título 2 Car"/>
-    <w:basedOn w:val="Fuentedeprrafopredeter"/>
-    <w:link w:val="Ttulo2"/>
+  <w:style w:type="character" w:customStyle="1" w:styleId="Heading2Char">
+    <w:name w:val="Heading 2 Char"/>
+    <w:basedOn w:val="DefaultParagraphFont"/>
+    <w:link w:val="Heading2"/>
     <w:uiPriority w:val="9"/>
     <w:semiHidden/>
     <w:rsid w:val="00742792"/>
@@ -1115,10 +1820,10 @@
       <w:szCs w:val="32"/>
     </w:rPr>
   </w:style>
-  <w:style w:type="character" w:customStyle="1" w:styleId="Ttulo3Car">
-    <w:name w:val="Título 3 Car"/>
-    <w:basedOn w:val="Fuentedeprrafopredeter"/>
-    <w:link w:val="Ttulo3"/>
+  <w:style w:type="character" w:customStyle="1" w:styleId="Heading3Char">
+    <w:name w:val="Heading 3 Char"/>
+    <w:basedOn w:val="DefaultParagraphFont"/>
+    <w:link w:val="Heading3"/>
     <w:uiPriority w:val="9"/>
     <w:semiHidden/>
     <w:rsid w:val="00742792"/>
@@ -1129,10 +1834,10 @@
       <w:szCs w:val="28"/>
     </w:rPr>
   </w:style>
-  <w:style w:type="character" w:customStyle="1" w:styleId="Ttulo4Car">
-    <w:name w:val="Título 4 Car"/>
-    <w:basedOn w:val="Fuentedeprrafopredeter"/>
-    <w:link w:val="Ttulo4"/>
+  <w:style w:type="character" w:customStyle="1" w:styleId="Heading4Char">
+    <w:name w:val="Heading 4 Char"/>
+    <w:basedOn w:val="DefaultParagraphFont"/>
+    <w:link w:val="Heading4"/>
     <w:uiPriority w:val="9"/>
     <w:semiHidden/>
     <w:rsid w:val="00742792"/>
@@ -1143,10 +1848,10 @@
       <w:color w:val="0F4761" w:themeColor="accent1" w:themeShade="BF"/>
     </w:rPr>
   </w:style>
-  <w:style w:type="character" w:customStyle="1" w:styleId="Ttulo5Car">
-    <w:name w:val="Título 5 Car"/>
-    <w:basedOn w:val="Fuentedeprrafopredeter"/>
-    <w:link w:val="Ttulo5"/>
+  <w:style w:type="character" w:customStyle="1" w:styleId="Heading5Char">
+    <w:name w:val="Heading 5 Char"/>
+    <w:basedOn w:val="DefaultParagraphFont"/>
+    <w:link w:val="Heading5"/>
     <w:uiPriority w:val="9"/>
     <w:semiHidden/>
     <w:rsid w:val="00742792"/>
@@ -1155,10 +1860,10 @@
       <w:color w:val="0F4761" w:themeColor="accent1" w:themeShade="BF"/>
     </w:rPr>
   </w:style>
-  <w:style w:type="character" w:customStyle="1" w:styleId="Ttulo6Car">
-    <w:name w:val="Título 6 Car"/>
-    <w:basedOn w:val="Fuentedeprrafopredeter"/>
-    <w:link w:val="Ttulo6"/>
+  <w:style w:type="character" w:customStyle="1" w:styleId="Heading6Char">
+    <w:name w:val="Heading 6 Char"/>
+    <w:basedOn w:val="DefaultParagraphFont"/>
+    <w:link w:val="Heading6"/>
     <w:uiPriority w:val="9"/>
     <w:semiHidden/>
     <w:rsid w:val="00742792"/>
@@ -1169,10 +1874,10 @@
       <w:color w:val="595959" w:themeColor="text1" w:themeTint="A6"/>
     </w:rPr>
   </w:style>
-  <w:style w:type="character" w:customStyle="1" w:styleId="Ttulo7Car">
-    <w:name w:val="Título 7 Car"/>
-    <w:basedOn w:val="Fuentedeprrafopredeter"/>
-    <w:link w:val="Ttulo7"/>
+  <w:style w:type="character" w:customStyle="1" w:styleId="Heading7Char">
+    <w:name w:val="Heading 7 Char"/>
+    <w:basedOn w:val="DefaultParagraphFont"/>
+    <w:link w:val="Heading7"/>
     <w:uiPriority w:val="9"/>
     <w:semiHidden/>
     <w:rsid w:val="00742792"/>
@@ -1181,10 +1886,10 @@
       <w:color w:val="595959" w:themeColor="text1" w:themeTint="A6"/>
     </w:rPr>
   </w:style>
-  <w:style w:type="character" w:customStyle="1" w:styleId="Ttulo8Car">
-    <w:name w:val="Título 8 Car"/>
-    <w:basedOn w:val="Fuentedeprrafopredeter"/>
-    <w:link w:val="Ttulo8"/>
+  <w:style w:type="character" w:customStyle="1" w:styleId="Heading8Char">
+    <w:name w:val="Heading 8 Char"/>
+    <w:basedOn w:val="DefaultParagraphFont"/>
+    <w:link w:val="Heading8"/>
     <w:uiPriority w:val="9"/>
     <w:semiHidden/>
     <w:rsid w:val="00742792"/>
@@ -1195,10 +1900,10 @@
       <w:color w:val="272727" w:themeColor="text1" w:themeTint="D8"/>
     </w:rPr>
   </w:style>
-  <w:style w:type="character" w:customStyle="1" w:styleId="Ttulo9Car">
-    <w:name w:val="Título 9 Car"/>
-    <w:basedOn w:val="Fuentedeprrafopredeter"/>
-    <w:link w:val="Ttulo9"/>
+  <w:style w:type="character" w:customStyle="1" w:styleId="Heading9Char">
+    <w:name w:val="Heading 9 Char"/>
+    <w:basedOn w:val="DefaultParagraphFont"/>
+    <w:link w:val="Heading9"/>
     <w:uiPriority w:val="9"/>
     <w:semiHidden/>
     <w:rsid w:val="00742792"/>
@@ -1207,11 +1912,11 @@
       <w:color w:val="272727" w:themeColor="text1" w:themeTint="D8"/>
     </w:rPr>
   </w:style>
-  <w:style w:type="paragraph" w:styleId="Ttulo">
+  <w:style w:type="paragraph" w:styleId="Title">
     <w:name w:val="Title"/>
     <w:basedOn w:val="Normal"/>
     <w:next w:val="Normal"/>
-    <w:link w:val="TtuloCar"/>
+    <w:link w:val="TitleChar"/>
     <w:uiPriority w:val="10"/>
     <w:qFormat/>
     <w:rsid w:val="00742792"/>
@@ -1227,10 +1932,10 @@
       <w:szCs w:val="56"/>
     </w:rPr>
   </w:style>
-  <w:style w:type="character" w:customStyle="1" w:styleId="TtuloCar">
-    <w:name w:val="Título Car"/>
-    <w:basedOn w:val="Fuentedeprrafopredeter"/>
-    <w:link w:val="Ttulo"/>
+  <w:style w:type="character" w:customStyle="1" w:styleId="TitleChar">
+    <w:name w:val="Title Char"/>
+    <w:basedOn w:val="DefaultParagraphFont"/>
+    <w:link w:val="Title"/>
     <w:uiPriority w:val="10"/>
     <w:rsid w:val="00742792"/>
     <w:rPr>
@@ -1241,11 +1946,11 @@
       <w:szCs w:val="56"/>
     </w:rPr>
   </w:style>
-  <w:style w:type="paragraph" w:styleId="Subttulo">
+  <w:style w:type="paragraph" w:styleId="Subtitle">
     <w:name w:val="Subtitle"/>
     <w:basedOn w:val="Normal"/>
     <w:next w:val="Normal"/>
-    <w:link w:val="SubttuloCar"/>
+    <w:link w:val="SubtitleChar"/>
     <w:uiPriority w:val="11"/>
     <w:qFormat/>
     <w:rsid w:val="00742792"/>
@@ -1262,10 +1967,10 @@
       <w:szCs w:val="28"/>
     </w:rPr>
   </w:style>
-  <w:style w:type="character" w:customStyle="1" w:styleId="SubttuloCar">
-    <w:name w:val="Subtítulo Car"/>
-    <w:basedOn w:val="Fuentedeprrafopredeter"/>
-    <w:link w:val="Subttulo"/>
+  <w:style w:type="character" w:customStyle="1" w:styleId="SubtitleChar">
+    <w:name w:val="Subtitle Char"/>
+    <w:basedOn w:val="DefaultParagraphFont"/>
+    <w:link w:val="Subtitle"/>
     <w:uiPriority w:val="11"/>
     <w:rsid w:val="00742792"/>
     <w:rPr>
@@ -1276,11 +1981,11 @@
       <w:szCs w:val="28"/>
     </w:rPr>
   </w:style>
-  <w:style w:type="paragraph" w:styleId="Cita">
+  <w:style w:type="paragraph" w:styleId="Quote">
     <w:name w:val="Quote"/>
     <w:basedOn w:val="Normal"/>
     <w:next w:val="Normal"/>
-    <w:link w:val="CitaCar"/>
+    <w:link w:val="QuoteChar"/>
     <w:uiPriority w:val="29"/>
     <w:qFormat/>
     <w:rsid w:val="00742792"/>
@@ -1294,10 +1999,10 @@
       <w:color w:val="404040" w:themeColor="text1" w:themeTint="BF"/>
     </w:rPr>
   </w:style>
-  <w:style w:type="character" w:customStyle="1" w:styleId="CitaCar">
-    <w:name w:val="Cita Car"/>
-    <w:basedOn w:val="Fuentedeprrafopredeter"/>
-    <w:link w:val="Cita"/>
+  <w:style w:type="character" w:customStyle="1" w:styleId="QuoteChar">
+    <w:name w:val="Quote Char"/>
+    <w:basedOn w:val="DefaultParagraphFont"/>
+    <w:link w:val="Quote"/>
     <w:uiPriority w:val="29"/>
     <w:rsid w:val="00742792"/>
     <w:rPr>
@@ -1306,7 +2011,7 @@
       <w:color w:val="404040" w:themeColor="text1" w:themeTint="BF"/>
     </w:rPr>
   </w:style>
-  <w:style w:type="paragraph" w:styleId="Prrafodelista">
+  <w:style w:type="paragraph" w:styleId="ListParagraph">
     <w:name w:val="List Paragraph"/>
     <w:basedOn w:val="Normal"/>
     <w:uiPriority w:val="34"/>
@@ -1317,9 +2022,9 @@
       <w:contextualSpacing/>
     </w:pPr>
   </w:style>
-  <w:style w:type="character" w:styleId="nfasisintenso">
+  <w:style w:type="character" w:styleId="IntenseEmphasis">
     <w:name w:val="Intense Emphasis"/>
-    <w:basedOn w:val="Fuentedeprrafopredeter"/>
+    <w:basedOn w:val="DefaultParagraphFont"/>
     <w:uiPriority w:val="21"/>
     <w:qFormat/>
     <w:rsid w:val="00742792"/>
@@ -1329,11 +2034,11 @@
       <w:color w:val="0F4761" w:themeColor="accent1" w:themeShade="BF"/>
     </w:rPr>
   </w:style>
-  <w:style w:type="paragraph" w:styleId="Citadestacada">
+  <w:style w:type="paragraph" w:styleId="IntenseQuote">
     <w:name w:val="Intense Quote"/>
     <w:basedOn w:val="Normal"/>
     <w:next w:val="Normal"/>
-    <w:link w:val="CitadestacadaCar"/>
+    <w:link w:val="IntenseQuoteChar"/>
     <w:uiPriority w:val="30"/>
     <w:qFormat/>
     <w:rsid w:val="00742792"/>
@@ -1352,10 +2057,10 @@
       <w:color w:val="0F4761" w:themeColor="accent1" w:themeShade="BF"/>
     </w:rPr>
   </w:style>
-  <w:style w:type="character" w:customStyle="1" w:styleId="CitadestacadaCar">
-    <w:name w:val="Cita destacada Car"/>
-    <w:basedOn w:val="Fuentedeprrafopredeter"/>
-    <w:link w:val="Citadestacada"/>
+  <w:style w:type="character" w:customStyle="1" w:styleId="IntenseQuoteChar">
+    <w:name w:val="Intense Quote Char"/>
+    <w:basedOn w:val="DefaultParagraphFont"/>
+    <w:link w:val="IntenseQuote"/>
     <w:uiPriority w:val="30"/>
     <w:rsid w:val="00742792"/>
     <w:rPr>
@@ -1364,9 +2069,9 @@
       <w:color w:val="0F4761" w:themeColor="accent1" w:themeShade="BF"/>
     </w:rPr>
   </w:style>
-  <w:style w:type="character" w:styleId="Referenciaintensa">
+  <w:style w:type="character" w:styleId="IntenseReference">
     <w:name w:val="Intense Reference"/>
-    <w:basedOn w:val="Fuentedeprrafopredeter"/>
+    <w:basedOn w:val="DefaultParagraphFont"/>
     <w:uiPriority w:val="32"/>
     <w:qFormat/>
     <w:rsid w:val="00742792"/>
@@ -1376,6 +2081,23 @@
       <w:smallCaps/>
       <w:color w:val="0F4761" w:themeColor="accent1" w:themeShade="BF"/>
       <w:spacing w:val="5"/>
+    </w:rPr>
+  </w:style>
+  <w:style w:type="paragraph" w:styleId="NormalWeb">
+    <w:name w:val="Normal (Web)"/>
+    <w:basedOn w:val="Normal"/>
+    <w:uiPriority w:val="99"/>
+    <w:semiHidden/>
+    <w:unhideWhenUsed/>
+    <w:rsid w:val="00D12641"/>
+    <w:pPr>
+      <w:spacing w:before="100" w:beforeAutospacing="1" w:after="100" w:afterAutospacing="1" w:line="240" w:lineRule="auto"/>
+    </w:pPr>
+    <w:rPr>
+      <w:rFonts w:ascii="Times New Roman" w:eastAsia="Times New Roman" w:hAnsi="Times New Roman" w:cs="Times New Roman"/>
+      <w:kern w:val="0"/>
+      <w:lang w:val="en-CO"/>
+      <w14:ligatures w14:val="none"/>
     </w:rPr>
   </w:style>
 </w:styles>

</xml_diff>

<commit_message>
Finalizacion del actividad 3 del proyecto Emplanorte
</commit_message>
<xml_diff>
--- a/ENTREGAS/Documento de Diseño del Sistema.docx
+++ b/ENTREGAS/Documento de Diseño del Sistema.docx
@@ -65,7 +65,7 @@
     </w:p>
     <w:p>
       <w:pPr>
-        <w:pStyle w:val="ListParagraph"/>
+        <w:pStyle w:val="Prrafodelista"/>
         <w:numPr>
           <w:ilvl w:val="0"/>
           <w:numId w:val="2"/>
@@ -77,54 +77,39 @@
     </w:p>
     <w:p>
       <w:pPr>
-        <w:pStyle w:val="ListParagraph"/>
+        <w:pStyle w:val="Prrafodelista"/>
         <w:numPr>
           <w:ilvl w:val="0"/>
           <w:numId w:val="2"/>
         </w:numPr>
       </w:pPr>
-      <w:proofErr w:type="spellStart"/>
-      <w:r>
-        <w:t>Duvan</w:t>
-      </w:r>
-      <w:proofErr w:type="spellEnd"/>
-      <w:r>
-        <w:t xml:space="preserve"> </w:t>
-      </w:r>
-      <w:proofErr w:type="spellStart"/>
-      <w:r>
-        <w:t>Manza</w:t>
-      </w:r>
-      <w:proofErr w:type="spellEnd"/>
-    </w:p>
-    <w:p>
-      <w:pPr>
-        <w:pStyle w:val="ListParagraph"/>
+      <w:r>
+        <w:t>Duvan Manza</w:t>
+      </w:r>
+    </w:p>
+    <w:p>
+      <w:pPr>
+        <w:pStyle w:val="Prrafodelista"/>
         <w:numPr>
           <w:ilvl w:val="0"/>
           <w:numId w:val="2"/>
         </w:numPr>
       </w:pPr>
       <w:r>
-        <w:t xml:space="preserve">Luis </w:t>
-      </w:r>
-      <w:proofErr w:type="spellStart"/>
-      <w:r>
-        <w:t>Chacon</w:t>
-      </w:r>
-      <w:proofErr w:type="spellEnd"/>
-    </w:p>
-    <w:p>
-      <w:pPr>
-        <w:rPr>
-          <w:b/>
-          <w:bCs/>
-        </w:rPr>
-      </w:pPr>
-    </w:p>
-    <w:p>
-      <w:pPr>
-        <w:pStyle w:val="ListParagraph"/>
+        <w:t>Luis Chacon</w:t>
+      </w:r>
+    </w:p>
+    <w:p>
+      <w:pPr>
+        <w:rPr>
+          <w:b/>
+          <w:bCs/>
+        </w:rPr>
+      </w:pPr>
+    </w:p>
+    <w:p>
+      <w:pPr>
+        <w:pStyle w:val="Prrafodelista"/>
         <w:numPr>
           <w:ilvl w:val="0"/>
           <w:numId w:val="3"/>
@@ -172,7 +157,7 @@
     </w:p>
     <w:p>
       <w:pPr>
-        <w:pStyle w:val="ListParagraph"/>
+        <w:pStyle w:val="Prrafodelista"/>
         <w:numPr>
           <w:ilvl w:val="0"/>
           <w:numId w:val="3"/>
@@ -259,7 +244,7 @@
     </w:p>
     <w:p>
       <w:pPr>
-        <w:pStyle w:val="ListParagraph"/>
+        <w:pStyle w:val="Prrafodelista"/>
         <w:numPr>
           <w:ilvl w:val="0"/>
           <w:numId w:val="3"/>
@@ -274,7 +259,21 @@
           <w:b/>
           <w:bCs/>
         </w:rPr>
-        <w:t xml:space="preserve"> Diagrama de flujo de información.</w:t>
+        <w:t xml:space="preserve"> Diagrama de flujo de información</w:t>
+      </w:r>
+      <w:r>
+        <w:rPr>
+          <w:b/>
+          <w:bCs/>
+        </w:rPr>
+        <w:t xml:space="preserve"> LV1</w:t>
+      </w:r>
+      <w:r>
+        <w:rPr>
+          <w:b/>
+          <w:bCs/>
+        </w:rPr>
+        <w:t>.</w:t>
       </w:r>
     </w:p>
     <w:p>
@@ -383,23 +382,7 @@
           <w:b/>
           <w:bCs/>
         </w:rPr>
-        <w:t xml:space="preserve">Administrador – el Administrador hace los registros, consultas y </w:t>
-      </w:r>
-      <w:proofErr w:type="spellStart"/>
-      <w:r>
-        <w:rPr>
-          <w:b/>
-          <w:bCs/>
-        </w:rPr>
-        <w:t>envio</w:t>
-      </w:r>
-      <w:proofErr w:type="spellEnd"/>
-      <w:r>
-        <w:rPr>
-          <w:b/>
-          <w:bCs/>
-        </w:rPr>
-        <w:t xml:space="preserve"> de datos que pasan por cada </w:t>
+        <w:t xml:space="preserve">Administrador – el Administrador hace los registros, consultas y envio de datos que pasan por cada </w:t>
       </w:r>
       <w:r>
         <w:rPr>
@@ -441,7 +424,7 @@
     </w:p>
     <w:p>
       <w:pPr>
-        <w:pStyle w:val="ListParagraph"/>
+        <w:pStyle w:val="Prrafodelista"/>
         <w:numPr>
           <w:ilvl w:val="0"/>
           <w:numId w:val="3"/>
@@ -449,6 +432,1212 @@
         <w:spacing w:before="100" w:beforeAutospacing="1" w:after="100" w:afterAutospacing="1" w:line="240" w:lineRule="auto"/>
         <w:outlineLvl w:val="0"/>
         <w:rPr>
+          <w:rFonts w:ascii="Arial" w:eastAsia="Times New Roman" w:hAnsi="Arial" w:cs="Arial"/>
+          <w:kern w:val="36"/>
+          <w14:ligatures w14:val="none"/>
+        </w:rPr>
+      </w:pPr>
+      <w:r>
+        <w:rPr>
+          <w:rFonts w:ascii="Arial" w:eastAsia="Times New Roman" w:hAnsi="Arial" w:cs="Arial"/>
+          <w:kern w:val="36"/>
+          <w14:ligatures w14:val="none"/>
+        </w:rPr>
+        <w:t xml:space="preserve">Explicación del Modelo Propuesto </w:t>
+      </w:r>
+    </w:p>
+    <w:p>
+      <w:pPr>
+        <w:spacing w:before="100" w:beforeAutospacing="1" w:after="100" w:afterAutospacing="1" w:line="240" w:lineRule="auto"/>
+        <w:outlineLvl w:val="0"/>
+        <w:rPr>
+          <w:rFonts w:ascii="Arial" w:eastAsia="Times New Roman" w:hAnsi="Arial" w:cs="Arial"/>
+          <w:kern w:val="36"/>
+          <w14:ligatures w14:val="none"/>
+        </w:rPr>
+      </w:pPr>
+      <w:r>
+        <w:rPr>
+          <w:rFonts w:ascii="Arial" w:eastAsia="Times New Roman" w:hAnsi="Arial" w:cs="Arial"/>
+          <w:kern w:val="36"/>
+          <w14:ligatures w14:val="none"/>
+        </w:rPr>
+        <w:t xml:space="preserve"> </w:t>
+      </w:r>
+      <w:r>
+        <w:rPr>
+          <w:rFonts w:ascii="Arial" w:eastAsia="Times New Roman" w:hAnsi="Arial" w:cs="Arial"/>
+          <w:kern w:val="36"/>
+          <w14:ligatures w14:val="none"/>
+        </w:rPr>
+        <w:t>Descripción General del Sistema:</w:t>
+      </w:r>
+      <w:r>
+        <w:rPr>
+          <w:rFonts w:ascii="Arial" w:eastAsia="Times New Roman" w:hAnsi="Arial" w:cs="Arial"/>
+          <w:kern w:val="36"/>
+          <w14:ligatures w14:val="none"/>
+        </w:rPr>
+        <w:br/>
+      </w:r>
+    </w:p>
+    <w:p>
+      <w:pPr>
+        <w:spacing w:before="100" w:beforeAutospacing="1" w:after="100" w:afterAutospacing="1" w:line="240" w:lineRule="auto"/>
+        <w:outlineLvl w:val="0"/>
+        <w:rPr>
+          <w:rFonts w:ascii="Arial" w:eastAsia="Times New Roman" w:hAnsi="Arial" w:cs="Arial"/>
+          <w:kern w:val="36"/>
+          <w14:ligatures w14:val="none"/>
+        </w:rPr>
+      </w:pPr>
+      <w:r>
+        <w:rPr>
+          <w:rFonts w:ascii="Arial" w:eastAsia="Times New Roman" w:hAnsi="Arial" w:cs="Arial"/>
+          <w:kern w:val="36"/>
+          <w14:ligatures w14:val="none"/>
+        </w:rPr>
+        <w:t>El sistema propuesto corresponde a una aplicación web orientada a la gestión comercial de la empresa EMPLANORTE S.A.S., cuyo objetivo principal es centralizar y automatizar los procesos relacionados con el inventario, las ventas, los clientes, los gastos y la generación de reportes.</w:t>
+      </w:r>
+    </w:p>
+    <w:p>
+      <w:pPr>
+        <w:spacing w:before="100" w:beforeAutospacing="1" w:after="100" w:afterAutospacing="1" w:line="240" w:lineRule="auto"/>
+        <w:outlineLvl w:val="0"/>
+        <w:rPr>
+          <w:rFonts w:ascii="Arial" w:eastAsia="Times New Roman" w:hAnsi="Arial" w:cs="Arial"/>
+          <w:kern w:val="36"/>
+          <w14:ligatures w14:val="none"/>
+        </w:rPr>
+      </w:pPr>
+      <w:r>
+        <w:rPr>
+          <w:rFonts w:ascii="Arial" w:eastAsia="Times New Roman" w:hAnsi="Arial" w:cs="Arial"/>
+          <w:kern w:val="36"/>
+          <w14:ligatures w14:val="none"/>
+        </w:rPr>
+        <w:t>El modelo del sistema se basa en una estructura modular, en la cual cada componente cumple una función específica dentro del flujo de información, permitiendo una organización clara, escalable y fácil de mantener.</w:t>
+      </w:r>
+    </w:p>
+    <w:p>
+      <w:pPr>
+        <w:spacing w:before="100" w:beforeAutospacing="1" w:after="100" w:afterAutospacing="1" w:line="240" w:lineRule="auto"/>
+        <w:outlineLvl w:val="0"/>
+        <w:rPr>
+          <w:rFonts w:ascii="Arial" w:eastAsia="Times New Roman" w:hAnsi="Arial" w:cs="Arial"/>
+          <w:kern w:val="36"/>
+          <w14:ligatures w14:val="none"/>
+        </w:rPr>
+      </w:pPr>
+      <w:r>
+        <w:rPr>
+          <w:rFonts w:ascii="Arial" w:eastAsia="Times New Roman" w:hAnsi="Arial" w:cs="Arial"/>
+          <w:kern w:val="36"/>
+          <w14:ligatures w14:val="none"/>
+        </w:rPr>
+        <w:lastRenderedPageBreak/>
+        <w:t>Estructura del sistema:</w:t>
+      </w:r>
+      <w:r>
+        <w:rPr>
+          <w:rFonts w:ascii="Arial" w:eastAsia="Times New Roman" w:hAnsi="Arial" w:cs="Arial"/>
+          <w:kern w:val="36"/>
+          <w14:ligatures w14:val="none"/>
+        </w:rPr>
+        <w:br/>
+      </w:r>
+    </w:p>
+    <w:p>
+      <w:pPr>
+        <w:spacing w:before="100" w:beforeAutospacing="1" w:after="100" w:afterAutospacing="1" w:line="240" w:lineRule="auto"/>
+        <w:outlineLvl w:val="0"/>
+        <w:rPr>
+          <w:rFonts w:ascii="Arial" w:eastAsia="Times New Roman" w:hAnsi="Arial" w:cs="Arial"/>
+          <w:kern w:val="36"/>
+          <w14:ligatures w14:val="none"/>
+        </w:rPr>
+      </w:pPr>
+      <w:r>
+        <w:rPr>
+          <w:rFonts w:ascii="Arial" w:eastAsia="Times New Roman" w:hAnsi="Arial" w:cs="Arial"/>
+          <w:kern w:val="36"/>
+          <w14:ligatures w14:val="none"/>
+        </w:rPr>
+        <w:t>El sistema esta dividido en los siguientes módulos principales</w:t>
+      </w:r>
+    </w:p>
+    <w:p>
+      <w:pPr>
+        <w:pStyle w:val="Prrafodelista"/>
+        <w:numPr>
+          <w:ilvl w:val="0"/>
+          <w:numId w:val="4"/>
+        </w:numPr>
+        <w:spacing w:before="100" w:beforeAutospacing="1" w:after="100" w:afterAutospacing="1" w:line="240" w:lineRule="auto"/>
+        <w:outlineLvl w:val="2"/>
+        <w:rPr>
+          <w:rFonts w:ascii="Arial" w:eastAsia="Times New Roman" w:hAnsi="Arial" w:cs="Arial"/>
+          <w:kern w:val="0"/>
+          <w:lang w:eastAsia="es-CO"/>
+          <w14:ligatures w14:val="none"/>
+        </w:rPr>
+      </w:pPr>
+      <w:r>
+        <w:rPr>
+          <w:rFonts w:ascii="Arial" w:eastAsia="Times New Roman" w:hAnsi="Arial" w:cs="Arial"/>
+          <w:kern w:val="0"/>
+          <w:lang w:eastAsia="es-CO"/>
+          <w14:ligatures w14:val="none"/>
+        </w:rPr>
+        <w:t>Módulo de Inventario</w:t>
+      </w:r>
+    </w:p>
+    <w:p>
+      <w:pPr>
+        <w:spacing w:before="100" w:beforeAutospacing="1" w:after="100" w:afterAutospacing="1" w:line="240" w:lineRule="auto"/>
+        <w:ind w:left="360"/>
+        <w:rPr>
+          <w:rFonts w:ascii="Arial" w:eastAsia="Times New Roman" w:hAnsi="Arial" w:cs="Arial"/>
+          <w:kern w:val="0"/>
+          <w:lang w:eastAsia="es-CO"/>
+          <w14:ligatures w14:val="none"/>
+        </w:rPr>
+      </w:pPr>
+      <w:r>
+        <w:rPr>
+          <w:rFonts w:ascii="Arial" w:eastAsia="Times New Roman" w:hAnsi="Arial" w:cs="Arial"/>
+          <w:kern w:val="0"/>
+          <w:lang w:eastAsia="es-CO"/>
+          <w14:ligatures w14:val="none"/>
+        </w:rPr>
+        <w:t>Encargado de gestionar la información de los productos. Permite registrar, actualizar y consultar los productos disponibles, incluyendo datos como nombre, tipo de envase, tamaño, precio, costo y cantidad en stock. Este módulo garantiza el control adecuado del inventario.</w:t>
+      </w:r>
+    </w:p>
+    <w:p>
+      <w:pPr>
+        <w:pStyle w:val="Prrafodelista"/>
+        <w:numPr>
+          <w:ilvl w:val="0"/>
+          <w:numId w:val="4"/>
+        </w:numPr>
+        <w:spacing w:before="100" w:beforeAutospacing="1" w:after="100" w:afterAutospacing="1" w:line="240" w:lineRule="auto"/>
+        <w:outlineLvl w:val="2"/>
+        <w:rPr>
+          <w:rFonts w:ascii="Arial" w:eastAsia="Times New Roman" w:hAnsi="Arial" w:cs="Arial"/>
+          <w:kern w:val="0"/>
+          <w:lang w:eastAsia="es-CO"/>
+          <w14:ligatures w14:val="none"/>
+        </w:rPr>
+      </w:pPr>
+      <w:r>
+        <w:rPr>
+          <w:rFonts w:ascii="Arial" w:eastAsia="Times New Roman" w:hAnsi="Arial" w:cs="Arial"/>
+          <w:kern w:val="0"/>
+          <w:lang w:eastAsia="es-CO"/>
+          <w14:ligatures w14:val="none"/>
+        </w:rPr>
+        <w:t>Módulo de Ventas</w:t>
+      </w:r>
+    </w:p>
+    <w:p>
+      <w:pPr>
+        <w:spacing w:before="100" w:beforeAutospacing="1" w:after="100" w:afterAutospacing="1" w:line="240" w:lineRule="auto"/>
+        <w:ind w:left="360"/>
+        <w:rPr>
+          <w:rFonts w:ascii="Arial" w:eastAsia="Times New Roman" w:hAnsi="Arial" w:cs="Arial"/>
+          <w:kern w:val="0"/>
+          <w:lang w:eastAsia="es-CO"/>
+          <w14:ligatures w14:val="none"/>
+        </w:rPr>
+      </w:pPr>
+      <w:r>
+        <w:rPr>
+          <w:rFonts w:ascii="Arial" w:eastAsia="Times New Roman" w:hAnsi="Arial" w:cs="Arial"/>
+          <w:kern w:val="0"/>
+          <w:lang w:eastAsia="es-CO"/>
+          <w14:ligatures w14:val="none"/>
+        </w:rPr>
+        <w:t>Permite registrar las ventas realizadas en el negocio. En este módulo se seleccionan los productos, se define la cantidad y el método de pago. Además, el sistema calcula automáticamente el total de la venta y la ganancia generada. También se encarga de actualizar el inventario descontando los productos vendidos.</w:t>
+      </w:r>
+    </w:p>
+    <w:p>
+      <w:pPr>
+        <w:pStyle w:val="Prrafodelista"/>
+        <w:numPr>
+          <w:ilvl w:val="0"/>
+          <w:numId w:val="4"/>
+        </w:numPr>
+        <w:spacing w:before="100" w:beforeAutospacing="1" w:after="100" w:afterAutospacing="1" w:line="240" w:lineRule="auto"/>
+        <w:outlineLvl w:val="2"/>
+        <w:rPr>
+          <w:rFonts w:ascii="Arial" w:eastAsia="Times New Roman" w:hAnsi="Arial" w:cs="Arial"/>
+          <w:kern w:val="0"/>
+          <w:lang w:eastAsia="es-CO"/>
+          <w14:ligatures w14:val="none"/>
+        </w:rPr>
+      </w:pPr>
+      <w:r>
+        <w:rPr>
+          <w:rFonts w:ascii="Arial" w:eastAsia="Times New Roman" w:hAnsi="Arial" w:cs="Arial"/>
+          <w:kern w:val="0"/>
+          <w:lang w:eastAsia="es-CO"/>
+          <w14:ligatures w14:val="none"/>
+        </w:rPr>
+        <w:t>Módulo de Clientes</w:t>
+      </w:r>
+    </w:p>
+    <w:p>
+      <w:pPr>
+        <w:spacing w:before="100" w:beforeAutospacing="1" w:after="100" w:afterAutospacing="1" w:line="240" w:lineRule="auto"/>
+        <w:ind w:left="360"/>
+        <w:rPr>
+          <w:rFonts w:ascii="Arial" w:eastAsia="Times New Roman" w:hAnsi="Arial" w:cs="Arial"/>
+          <w:kern w:val="0"/>
+          <w:lang w:eastAsia="es-CO"/>
+          <w14:ligatures w14:val="none"/>
+        </w:rPr>
+      </w:pPr>
+      <w:r>
+        <w:rPr>
+          <w:rFonts w:ascii="Arial" w:eastAsia="Times New Roman" w:hAnsi="Arial" w:cs="Arial"/>
+          <w:kern w:val="0"/>
+          <w:lang w:eastAsia="es-CO"/>
+          <w14:ligatures w14:val="none"/>
+        </w:rPr>
+        <w:t>Gestiona la información de los clientes, permitiendo su registro y la consulta de su historial de compras. Esto facilita el seguimiento de relaciones comerciales y el análisis del comportamiento de compra.</w:t>
+      </w:r>
+    </w:p>
+    <w:p>
+      <w:pPr>
+        <w:pStyle w:val="Prrafodelista"/>
+        <w:numPr>
+          <w:ilvl w:val="0"/>
+          <w:numId w:val="4"/>
+        </w:numPr>
+        <w:spacing w:before="100" w:beforeAutospacing="1" w:after="100" w:afterAutospacing="1" w:line="240" w:lineRule="auto"/>
+        <w:outlineLvl w:val="2"/>
+        <w:rPr>
+          <w:rFonts w:ascii="Arial" w:eastAsia="Times New Roman" w:hAnsi="Arial" w:cs="Arial"/>
+          <w:kern w:val="0"/>
+          <w:lang w:eastAsia="es-CO"/>
+          <w14:ligatures w14:val="none"/>
+        </w:rPr>
+      </w:pPr>
+      <w:r>
+        <w:rPr>
+          <w:rFonts w:ascii="Arial" w:eastAsia="Times New Roman" w:hAnsi="Arial" w:cs="Arial"/>
+          <w:kern w:val="0"/>
+          <w:lang w:eastAsia="es-CO"/>
+          <w14:ligatures w14:val="none"/>
+        </w:rPr>
+        <w:t>Módulo de Cotizaciones</w:t>
+      </w:r>
+    </w:p>
+    <w:p>
+      <w:pPr>
+        <w:spacing w:before="100" w:beforeAutospacing="1" w:after="100" w:afterAutospacing="1" w:line="240" w:lineRule="auto"/>
+        <w:ind w:left="360"/>
+        <w:rPr>
+          <w:rFonts w:ascii="Arial" w:eastAsia="Times New Roman" w:hAnsi="Arial" w:cs="Arial"/>
+          <w:kern w:val="0"/>
+          <w:lang w:eastAsia="es-CO"/>
+          <w14:ligatures w14:val="none"/>
+        </w:rPr>
+      </w:pPr>
+      <w:r>
+        <w:rPr>
+          <w:rFonts w:ascii="Arial" w:eastAsia="Times New Roman" w:hAnsi="Arial" w:cs="Arial"/>
+          <w:kern w:val="0"/>
+          <w:lang w:eastAsia="es-CO"/>
+          <w14:ligatures w14:val="none"/>
+        </w:rPr>
+        <w:t>Permite generar cotizaciones para clientes potenciales, incluyendo productos, cantidades y precios. Estas cotizaciones pueden ser posteriormente convertidas en ventas, facilitando el proceso comercial.</w:t>
+      </w:r>
+    </w:p>
+    <w:p>
+      <w:pPr>
+        <w:pStyle w:val="Prrafodelista"/>
+        <w:numPr>
+          <w:ilvl w:val="0"/>
+          <w:numId w:val="4"/>
+        </w:numPr>
+        <w:spacing w:before="100" w:beforeAutospacing="1" w:after="100" w:afterAutospacing="1" w:line="240" w:lineRule="auto"/>
+        <w:outlineLvl w:val="2"/>
+        <w:rPr>
+          <w:rFonts w:ascii="Arial" w:eastAsia="Times New Roman" w:hAnsi="Arial" w:cs="Arial"/>
+          <w:kern w:val="0"/>
+          <w:lang w:eastAsia="es-CO"/>
+          <w14:ligatures w14:val="none"/>
+        </w:rPr>
+      </w:pPr>
+      <w:r>
+        <w:rPr>
+          <w:rFonts w:ascii="Arial" w:eastAsia="Times New Roman" w:hAnsi="Arial" w:cs="Arial"/>
+          <w:kern w:val="0"/>
+          <w:lang w:eastAsia="es-CO"/>
+          <w14:ligatures w14:val="none"/>
+        </w:rPr>
+        <w:t>Módulo Financiero</w:t>
+      </w:r>
+    </w:p>
+    <w:p>
+      <w:pPr>
+        <w:spacing w:before="100" w:beforeAutospacing="1" w:after="100" w:afterAutospacing="1" w:line="240" w:lineRule="auto"/>
+        <w:ind w:left="360"/>
+        <w:rPr>
+          <w:rFonts w:ascii="Arial" w:eastAsia="Times New Roman" w:hAnsi="Arial" w:cs="Arial"/>
+          <w:kern w:val="0"/>
+          <w:lang w:eastAsia="es-CO"/>
+          <w14:ligatures w14:val="none"/>
+        </w:rPr>
+      </w:pPr>
+      <w:r>
+        <w:rPr>
+          <w:rFonts w:ascii="Arial" w:eastAsia="Times New Roman" w:hAnsi="Arial" w:cs="Arial"/>
+          <w:kern w:val="0"/>
+          <w:lang w:eastAsia="es-CO"/>
+          <w14:ligatures w14:val="none"/>
+        </w:rPr>
+        <w:t>Encargado de registrar y gestionar los gastos del negocio, permitiendo clasificarlos por categorías. Este módulo contribuye al control de egresos y al análisis financiero general.</w:t>
+      </w:r>
+    </w:p>
+    <w:p>
+      <w:pPr>
+        <w:pStyle w:val="Prrafodelista"/>
+        <w:numPr>
+          <w:ilvl w:val="0"/>
+          <w:numId w:val="4"/>
+        </w:numPr>
+        <w:spacing w:before="100" w:beforeAutospacing="1" w:after="100" w:afterAutospacing="1" w:line="240" w:lineRule="auto"/>
+        <w:outlineLvl w:val="2"/>
+        <w:rPr>
+          <w:rFonts w:ascii="Arial" w:eastAsia="Times New Roman" w:hAnsi="Arial" w:cs="Arial"/>
+          <w:kern w:val="0"/>
+          <w:lang w:eastAsia="es-CO"/>
+          <w14:ligatures w14:val="none"/>
+        </w:rPr>
+      </w:pPr>
+      <w:r>
+        <w:rPr>
+          <w:rFonts w:ascii="Arial" w:eastAsia="Times New Roman" w:hAnsi="Arial" w:cs="Arial"/>
+          <w:kern w:val="0"/>
+          <w:lang w:eastAsia="es-CO"/>
+          <w14:ligatures w14:val="none"/>
+        </w:rPr>
+        <w:t>Módulo de Reportes y Estadísticas</w:t>
+      </w:r>
+    </w:p>
+    <w:p>
+      <w:pPr>
+        <w:spacing w:before="100" w:beforeAutospacing="1" w:after="100" w:afterAutospacing="1" w:line="240" w:lineRule="auto"/>
+        <w:ind w:left="360"/>
+        <w:rPr>
+          <w:rFonts w:ascii="Arial" w:eastAsia="Times New Roman" w:hAnsi="Arial" w:cs="Arial"/>
+          <w:kern w:val="0"/>
+          <w:lang w:eastAsia="es-CO"/>
+          <w14:ligatures w14:val="none"/>
+        </w:rPr>
+      </w:pPr>
+      <w:r>
+        <w:rPr>
+          <w:rFonts w:ascii="Arial" w:eastAsia="Times New Roman" w:hAnsi="Arial" w:cs="Arial"/>
+          <w:kern w:val="0"/>
+          <w:lang w:eastAsia="es-CO"/>
+          <w14:ligatures w14:val="none"/>
+        </w:rPr>
+        <w:t>Permite generar reportes de ventas, inventario y gastos, así como visualizar estadísticas del negocio por diferentes periodos de tiempo (día, semana o mes). Este módulo apoya la toma de decisiones estratégicas.</w:t>
+      </w:r>
+    </w:p>
+    <w:p>
+      <w:pPr>
+        <w:spacing w:before="100" w:beforeAutospacing="1" w:after="100" w:afterAutospacing="1" w:line="240" w:lineRule="auto"/>
+        <w:outlineLvl w:val="0"/>
+        <w:rPr>
+          <w:rFonts w:ascii="Arial" w:eastAsia="Times New Roman" w:hAnsi="Arial" w:cs="Arial"/>
+          <w:kern w:val="36"/>
+          <w14:ligatures w14:val="none"/>
+        </w:rPr>
+      </w:pPr>
+    </w:p>
+    <w:p>
+      <w:pPr>
+        <w:spacing w:before="100" w:beforeAutospacing="1" w:after="100" w:afterAutospacing="1" w:line="240" w:lineRule="auto"/>
+        <w:outlineLvl w:val="0"/>
+        <w:rPr>
+          <w:rFonts w:ascii="Arial" w:eastAsia="Times New Roman" w:hAnsi="Arial" w:cs="Arial"/>
+          <w:kern w:val="36"/>
+          <w14:ligatures w14:val="none"/>
+        </w:rPr>
+      </w:pPr>
+      <w:r>
+        <w:rPr>
+          <w:rFonts w:ascii="Arial" w:eastAsia="Times New Roman" w:hAnsi="Arial" w:cs="Arial"/>
+          <w:kern w:val="36"/>
+          <w14:ligatures w14:val="none"/>
+        </w:rPr>
+        <w:lastRenderedPageBreak/>
+        <w:t>Interacción entre módulos</w:t>
+      </w:r>
+      <w:r>
+        <w:rPr>
+          <w:rFonts w:ascii="Arial" w:eastAsia="Times New Roman" w:hAnsi="Arial" w:cs="Arial"/>
+          <w:kern w:val="36"/>
+          <w14:ligatures w14:val="none"/>
+        </w:rPr>
+        <w:t>:</w:t>
+      </w:r>
+    </w:p>
+    <w:p>
+      <w:pPr>
+        <w:spacing w:before="100" w:beforeAutospacing="1" w:after="100" w:afterAutospacing="1" w:line="240" w:lineRule="auto"/>
+        <w:outlineLvl w:val="0"/>
+        <w:rPr>
+          <w:rFonts w:ascii="Arial" w:eastAsia="Times New Roman" w:hAnsi="Arial" w:cs="Arial"/>
+          <w:kern w:val="36"/>
+          <w14:ligatures w14:val="none"/>
+        </w:rPr>
+      </w:pPr>
+      <w:r>
+        <w:rPr>
+          <w:rFonts w:ascii="Arial" w:eastAsia="Times New Roman" w:hAnsi="Arial" w:cs="Arial"/>
+          <w:kern w:val="36"/>
+          <w14:ligatures w14:val="none"/>
+        </w:rPr>
+        <w:t>Los módulos del sistema no funcionan de manera aislada, sino que están interconectados a través de una base de datos central.</w:t>
+      </w:r>
+    </w:p>
+    <w:p>
+      <w:pPr>
+        <w:spacing w:before="100" w:beforeAutospacing="1" w:after="100" w:afterAutospacing="1" w:line="240" w:lineRule="auto"/>
+        <w:outlineLvl w:val="0"/>
+        <w:rPr>
+          <w:rFonts w:ascii="Arial" w:eastAsia="Times New Roman" w:hAnsi="Arial" w:cs="Arial"/>
+          <w:kern w:val="36"/>
+          <w14:ligatures w14:val="none"/>
+        </w:rPr>
+      </w:pPr>
+      <w:r>
+        <w:rPr>
+          <w:rFonts w:ascii="Arial" w:eastAsia="Times New Roman" w:hAnsi="Arial" w:cs="Arial"/>
+          <w:kern w:val="36"/>
+          <w14:ligatures w14:val="none"/>
+        </w:rPr>
+        <w:t>Por ejemplo:</w:t>
+      </w:r>
+    </w:p>
+    <w:p>
+      <w:pPr>
+        <w:numPr>
+          <w:ilvl w:val="0"/>
+          <w:numId w:val="5"/>
+        </w:numPr>
+        <w:spacing w:before="100" w:beforeAutospacing="1" w:after="100" w:afterAutospacing="1" w:line="240" w:lineRule="auto"/>
+        <w:outlineLvl w:val="0"/>
+        <w:rPr>
+          <w:rFonts w:ascii="Arial" w:eastAsia="Times New Roman" w:hAnsi="Arial" w:cs="Arial"/>
+          <w:kern w:val="36"/>
+          <w14:ligatures w14:val="none"/>
+        </w:rPr>
+      </w:pPr>
+      <w:r>
+        <w:rPr>
+          <w:rFonts w:ascii="Arial" w:eastAsia="Times New Roman" w:hAnsi="Arial" w:cs="Arial"/>
+          <w:kern w:val="36"/>
+          <w14:ligatures w14:val="none"/>
+        </w:rPr>
+        <w:t xml:space="preserve">El módulo de ventas consulta el inventario para validar disponibilidad de productos. </w:t>
+      </w:r>
+    </w:p>
+    <w:p>
+      <w:pPr>
+        <w:numPr>
+          <w:ilvl w:val="0"/>
+          <w:numId w:val="5"/>
+        </w:numPr>
+        <w:spacing w:before="100" w:beforeAutospacing="1" w:after="100" w:afterAutospacing="1" w:line="240" w:lineRule="auto"/>
+        <w:outlineLvl w:val="0"/>
+        <w:rPr>
+          <w:rFonts w:ascii="Arial" w:eastAsia="Times New Roman" w:hAnsi="Arial" w:cs="Arial"/>
+          <w:kern w:val="36"/>
+          <w14:ligatures w14:val="none"/>
+        </w:rPr>
+      </w:pPr>
+      <w:r>
+        <w:rPr>
+          <w:rFonts w:ascii="Arial" w:eastAsia="Times New Roman" w:hAnsi="Arial" w:cs="Arial"/>
+          <w:kern w:val="36"/>
+          <w14:ligatures w14:val="none"/>
+        </w:rPr>
+        <w:t xml:space="preserve">Al registrar una venta, el inventario se actualiza automáticamente. </w:t>
+      </w:r>
+    </w:p>
+    <w:p>
+      <w:pPr>
+        <w:numPr>
+          <w:ilvl w:val="0"/>
+          <w:numId w:val="5"/>
+        </w:numPr>
+        <w:spacing w:before="100" w:beforeAutospacing="1" w:after="100" w:afterAutospacing="1" w:line="240" w:lineRule="auto"/>
+        <w:outlineLvl w:val="0"/>
+        <w:rPr>
+          <w:rFonts w:ascii="Arial" w:eastAsia="Times New Roman" w:hAnsi="Arial" w:cs="Arial"/>
+          <w:kern w:val="36"/>
+          <w14:ligatures w14:val="none"/>
+        </w:rPr>
+      </w:pPr>
+      <w:r>
+        <w:rPr>
+          <w:rFonts w:ascii="Arial" w:eastAsia="Times New Roman" w:hAnsi="Arial" w:cs="Arial"/>
+          <w:kern w:val="36"/>
+          <w14:ligatures w14:val="none"/>
+        </w:rPr>
+        <w:t xml:space="preserve">Los datos de ventas y gastos son utilizados por el módulo de reportes para generar estadísticas. </w:t>
+      </w:r>
+    </w:p>
+    <w:p>
+      <w:pPr>
+        <w:numPr>
+          <w:ilvl w:val="0"/>
+          <w:numId w:val="5"/>
+        </w:numPr>
+        <w:spacing w:before="100" w:beforeAutospacing="1" w:after="100" w:afterAutospacing="1" w:line="240" w:lineRule="auto"/>
+        <w:outlineLvl w:val="0"/>
+        <w:rPr>
+          <w:rFonts w:ascii="Arial" w:eastAsia="Times New Roman" w:hAnsi="Arial" w:cs="Arial"/>
+          <w:kern w:val="36"/>
+          <w14:ligatures w14:val="none"/>
+        </w:rPr>
+      </w:pPr>
+      <w:r>
+        <w:rPr>
+          <w:rFonts w:ascii="Arial" w:eastAsia="Times New Roman" w:hAnsi="Arial" w:cs="Arial"/>
+          <w:kern w:val="36"/>
+          <w14:ligatures w14:val="none"/>
+        </w:rPr>
+        <w:t xml:space="preserve">Las cotizaciones pueden convertirse en ventas, reutilizando la información previamente registrada. </w:t>
+      </w:r>
+    </w:p>
+    <w:p>
+      <w:pPr>
+        <w:spacing w:before="100" w:beforeAutospacing="1" w:after="100" w:afterAutospacing="1" w:line="240" w:lineRule="auto"/>
+        <w:outlineLvl w:val="0"/>
+        <w:rPr>
+          <w:rFonts w:ascii="Arial" w:eastAsia="Times New Roman" w:hAnsi="Arial" w:cs="Arial"/>
+          <w:kern w:val="36"/>
+          <w14:ligatures w14:val="none"/>
+        </w:rPr>
+      </w:pPr>
+      <w:r>
+        <w:rPr>
+          <w:rFonts w:ascii="Arial" w:eastAsia="Times New Roman" w:hAnsi="Arial" w:cs="Arial"/>
+          <w:kern w:val="36"/>
+          <w14:ligatures w14:val="none"/>
+        </w:rPr>
+        <w:t>Esta integración permite mantener la consistencia de los datos y evitar duplicidad de información.</w:t>
+      </w:r>
+    </w:p>
+    <w:p>
+      <w:pPr>
+        <w:spacing w:before="100" w:beforeAutospacing="1" w:after="100" w:afterAutospacing="1" w:line="240" w:lineRule="auto"/>
+        <w:outlineLvl w:val="0"/>
+        <w:rPr>
+          <w:rFonts w:ascii="Arial" w:eastAsia="Times New Roman" w:hAnsi="Arial" w:cs="Arial"/>
+          <w:kern w:val="36"/>
+          <w14:ligatures w14:val="none"/>
+        </w:rPr>
+      </w:pPr>
+    </w:p>
+    <w:p>
+      <w:pPr>
+        <w:spacing w:before="100" w:beforeAutospacing="1" w:after="100" w:afterAutospacing="1" w:line="240" w:lineRule="auto"/>
+        <w:outlineLvl w:val="0"/>
+        <w:rPr>
+          <w:rFonts w:ascii="Arial" w:eastAsia="Times New Roman" w:hAnsi="Arial" w:cs="Arial"/>
+          <w:kern w:val="36"/>
+          <w14:ligatures w14:val="none"/>
+        </w:rPr>
+      </w:pPr>
+      <w:r>
+        <w:rPr>
+          <w:rFonts w:ascii="Arial" w:eastAsia="Times New Roman" w:hAnsi="Arial" w:cs="Arial"/>
+          <w:kern w:val="36"/>
+          <w14:ligatures w14:val="none"/>
+        </w:rPr>
+        <w:t>Modelo de datos</w:t>
+      </w:r>
+      <w:r>
+        <w:rPr>
+          <w:rFonts w:ascii="Arial" w:eastAsia="Times New Roman" w:hAnsi="Arial" w:cs="Arial"/>
+          <w:kern w:val="36"/>
+          <w14:ligatures w14:val="none"/>
+        </w:rPr>
+        <w:t>:</w:t>
+      </w:r>
+    </w:p>
+    <w:p>
+      <w:pPr>
+        <w:spacing w:before="100" w:beforeAutospacing="1" w:after="100" w:afterAutospacing="1" w:line="240" w:lineRule="auto"/>
+        <w:outlineLvl w:val="0"/>
+        <w:rPr>
+          <w:rFonts w:ascii="Arial" w:eastAsia="Times New Roman" w:hAnsi="Arial" w:cs="Arial"/>
+          <w:kern w:val="36"/>
+          <w14:ligatures w14:val="none"/>
+        </w:rPr>
+      </w:pPr>
+      <w:r>
+        <w:rPr>
+          <w:rFonts w:ascii="Arial" w:eastAsia="Times New Roman" w:hAnsi="Arial" w:cs="Arial"/>
+          <w:kern w:val="36"/>
+          <w14:ligatures w14:val="none"/>
+        </w:rPr>
+        <w:t>El sistema se apoya en un modelo de datos estructurado, representado mediante un diagrama de clases, en el cual se definen entidades como:</w:t>
+      </w:r>
+    </w:p>
+    <w:p>
+      <w:pPr>
+        <w:numPr>
+          <w:ilvl w:val="0"/>
+          <w:numId w:val="6"/>
+        </w:numPr>
+        <w:spacing w:before="100" w:beforeAutospacing="1" w:after="100" w:afterAutospacing="1" w:line="240" w:lineRule="auto"/>
+        <w:outlineLvl w:val="0"/>
+        <w:rPr>
+          <w:rFonts w:ascii="Arial" w:eastAsia="Times New Roman" w:hAnsi="Arial" w:cs="Arial"/>
+          <w:kern w:val="36"/>
+          <w14:ligatures w14:val="none"/>
+        </w:rPr>
+      </w:pPr>
+      <w:r>
+        <w:rPr>
+          <w:rFonts w:ascii="Arial" w:eastAsia="Times New Roman" w:hAnsi="Arial" w:cs="Arial"/>
+          <w:kern w:val="36"/>
+          <w14:ligatures w14:val="none"/>
+        </w:rPr>
+        <w:t xml:space="preserve">Producto </w:t>
+      </w:r>
+    </w:p>
+    <w:p>
+      <w:pPr>
+        <w:numPr>
+          <w:ilvl w:val="0"/>
+          <w:numId w:val="6"/>
+        </w:numPr>
+        <w:spacing w:before="100" w:beforeAutospacing="1" w:after="100" w:afterAutospacing="1" w:line="240" w:lineRule="auto"/>
+        <w:outlineLvl w:val="0"/>
+        <w:rPr>
+          <w:rFonts w:ascii="Arial" w:eastAsia="Times New Roman" w:hAnsi="Arial" w:cs="Arial"/>
+          <w:kern w:val="36"/>
+          <w14:ligatures w14:val="none"/>
+        </w:rPr>
+      </w:pPr>
+      <w:r>
+        <w:rPr>
+          <w:rFonts w:ascii="Arial" w:eastAsia="Times New Roman" w:hAnsi="Arial" w:cs="Arial"/>
+          <w:kern w:val="36"/>
+          <w14:ligatures w14:val="none"/>
+        </w:rPr>
+        <w:t xml:space="preserve">Cliente </w:t>
+      </w:r>
+    </w:p>
+    <w:p>
+      <w:pPr>
+        <w:numPr>
+          <w:ilvl w:val="0"/>
+          <w:numId w:val="6"/>
+        </w:numPr>
+        <w:spacing w:before="100" w:beforeAutospacing="1" w:after="100" w:afterAutospacing="1" w:line="240" w:lineRule="auto"/>
+        <w:outlineLvl w:val="0"/>
+        <w:rPr>
+          <w:rFonts w:ascii="Arial" w:eastAsia="Times New Roman" w:hAnsi="Arial" w:cs="Arial"/>
+          <w:kern w:val="36"/>
+          <w14:ligatures w14:val="none"/>
+        </w:rPr>
+      </w:pPr>
+      <w:r>
+        <w:rPr>
+          <w:rFonts w:ascii="Arial" w:eastAsia="Times New Roman" w:hAnsi="Arial" w:cs="Arial"/>
+          <w:kern w:val="36"/>
+          <w14:ligatures w14:val="none"/>
+        </w:rPr>
+        <w:t xml:space="preserve">Venta </w:t>
+      </w:r>
+    </w:p>
+    <w:p>
+      <w:pPr>
+        <w:numPr>
+          <w:ilvl w:val="0"/>
+          <w:numId w:val="6"/>
+        </w:numPr>
+        <w:spacing w:before="100" w:beforeAutospacing="1" w:after="100" w:afterAutospacing="1" w:line="240" w:lineRule="auto"/>
+        <w:outlineLvl w:val="0"/>
+        <w:rPr>
+          <w:rFonts w:ascii="Arial" w:eastAsia="Times New Roman" w:hAnsi="Arial" w:cs="Arial"/>
+          <w:kern w:val="36"/>
+          <w14:ligatures w14:val="none"/>
+        </w:rPr>
+      </w:pPr>
+      <w:r>
+        <w:rPr>
+          <w:rFonts w:ascii="Arial" w:eastAsia="Times New Roman" w:hAnsi="Arial" w:cs="Arial"/>
+          <w:kern w:val="36"/>
+          <w14:ligatures w14:val="none"/>
+        </w:rPr>
+        <w:t xml:space="preserve">Detalle de venta </w:t>
+      </w:r>
+    </w:p>
+    <w:p>
+      <w:pPr>
+        <w:numPr>
+          <w:ilvl w:val="0"/>
+          <w:numId w:val="6"/>
+        </w:numPr>
+        <w:spacing w:before="100" w:beforeAutospacing="1" w:after="100" w:afterAutospacing="1" w:line="240" w:lineRule="auto"/>
+        <w:outlineLvl w:val="0"/>
+        <w:rPr>
+          <w:rFonts w:ascii="Arial" w:eastAsia="Times New Roman" w:hAnsi="Arial" w:cs="Arial"/>
+          <w:kern w:val="36"/>
+          <w14:ligatures w14:val="none"/>
+        </w:rPr>
+      </w:pPr>
+      <w:r>
+        <w:rPr>
+          <w:rFonts w:ascii="Arial" w:eastAsia="Times New Roman" w:hAnsi="Arial" w:cs="Arial"/>
+          <w:kern w:val="36"/>
+          <w14:ligatures w14:val="none"/>
+        </w:rPr>
+        <w:t xml:space="preserve">Gasto </w:t>
+      </w:r>
+    </w:p>
+    <w:p>
+      <w:pPr>
+        <w:numPr>
+          <w:ilvl w:val="0"/>
+          <w:numId w:val="6"/>
+        </w:numPr>
+        <w:spacing w:before="100" w:beforeAutospacing="1" w:after="100" w:afterAutospacing="1" w:line="240" w:lineRule="auto"/>
+        <w:outlineLvl w:val="0"/>
+        <w:rPr>
+          <w:rFonts w:ascii="Arial" w:eastAsia="Times New Roman" w:hAnsi="Arial" w:cs="Arial"/>
+          <w:kern w:val="36"/>
+          <w14:ligatures w14:val="none"/>
+        </w:rPr>
+      </w:pPr>
+      <w:r>
+        <w:rPr>
+          <w:rFonts w:ascii="Arial" w:eastAsia="Times New Roman" w:hAnsi="Arial" w:cs="Arial"/>
+          <w:kern w:val="36"/>
+          <w14:ligatures w14:val="none"/>
+        </w:rPr>
+        <w:t xml:space="preserve">Categoría de gasto </w:t>
+      </w:r>
+    </w:p>
+    <w:p>
+      <w:pPr>
+        <w:numPr>
+          <w:ilvl w:val="0"/>
+          <w:numId w:val="6"/>
+        </w:numPr>
+        <w:spacing w:before="100" w:beforeAutospacing="1" w:after="100" w:afterAutospacing="1" w:line="240" w:lineRule="auto"/>
+        <w:outlineLvl w:val="0"/>
+        <w:rPr>
+          <w:rFonts w:ascii="Arial" w:eastAsia="Times New Roman" w:hAnsi="Arial" w:cs="Arial"/>
+          <w:kern w:val="36"/>
+          <w14:ligatures w14:val="none"/>
+        </w:rPr>
+      </w:pPr>
+      <w:r>
+        <w:rPr>
+          <w:rFonts w:ascii="Arial" w:eastAsia="Times New Roman" w:hAnsi="Arial" w:cs="Arial"/>
+          <w:kern w:val="36"/>
+          <w14:ligatures w14:val="none"/>
+        </w:rPr>
+        <w:t xml:space="preserve">Cotización </w:t>
+      </w:r>
+    </w:p>
+    <w:p>
+      <w:pPr>
+        <w:spacing w:before="100" w:beforeAutospacing="1" w:after="100" w:afterAutospacing="1" w:line="240" w:lineRule="auto"/>
+        <w:outlineLvl w:val="0"/>
+        <w:rPr>
+          <w:rFonts w:ascii="Arial" w:eastAsia="Times New Roman" w:hAnsi="Arial" w:cs="Arial"/>
+          <w:kern w:val="36"/>
+          <w14:ligatures w14:val="none"/>
+        </w:rPr>
+      </w:pPr>
+      <w:r>
+        <w:rPr>
+          <w:rFonts w:ascii="Arial" w:eastAsia="Times New Roman" w:hAnsi="Arial" w:cs="Arial"/>
+          <w:kern w:val="36"/>
+          <w14:ligatures w14:val="none"/>
+        </w:rPr>
+        <w:t>Estas entidades se relacionan entre sí para representar las operaciones del negocio, permitiendo almacenar y consultar la información de manera eficiente.</w:t>
+      </w:r>
+    </w:p>
+    <w:p>
+      <w:pPr>
+        <w:spacing w:before="100" w:beforeAutospacing="1" w:after="100" w:afterAutospacing="1" w:line="240" w:lineRule="auto"/>
+        <w:outlineLvl w:val="0"/>
+        <w:rPr>
+          <w:rFonts w:ascii="Arial" w:eastAsia="Times New Roman" w:hAnsi="Arial" w:cs="Arial"/>
+          <w:kern w:val="36"/>
+          <w14:ligatures w14:val="none"/>
+        </w:rPr>
+      </w:pPr>
+    </w:p>
+    <w:p>
+      <w:pPr>
+        <w:spacing w:before="100" w:beforeAutospacing="1" w:after="100" w:afterAutospacing="1" w:line="240" w:lineRule="auto"/>
+        <w:outlineLvl w:val="0"/>
+        <w:rPr>
+          <w:rFonts w:ascii="Arial" w:eastAsia="Times New Roman" w:hAnsi="Arial" w:cs="Arial"/>
+          <w:kern w:val="36"/>
+          <w14:ligatures w14:val="none"/>
+        </w:rPr>
+      </w:pPr>
+      <w:r>
+        <w:rPr>
+          <w:rFonts w:ascii="Arial" w:eastAsia="Times New Roman" w:hAnsi="Arial" w:cs="Arial"/>
+          <w:kern w:val="36"/>
+          <w14:ligatures w14:val="none"/>
+        </w:rPr>
+        <w:t>Flujo de información</w:t>
+      </w:r>
+      <w:r>
+        <w:rPr>
+          <w:rFonts w:ascii="Arial" w:eastAsia="Times New Roman" w:hAnsi="Arial" w:cs="Arial"/>
+          <w:kern w:val="36"/>
+          <w14:ligatures w14:val="none"/>
+        </w:rPr>
+        <w:t>:</w:t>
+      </w:r>
+    </w:p>
+    <w:p>
+      <w:pPr>
+        <w:spacing w:before="100" w:beforeAutospacing="1" w:after="100" w:afterAutospacing="1" w:line="240" w:lineRule="auto"/>
+        <w:outlineLvl w:val="0"/>
+        <w:rPr>
+          <w:rFonts w:ascii="Arial" w:eastAsia="Times New Roman" w:hAnsi="Arial" w:cs="Arial"/>
+          <w:kern w:val="36"/>
+          <w14:ligatures w14:val="none"/>
+        </w:rPr>
+      </w:pPr>
+      <w:r>
+        <w:rPr>
+          <w:rFonts w:ascii="Arial" w:eastAsia="Times New Roman" w:hAnsi="Arial" w:cs="Arial"/>
+          <w:kern w:val="36"/>
+          <w14:ligatures w14:val="none"/>
+        </w:rPr>
+        <w:t>El flujo de información inicia con el administrador, quien ingresa los datos al sistema mediante la interfaz web. Estos datos son procesados por los diferentes módulos y almacenados en la base de datos.</w:t>
+      </w:r>
+    </w:p>
+    <w:p>
+      <w:pPr>
+        <w:spacing w:before="100" w:beforeAutospacing="1" w:after="100" w:afterAutospacing="1" w:line="240" w:lineRule="auto"/>
+        <w:outlineLvl w:val="0"/>
+        <w:rPr>
+          <w:rFonts w:ascii="Arial" w:eastAsia="Times New Roman" w:hAnsi="Arial" w:cs="Arial"/>
+          <w:kern w:val="36"/>
+          <w14:ligatures w14:val="none"/>
+        </w:rPr>
+      </w:pPr>
+      <w:r>
+        <w:rPr>
+          <w:rFonts w:ascii="Arial" w:eastAsia="Times New Roman" w:hAnsi="Arial" w:cs="Arial"/>
+          <w:kern w:val="36"/>
+          <w14:ligatures w14:val="none"/>
+        </w:rPr>
+        <w:t>Posteriormente, el sistema genera salidas en forma de:</w:t>
+      </w:r>
+    </w:p>
+    <w:p>
+      <w:pPr>
+        <w:numPr>
+          <w:ilvl w:val="0"/>
+          <w:numId w:val="7"/>
+        </w:numPr>
+        <w:spacing w:before="100" w:beforeAutospacing="1" w:after="100" w:afterAutospacing="1" w:line="240" w:lineRule="auto"/>
+        <w:outlineLvl w:val="0"/>
+        <w:rPr>
+          <w:rFonts w:ascii="Arial" w:eastAsia="Times New Roman" w:hAnsi="Arial" w:cs="Arial"/>
+          <w:kern w:val="36"/>
+          <w14:ligatures w14:val="none"/>
+        </w:rPr>
+      </w:pPr>
+      <w:r>
+        <w:rPr>
+          <w:rFonts w:ascii="Arial" w:eastAsia="Times New Roman" w:hAnsi="Arial" w:cs="Arial"/>
+          <w:kern w:val="36"/>
+          <w14:ligatures w14:val="none"/>
+        </w:rPr>
+        <w:lastRenderedPageBreak/>
+        <w:t xml:space="preserve">Reportes </w:t>
+      </w:r>
+    </w:p>
+    <w:p>
+      <w:pPr>
+        <w:numPr>
+          <w:ilvl w:val="0"/>
+          <w:numId w:val="7"/>
+        </w:numPr>
+        <w:spacing w:before="100" w:beforeAutospacing="1" w:after="100" w:afterAutospacing="1" w:line="240" w:lineRule="auto"/>
+        <w:outlineLvl w:val="0"/>
+        <w:rPr>
+          <w:rFonts w:ascii="Arial" w:eastAsia="Times New Roman" w:hAnsi="Arial" w:cs="Arial"/>
+          <w:kern w:val="36"/>
+          <w14:ligatures w14:val="none"/>
+        </w:rPr>
+      </w:pPr>
+      <w:r>
+        <w:rPr>
+          <w:rFonts w:ascii="Arial" w:eastAsia="Times New Roman" w:hAnsi="Arial" w:cs="Arial"/>
+          <w:kern w:val="36"/>
+          <w14:ligatures w14:val="none"/>
+        </w:rPr>
+        <w:t xml:space="preserve">Consultas </w:t>
+      </w:r>
+    </w:p>
+    <w:p>
+      <w:pPr>
+        <w:numPr>
+          <w:ilvl w:val="0"/>
+          <w:numId w:val="7"/>
+        </w:numPr>
+        <w:spacing w:before="100" w:beforeAutospacing="1" w:after="100" w:afterAutospacing="1" w:line="240" w:lineRule="auto"/>
+        <w:outlineLvl w:val="0"/>
+        <w:rPr>
+          <w:rFonts w:ascii="Arial" w:eastAsia="Times New Roman" w:hAnsi="Arial" w:cs="Arial"/>
+          <w:kern w:val="36"/>
+          <w14:ligatures w14:val="none"/>
+        </w:rPr>
+      </w:pPr>
+      <w:r>
+        <w:rPr>
+          <w:rFonts w:ascii="Arial" w:eastAsia="Times New Roman" w:hAnsi="Arial" w:cs="Arial"/>
+          <w:kern w:val="36"/>
+          <w14:ligatures w14:val="none"/>
+        </w:rPr>
+        <w:t xml:space="preserve">Estadísticas </w:t>
+      </w:r>
+    </w:p>
+    <w:p>
+      <w:pPr>
+        <w:spacing w:before="100" w:beforeAutospacing="1" w:after="100" w:afterAutospacing="1" w:line="240" w:lineRule="auto"/>
+        <w:outlineLvl w:val="0"/>
+        <w:rPr>
+          <w:rFonts w:ascii="Arial" w:eastAsia="Times New Roman" w:hAnsi="Arial" w:cs="Arial"/>
+          <w:kern w:val="36"/>
+          <w14:ligatures w14:val="none"/>
+        </w:rPr>
+      </w:pPr>
+      <w:r>
+        <w:rPr>
+          <w:rFonts w:ascii="Arial" w:eastAsia="Times New Roman" w:hAnsi="Arial" w:cs="Arial"/>
+          <w:kern w:val="36"/>
+          <w14:ligatures w14:val="none"/>
+        </w:rPr>
+        <w:t>Este flujo garantiza que la información sea procesada, almacenada y presentada de manera organizada y útil para la toma de decisiones.</w:t>
+      </w:r>
+    </w:p>
+    <w:p>
+      <w:pPr>
+        <w:spacing w:before="100" w:beforeAutospacing="1" w:after="100" w:afterAutospacing="1" w:line="240" w:lineRule="auto"/>
+        <w:outlineLvl w:val="0"/>
+        <w:rPr>
+          <w:rFonts w:ascii="Arial" w:eastAsia="Times New Roman" w:hAnsi="Arial" w:cs="Arial"/>
+          <w:kern w:val="36"/>
+          <w14:ligatures w14:val="none"/>
+        </w:rPr>
+      </w:pPr>
+    </w:p>
+    <w:p>
+      <w:pPr>
+        <w:spacing w:before="100" w:beforeAutospacing="1" w:after="100" w:afterAutospacing="1" w:line="240" w:lineRule="auto"/>
+        <w:outlineLvl w:val="0"/>
+        <w:rPr>
+          <w:rFonts w:ascii="Arial" w:eastAsia="Times New Roman" w:hAnsi="Arial" w:cs="Arial"/>
+          <w:kern w:val="36"/>
+          <w14:ligatures w14:val="none"/>
+        </w:rPr>
+      </w:pPr>
+      <w:r>
+        <w:rPr>
+          <w:rFonts w:ascii="Arial" w:eastAsia="Times New Roman" w:hAnsi="Arial" w:cs="Arial"/>
+          <w:kern w:val="36"/>
+          <w14:ligatures w14:val="none"/>
+        </w:rPr>
+        <w:t>Beneficios del modelo propuesto</w:t>
+      </w:r>
+      <w:r>
+        <w:rPr>
+          <w:rFonts w:ascii="Arial" w:eastAsia="Times New Roman" w:hAnsi="Arial" w:cs="Arial"/>
+          <w:kern w:val="36"/>
+          <w14:ligatures w14:val="none"/>
+        </w:rPr>
+        <w:t>:</w:t>
+      </w:r>
+    </w:p>
+    <w:p>
+      <w:pPr>
+        <w:spacing w:before="100" w:beforeAutospacing="1" w:after="100" w:afterAutospacing="1" w:line="240" w:lineRule="auto"/>
+        <w:outlineLvl w:val="0"/>
+        <w:rPr>
+          <w:rFonts w:ascii="Arial" w:eastAsia="Times New Roman" w:hAnsi="Arial" w:cs="Arial"/>
+          <w:kern w:val="36"/>
+          <w14:ligatures w14:val="none"/>
+        </w:rPr>
+      </w:pPr>
+      <w:r>
+        <w:rPr>
+          <w:rFonts w:ascii="Arial" w:eastAsia="Times New Roman" w:hAnsi="Arial" w:cs="Arial"/>
+          <w:kern w:val="36"/>
+          <w14:ligatures w14:val="none"/>
+        </w:rPr>
+        <w:t>El modelo del sistema propuesto ofrece las siguientes ventajas:</w:t>
+      </w:r>
+    </w:p>
+    <w:p>
+      <w:pPr>
+        <w:numPr>
+          <w:ilvl w:val="0"/>
+          <w:numId w:val="8"/>
+        </w:numPr>
+        <w:spacing w:before="100" w:beforeAutospacing="1" w:after="100" w:afterAutospacing="1" w:line="240" w:lineRule="auto"/>
+        <w:outlineLvl w:val="0"/>
+        <w:rPr>
+          <w:rFonts w:ascii="Arial" w:eastAsia="Times New Roman" w:hAnsi="Arial" w:cs="Arial"/>
+          <w:kern w:val="36"/>
+          <w14:ligatures w14:val="none"/>
+        </w:rPr>
+      </w:pPr>
+      <w:r>
+        <w:rPr>
+          <w:rFonts w:ascii="Arial" w:eastAsia="Times New Roman" w:hAnsi="Arial" w:cs="Arial"/>
+          <w:kern w:val="36"/>
+          <w14:ligatures w14:val="none"/>
+        </w:rPr>
+        <w:t xml:space="preserve">Centralización de la información del negocio </w:t>
+      </w:r>
+    </w:p>
+    <w:p>
+      <w:pPr>
+        <w:numPr>
+          <w:ilvl w:val="0"/>
+          <w:numId w:val="8"/>
+        </w:numPr>
+        <w:spacing w:before="100" w:beforeAutospacing="1" w:after="100" w:afterAutospacing="1" w:line="240" w:lineRule="auto"/>
+        <w:outlineLvl w:val="0"/>
+        <w:rPr>
+          <w:rFonts w:ascii="Arial" w:eastAsia="Times New Roman" w:hAnsi="Arial" w:cs="Arial"/>
+          <w:kern w:val="36"/>
+          <w14:ligatures w14:val="none"/>
+        </w:rPr>
+      </w:pPr>
+      <w:r>
+        <w:rPr>
+          <w:rFonts w:ascii="Arial" w:eastAsia="Times New Roman" w:hAnsi="Arial" w:cs="Arial"/>
+          <w:kern w:val="36"/>
+          <w14:ligatures w14:val="none"/>
+        </w:rPr>
+        <w:t xml:space="preserve">Reducción de errores en registros manuales </w:t>
+      </w:r>
+    </w:p>
+    <w:p>
+      <w:pPr>
+        <w:numPr>
+          <w:ilvl w:val="0"/>
+          <w:numId w:val="8"/>
+        </w:numPr>
+        <w:spacing w:before="100" w:beforeAutospacing="1" w:after="100" w:afterAutospacing="1" w:line="240" w:lineRule="auto"/>
+        <w:outlineLvl w:val="0"/>
+        <w:rPr>
+          <w:rFonts w:ascii="Arial" w:eastAsia="Times New Roman" w:hAnsi="Arial" w:cs="Arial"/>
+          <w:kern w:val="36"/>
+          <w14:ligatures w14:val="none"/>
+        </w:rPr>
+      </w:pPr>
+      <w:r>
+        <w:rPr>
+          <w:rFonts w:ascii="Arial" w:eastAsia="Times New Roman" w:hAnsi="Arial" w:cs="Arial"/>
+          <w:kern w:val="36"/>
+          <w14:ligatures w14:val="none"/>
+        </w:rPr>
+        <w:t xml:space="preserve">Automatización de cálculos (ventas y ganancias) </w:t>
+      </w:r>
+    </w:p>
+    <w:p>
+      <w:pPr>
+        <w:numPr>
+          <w:ilvl w:val="0"/>
+          <w:numId w:val="8"/>
+        </w:numPr>
+        <w:spacing w:before="100" w:beforeAutospacing="1" w:after="100" w:afterAutospacing="1" w:line="240" w:lineRule="auto"/>
+        <w:outlineLvl w:val="0"/>
+        <w:rPr>
+          <w:rFonts w:ascii="Arial" w:eastAsia="Times New Roman" w:hAnsi="Arial" w:cs="Arial"/>
+          <w:kern w:val="36"/>
+          <w14:ligatures w14:val="none"/>
+        </w:rPr>
+      </w:pPr>
+      <w:r>
+        <w:rPr>
+          <w:rFonts w:ascii="Arial" w:eastAsia="Times New Roman" w:hAnsi="Arial" w:cs="Arial"/>
+          <w:kern w:val="36"/>
+          <w14:ligatures w14:val="none"/>
+        </w:rPr>
+        <w:t xml:space="preserve">Mejor control del inventario </w:t>
+      </w:r>
+    </w:p>
+    <w:p>
+      <w:pPr>
+        <w:numPr>
+          <w:ilvl w:val="0"/>
+          <w:numId w:val="8"/>
+        </w:numPr>
+        <w:spacing w:before="100" w:beforeAutospacing="1" w:after="100" w:afterAutospacing="1" w:line="240" w:lineRule="auto"/>
+        <w:outlineLvl w:val="0"/>
+        <w:rPr>
+          <w:rFonts w:ascii="Arial" w:eastAsia="Times New Roman" w:hAnsi="Arial" w:cs="Arial"/>
+          <w:kern w:val="36"/>
+          <w14:ligatures w14:val="none"/>
+        </w:rPr>
+      </w:pPr>
+      <w:r>
+        <w:rPr>
+          <w:rFonts w:ascii="Arial" w:eastAsia="Times New Roman" w:hAnsi="Arial" w:cs="Arial"/>
+          <w:kern w:val="36"/>
+          <w14:ligatures w14:val="none"/>
+        </w:rPr>
+        <w:t xml:space="preserve">Acceso rápido a reportes y estadísticas </w:t>
+      </w:r>
+    </w:p>
+    <w:p>
+      <w:pPr>
+        <w:numPr>
+          <w:ilvl w:val="0"/>
+          <w:numId w:val="8"/>
+        </w:numPr>
+        <w:spacing w:before="100" w:beforeAutospacing="1" w:after="100" w:afterAutospacing="1" w:line="240" w:lineRule="auto"/>
+        <w:outlineLvl w:val="0"/>
+        <w:rPr>
+          <w:rFonts w:ascii="Arial" w:eastAsia="Times New Roman" w:hAnsi="Arial" w:cs="Arial"/>
+          <w:kern w:val="36"/>
+          <w14:ligatures w14:val="none"/>
+        </w:rPr>
+      </w:pPr>
+      <w:r>
+        <w:rPr>
+          <w:rFonts w:ascii="Arial" w:eastAsia="Times New Roman" w:hAnsi="Arial" w:cs="Arial"/>
+          <w:kern w:val="36"/>
+          <w14:ligatures w14:val="none"/>
+        </w:rPr>
+        <w:t>Apoyo a la toma de decisiones</w:t>
+      </w:r>
+    </w:p>
+    <w:p>
+      <w:pPr>
+        <w:spacing w:before="100" w:beforeAutospacing="1" w:after="100" w:afterAutospacing="1" w:line="240" w:lineRule="auto"/>
+        <w:outlineLvl w:val="0"/>
+        <w:rPr>
           <w:rFonts w:eastAsia="Times New Roman" w:cs="Times New Roman"/>
           <w:b/>
           <w:bCs/>
@@ -456,7 +1645,11 @@
           <w14:ligatures w14:val="none"/>
         </w:rPr>
       </w:pPr>
-      <w:r>
+    </w:p>
+    <w:p>
+      <w:pPr>
+        <w:spacing w:before="100" w:beforeAutospacing="1" w:after="100" w:afterAutospacing="1" w:line="240" w:lineRule="auto"/>
+        <w:outlineLvl w:val="0"/>
         <w:rPr>
           <w:rFonts w:eastAsia="Times New Roman" w:cs="Times New Roman"/>
           <w:b/>
@@ -464,7 +1657,34 @@
           <w:kern w:val="36"/>
           <w14:ligatures w14:val="none"/>
         </w:rPr>
-        <w:t xml:space="preserve"> Arquitectura del sistema</w:t>
+      </w:pPr>
+    </w:p>
+    <w:p>
+      <w:pPr>
+        <w:pStyle w:val="Prrafodelista"/>
+        <w:numPr>
+          <w:ilvl w:val="0"/>
+          <w:numId w:val="3"/>
+        </w:numPr>
+        <w:spacing w:before="100" w:beforeAutospacing="1" w:after="100" w:afterAutospacing="1" w:line="240" w:lineRule="auto"/>
+        <w:outlineLvl w:val="0"/>
+        <w:rPr>
+          <w:rFonts w:eastAsia="Times New Roman" w:cs="Times New Roman"/>
+          <w:b/>
+          <w:bCs/>
+          <w:kern w:val="36"/>
+          <w14:ligatures w14:val="none"/>
+        </w:rPr>
+      </w:pPr>
+      <w:r>
+        <w:rPr>
+          <w:rFonts w:eastAsia="Times New Roman" w:cs="Times New Roman"/>
+          <w:b/>
+          <w:bCs/>
+          <w:kern w:val="36"/>
+          <w14:ligatures w14:val="none"/>
+        </w:rPr>
+        <w:t>Arquitectura del sistema</w:t>
       </w:r>
     </w:p>
     <w:p>
@@ -533,38 +1753,32 @@
         <w:rPr>
           <w:rFonts w:asciiTheme="minorHAnsi" w:hAnsiTheme="minorHAnsi"/>
         </w:rPr>
-        <w:t xml:space="preserve">La capa de presentación corresponde a la interfaz web con la que interactúa el administrador, permitiéndole registrar productos, ventas, clientes, gastos y consultar reportes. La capa lógica se encarga de procesar la información, realizar cálculos </w:t>
-      </w:r>
-      <w:r>
+        <w:t>La capa de presentación corresponde a la interfaz web con la que interactúa el administrador, permitiéndole registrar productos, ventas, clientes, gastos y consultar reportes. La capa lógica se encarga de procesar la información, realizar cálculos como el total de ventas y ganancias, validar datos y gestionar las reglas del negocio. Finalmente, la capa de datos almacena toda la información en la base de datos, garantizando la integridad y disponibilidad de los datos.</w:t>
+      </w:r>
+    </w:p>
+    <w:p>
+      <w:pPr>
+        <w:pStyle w:val="NormalWeb"/>
         <w:rPr>
           <w:rFonts w:asciiTheme="minorHAnsi" w:hAnsiTheme="minorHAnsi"/>
         </w:rPr>
+      </w:pPr>
+      <w:r>
+        <w:rPr>
+          <w:rFonts w:asciiTheme="minorHAnsi" w:hAnsiTheme="minorHAnsi"/>
+        </w:rPr>
+        <w:t>Este tipo de arquitectura permite que el sistema funcione de manera organizada, separando responsabilidades y facilitando futuras mejoras o integraciones.</w:t>
+      </w:r>
+    </w:p>
+    <w:p>
+      <w:pPr>
+        <w:pStyle w:val="Prrafodelista"/>
+      </w:pPr>
+      <w:r>
+        <w:rPr>
+          <w:noProof/>
+        </w:rPr>
         <w:lastRenderedPageBreak/>
-        <w:t>como el total de ventas y ganancias, validar datos y gestionar las reglas del negocio. Finalmente, la capa de datos almacena toda la información en la base de datos, garantizando la integridad y disponibilidad de los datos.</w:t>
-      </w:r>
-    </w:p>
-    <w:p>
-      <w:pPr>
-        <w:pStyle w:val="NormalWeb"/>
-        <w:rPr>
-          <w:rFonts w:asciiTheme="minorHAnsi" w:hAnsiTheme="minorHAnsi"/>
-        </w:rPr>
-      </w:pPr>
-      <w:r>
-        <w:rPr>
-          <w:rFonts w:asciiTheme="minorHAnsi" w:hAnsiTheme="minorHAnsi"/>
-        </w:rPr>
-        <w:t>Este tipo de arquitectura permite que el sistema funcione de manera organizada, separando responsabilidades y facilitando futuras mejoras o integraciones.</w:t>
-      </w:r>
-    </w:p>
-    <w:p>
-      <w:pPr>
-        <w:pStyle w:val="ListParagraph"/>
-      </w:pPr>
-      <w:r>
-        <w:rPr>
-          <w:noProof/>
-        </w:rPr>
         <w:drawing>
           <wp:inline distT="0" distB="0" distL="0" distR="0" wp14:anchorId="2FF88003" wp14:editId="6B53ACDB">
             <wp:extent cx="2237361" cy="3272558"/>
@@ -612,7 +1826,7 @@
     </w:p>
     <w:p>
       <w:pPr>
-        <w:pStyle w:val="ListParagraph"/>
+        <w:pStyle w:val="Prrafodelista"/>
         <w:numPr>
           <w:ilvl w:val="0"/>
           <w:numId w:val="3"/>
@@ -643,7 +1857,6 @@
           <w:bCs/>
           <w:noProof/>
         </w:rPr>
-        <w:lastRenderedPageBreak/>
         <w:drawing>
           <wp:inline distT="0" distB="0" distL="0" distR="0" wp14:anchorId="033A7E9C" wp14:editId="074E7DBD">
             <wp:extent cx="5612130" cy="3035300"/>
@@ -713,6 +1926,7 @@
           <w:b/>
           <w:bCs/>
         </w:rPr>
+        <w:lastRenderedPageBreak/>
         <w:t>Dispositivo Cliente</w:t>
       </w:r>
       <w:r>
@@ -738,39 +1952,7 @@
         <w:t>Servidor de Aplicaciones</w:t>
       </w:r>
       <w:r>
-        <w:t xml:space="preserve"> — Es donde vive el sistema. Contiene el </w:t>
-      </w:r>
-      <w:proofErr w:type="spellStart"/>
-      <w:r>
-        <w:t>frontend</w:t>
-      </w:r>
-      <w:proofErr w:type="spellEnd"/>
-      <w:r>
-        <w:t xml:space="preserve"> en </w:t>
-      </w:r>
-      <w:proofErr w:type="spellStart"/>
-      <w:r>
-        <w:t>React</w:t>
-      </w:r>
-      <w:proofErr w:type="spellEnd"/>
-      <w:r>
-        <w:t xml:space="preserve"> (la interfaz visual), la API REST (que recibe las peticiones) y el </w:t>
-      </w:r>
-      <w:proofErr w:type="spellStart"/>
-      <w:r>
-        <w:t>backend</w:t>
-      </w:r>
-      <w:proofErr w:type="spellEnd"/>
-      <w:r>
-        <w:t xml:space="preserve"> en Java con Spring Boot (que ejecuta toda la lógica del negocio). Aquí se despliegan los 9 módulos: </w:t>
-      </w:r>
-      <w:proofErr w:type="spellStart"/>
-      <w:r>
-        <w:t>Dashboard</w:t>
-      </w:r>
-      <w:proofErr w:type="spellEnd"/>
-      <w:r>
-        <w:t>, Ventas, Inventario, Clientes, Cotizaciones, Gastos, Estadísticas, Reportes y Autenticación.</w:t>
+        <w:t xml:space="preserve"> — Es donde vive el sistema. Contiene el frontend en React (la interfaz visual), la API REST (que recibe las peticiones) y el backend en Java con Spring Boot (que ejecuta toda la lógica del negocio). Aquí se despliegan los 9 módulos: Dashboard, Ventas, Inventario, Clientes, Cotizaciones, Gastos, Estadísticas, Reportes y Autenticación.</w:t>
       </w:r>
     </w:p>
     <w:p>
@@ -807,23 +1989,7 @@
     </w:p>
     <w:p>
       <w:r>
-        <w:t xml:space="preserve">El flujo es simple: el administrador usa el navegador → el </w:t>
-      </w:r>
-      <w:proofErr w:type="spellStart"/>
-      <w:r>
-        <w:t>frontend</w:t>
-      </w:r>
-      <w:proofErr w:type="spellEnd"/>
-      <w:r>
-        <w:t xml:space="preserve"> lo muestra → la API procesa las peticiones → el </w:t>
-      </w:r>
-      <w:proofErr w:type="spellStart"/>
-      <w:r>
-        <w:t>backend</w:t>
-      </w:r>
-      <w:proofErr w:type="spellEnd"/>
-      <w:r>
-        <w:t xml:space="preserve"> aplica la lógica → PostgreSQL guarda los datos.</w:t>
+        <w:t>El flujo es simple: el administrador usa el navegador → el frontend lo muestra → la API procesa las peticiones → el backend aplica la lógica → PostgreSQL guarda los datos.</w:t>
       </w:r>
     </w:p>
     <w:p/>
@@ -840,6 +2006,453 @@
 <file path=word/numbering.xml><?xml version="1.0" encoding="utf-8"?>
 <w:numbering xmlns:wpc="http://schemas.microsoft.com/office/word/2010/wordprocessingCanvas" xmlns:cx="http://schemas.microsoft.com/office/drawing/2014/chartex" xmlns:cx1="http://schemas.microsoft.com/office/drawing/2015/9/8/chartex" xmlns:cx2="http://schemas.microsoft.com/office/drawing/2015/10/21/chartex" xmlns:cx3="http://schemas.microsoft.com/office/drawing/2016/5/9/chartex" xmlns:cx4="http://schemas.microsoft.com/office/drawing/2016/5/10/chartex" xmlns:cx5="http://schemas.microsoft.com/office/drawing/2016/5/11/chartex" xmlns:cx6="http://schemas.microsoft.com/office/drawing/2016/5/12/chartex" xmlns:cx7="http://schemas.microsoft.com/office/drawing/2016/5/13/chartex" xmlns:cx8="http://schemas.microsoft.com/office/drawing/2016/5/14/chartex" xmlns:mc="http://schemas.openxmlformats.org/markup-compatibility/2006" xmlns:aink="http://schemas.microsoft.com/office/drawing/2016/ink" xmlns:am3d="http://schemas.microsoft.com/office/drawing/2017/model3d" xmlns:o="urn:schemas-microsoft-com:office:office" xmlns:oel="http://schemas.microsoft.com/office/2019/extlst" xmlns:r="http://schemas.openxmlformats.org/officeDocument/2006/relationships" xmlns:m="http://schemas.openxmlformats.org/officeDocument/2006/math" xmlns:v="urn:schemas-microsoft-com:vml" xmlns:wp14="http://schemas.microsoft.com/office/word/2010/wordprocessingDrawing" xmlns:wp="http://schemas.openxmlformats.org/drawingml/2006/wordprocessingDrawing" xmlns:w10="urn:schemas-microsoft-com:office:word" xmlns:w="http://schemas.openxmlformats.org/wordprocessingml/2006/main" xmlns:w14="http://schemas.microsoft.com/office/word/2010/wordml" xmlns:w15="http://schemas.microsoft.com/office/word/2012/wordml" xmlns:w16cex="http://schemas.microsoft.com/office/word/2018/wordml/cex" xmlns:w16cid="http://schemas.microsoft.com/office/word/2016/wordml/cid" xmlns:w16="http://schemas.microsoft.com/office/word/2018/wordml" xmlns:w16du="http://schemas.microsoft.com/office/word/2023/wordml/word16du" xmlns:w16sdtdh="http://schemas.microsoft.com/office/word/2020/wordml/sdtdatahash" xmlns:w16sdtfl="http://schemas.microsoft.com/office/word/2024/wordml/sdtformatlock" xmlns:w16se="http://schemas.microsoft.com/office/word/2015/wordml/symex" xmlns:wpg="http://schemas.microsoft.com/office/word/2010/wordprocessingGroup" xmlns:wpi="http://schemas.microsoft.com/office/word/2010/wordprocessingInk" xmlns:wne="http://schemas.microsoft.com/office/word/2006/wordml" xmlns:wps="http://schemas.microsoft.com/office/word/2010/wordprocessingShape" mc:Ignorable="w14 w15 w16se w16cid w16 w16cex w16sdtdh w16sdtfl w16du wp14">
   <w:abstractNum w:abstractNumId="0" w15:restartNumberingAfterBreak="0">
+    <w:nsid w:val="00124F23"/>
+    <w:multiLevelType w:val="multilevel"/>
+    <w:tmpl w:val="72B891DE"/>
+    <w:lvl w:ilvl="0">
+      <w:start w:val="1"/>
+      <w:numFmt w:val="bullet"/>
+      <w:lvlText w:val=""/>
+      <w:lvlJc w:val="left"/>
+      <w:pPr>
+        <w:tabs>
+          <w:tab w:val="num" w:pos="720"/>
+        </w:tabs>
+        <w:ind w:left="720" w:hanging="360"/>
+      </w:pPr>
+      <w:rPr>
+        <w:rFonts w:ascii="Symbol" w:hAnsi="Symbol" w:hint="default"/>
+        <w:sz w:val="20"/>
+      </w:rPr>
+    </w:lvl>
+    <w:lvl w:ilvl="1" w:tentative="1">
+      <w:start w:val="1"/>
+      <w:numFmt w:val="bullet"/>
+      <w:lvlText w:val="o"/>
+      <w:lvlJc w:val="left"/>
+      <w:pPr>
+        <w:tabs>
+          <w:tab w:val="num" w:pos="1440"/>
+        </w:tabs>
+        <w:ind w:left="1440" w:hanging="360"/>
+      </w:pPr>
+      <w:rPr>
+        <w:rFonts w:ascii="Courier New" w:hAnsi="Courier New" w:hint="default"/>
+        <w:sz w:val="20"/>
+      </w:rPr>
+    </w:lvl>
+    <w:lvl w:ilvl="2" w:tentative="1">
+      <w:start w:val="1"/>
+      <w:numFmt w:val="bullet"/>
+      <w:lvlText w:val=""/>
+      <w:lvlJc w:val="left"/>
+      <w:pPr>
+        <w:tabs>
+          <w:tab w:val="num" w:pos="2160"/>
+        </w:tabs>
+        <w:ind w:left="2160" w:hanging="360"/>
+      </w:pPr>
+      <w:rPr>
+        <w:rFonts w:ascii="Wingdings" w:hAnsi="Wingdings" w:hint="default"/>
+        <w:sz w:val="20"/>
+      </w:rPr>
+    </w:lvl>
+    <w:lvl w:ilvl="3" w:tentative="1">
+      <w:start w:val="1"/>
+      <w:numFmt w:val="bullet"/>
+      <w:lvlText w:val=""/>
+      <w:lvlJc w:val="left"/>
+      <w:pPr>
+        <w:tabs>
+          <w:tab w:val="num" w:pos="2880"/>
+        </w:tabs>
+        <w:ind w:left="2880" w:hanging="360"/>
+      </w:pPr>
+      <w:rPr>
+        <w:rFonts w:ascii="Wingdings" w:hAnsi="Wingdings" w:hint="default"/>
+        <w:sz w:val="20"/>
+      </w:rPr>
+    </w:lvl>
+    <w:lvl w:ilvl="4" w:tentative="1">
+      <w:start w:val="1"/>
+      <w:numFmt w:val="bullet"/>
+      <w:lvlText w:val=""/>
+      <w:lvlJc w:val="left"/>
+      <w:pPr>
+        <w:tabs>
+          <w:tab w:val="num" w:pos="3600"/>
+        </w:tabs>
+        <w:ind w:left="3600" w:hanging="360"/>
+      </w:pPr>
+      <w:rPr>
+        <w:rFonts w:ascii="Wingdings" w:hAnsi="Wingdings" w:hint="default"/>
+        <w:sz w:val="20"/>
+      </w:rPr>
+    </w:lvl>
+    <w:lvl w:ilvl="5" w:tentative="1">
+      <w:start w:val="1"/>
+      <w:numFmt w:val="bullet"/>
+      <w:lvlText w:val=""/>
+      <w:lvlJc w:val="left"/>
+      <w:pPr>
+        <w:tabs>
+          <w:tab w:val="num" w:pos="4320"/>
+        </w:tabs>
+        <w:ind w:left="4320" w:hanging="360"/>
+      </w:pPr>
+      <w:rPr>
+        <w:rFonts w:ascii="Wingdings" w:hAnsi="Wingdings" w:hint="default"/>
+        <w:sz w:val="20"/>
+      </w:rPr>
+    </w:lvl>
+    <w:lvl w:ilvl="6" w:tentative="1">
+      <w:start w:val="1"/>
+      <w:numFmt w:val="bullet"/>
+      <w:lvlText w:val=""/>
+      <w:lvlJc w:val="left"/>
+      <w:pPr>
+        <w:tabs>
+          <w:tab w:val="num" w:pos="5040"/>
+        </w:tabs>
+        <w:ind w:left="5040" w:hanging="360"/>
+      </w:pPr>
+      <w:rPr>
+        <w:rFonts w:ascii="Wingdings" w:hAnsi="Wingdings" w:hint="default"/>
+        <w:sz w:val="20"/>
+      </w:rPr>
+    </w:lvl>
+    <w:lvl w:ilvl="7" w:tentative="1">
+      <w:start w:val="1"/>
+      <w:numFmt w:val="bullet"/>
+      <w:lvlText w:val=""/>
+      <w:lvlJc w:val="left"/>
+      <w:pPr>
+        <w:tabs>
+          <w:tab w:val="num" w:pos="5760"/>
+        </w:tabs>
+        <w:ind w:left="5760" w:hanging="360"/>
+      </w:pPr>
+      <w:rPr>
+        <w:rFonts w:ascii="Wingdings" w:hAnsi="Wingdings" w:hint="default"/>
+        <w:sz w:val="20"/>
+      </w:rPr>
+    </w:lvl>
+    <w:lvl w:ilvl="8" w:tentative="1">
+      <w:start w:val="1"/>
+      <w:numFmt w:val="bullet"/>
+      <w:lvlText w:val=""/>
+      <w:lvlJc w:val="left"/>
+      <w:pPr>
+        <w:tabs>
+          <w:tab w:val="num" w:pos="6480"/>
+        </w:tabs>
+        <w:ind w:left="6480" w:hanging="360"/>
+      </w:pPr>
+      <w:rPr>
+        <w:rFonts w:ascii="Wingdings" w:hAnsi="Wingdings" w:hint="default"/>
+        <w:sz w:val="20"/>
+      </w:rPr>
+    </w:lvl>
+  </w:abstractNum>
+  <w:abstractNum w:abstractNumId="1" w15:restartNumberingAfterBreak="0">
+    <w:nsid w:val="05C639F7"/>
+    <w:multiLevelType w:val="multilevel"/>
+    <w:tmpl w:val="DDF0C17E"/>
+    <w:lvl w:ilvl="0">
+      <w:start w:val="1"/>
+      <w:numFmt w:val="bullet"/>
+      <w:lvlText w:val=""/>
+      <w:lvlJc w:val="left"/>
+      <w:pPr>
+        <w:tabs>
+          <w:tab w:val="num" w:pos="720"/>
+        </w:tabs>
+        <w:ind w:left="720" w:hanging="360"/>
+      </w:pPr>
+      <w:rPr>
+        <w:rFonts w:ascii="Symbol" w:hAnsi="Symbol" w:hint="default"/>
+        <w:sz w:val="20"/>
+      </w:rPr>
+    </w:lvl>
+    <w:lvl w:ilvl="1" w:tentative="1">
+      <w:start w:val="1"/>
+      <w:numFmt w:val="bullet"/>
+      <w:lvlText w:val="o"/>
+      <w:lvlJc w:val="left"/>
+      <w:pPr>
+        <w:tabs>
+          <w:tab w:val="num" w:pos="1440"/>
+        </w:tabs>
+        <w:ind w:left="1440" w:hanging="360"/>
+      </w:pPr>
+      <w:rPr>
+        <w:rFonts w:ascii="Courier New" w:hAnsi="Courier New" w:hint="default"/>
+        <w:sz w:val="20"/>
+      </w:rPr>
+    </w:lvl>
+    <w:lvl w:ilvl="2" w:tentative="1">
+      <w:start w:val="1"/>
+      <w:numFmt w:val="bullet"/>
+      <w:lvlText w:val=""/>
+      <w:lvlJc w:val="left"/>
+      <w:pPr>
+        <w:tabs>
+          <w:tab w:val="num" w:pos="2160"/>
+        </w:tabs>
+        <w:ind w:left="2160" w:hanging="360"/>
+      </w:pPr>
+      <w:rPr>
+        <w:rFonts w:ascii="Wingdings" w:hAnsi="Wingdings" w:hint="default"/>
+        <w:sz w:val="20"/>
+      </w:rPr>
+    </w:lvl>
+    <w:lvl w:ilvl="3" w:tentative="1">
+      <w:start w:val="1"/>
+      <w:numFmt w:val="bullet"/>
+      <w:lvlText w:val=""/>
+      <w:lvlJc w:val="left"/>
+      <w:pPr>
+        <w:tabs>
+          <w:tab w:val="num" w:pos="2880"/>
+        </w:tabs>
+        <w:ind w:left="2880" w:hanging="360"/>
+      </w:pPr>
+      <w:rPr>
+        <w:rFonts w:ascii="Wingdings" w:hAnsi="Wingdings" w:hint="default"/>
+        <w:sz w:val="20"/>
+      </w:rPr>
+    </w:lvl>
+    <w:lvl w:ilvl="4" w:tentative="1">
+      <w:start w:val="1"/>
+      <w:numFmt w:val="bullet"/>
+      <w:lvlText w:val=""/>
+      <w:lvlJc w:val="left"/>
+      <w:pPr>
+        <w:tabs>
+          <w:tab w:val="num" w:pos="3600"/>
+        </w:tabs>
+        <w:ind w:left="3600" w:hanging="360"/>
+      </w:pPr>
+      <w:rPr>
+        <w:rFonts w:ascii="Wingdings" w:hAnsi="Wingdings" w:hint="default"/>
+        <w:sz w:val="20"/>
+      </w:rPr>
+    </w:lvl>
+    <w:lvl w:ilvl="5" w:tentative="1">
+      <w:start w:val="1"/>
+      <w:numFmt w:val="bullet"/>
+      <w:lvlText w:val=""/>
+      <w:lvlJc w:val="left"/>
+      <w:pPr>
+        <w:tabs>
+          <w:tab w:val="num" w:pos="4320"/>
+        </w:tabs>
+        <w:ind w:left="4320" w:hanging="360"/>
+      </w:pPr>
+      <w:rPr>
+        <w:rFonts w:ascii="Wingdings" w:hAnsi="Wingdings" w:hint="default"/>
+        <w:sz w:val="20"/>
+      </w:rPr>
+    </w:lvl>
+    <w:lvl w:ilvl="6" w:tentative="1">
+      <w:start w:val="1"/>
+      <w:numFmt w:val="bullet"/>
+      <w:lvlText w:val=""/>
+      <w:lvlJc w:val="left"/>
+      <w:pPr>
+        <w:tabs>
+          <w:tab w:val="num" w:pos="5040"/>
+        </w:tabs>
+        <w:ind w:left="5040" w:hanging="360"/>
+      </w:pPr>
+      <w:rPr>
+        <w:rFonts w:ascii="Wingdings" w:hAnsi="Wingdings" w:hint="default"/>
+        <w:sz w:val="20"/>
+      </w:rPr>
+    </w:lvl>
+    <w:lvl w:ilvl="7" w:tentative="1">
+      <w:start w:val="1"/>
+      <w:numFmt w:val="bullet"/>
+      <w:lvlText w:val=""/>
+      <w:lvlJc w:val="left"/>
+      <w:pPr>
+        <w:tabs>
+          <w:tab w:val="num" w:pos="5760"/>
+        </w:tabs>
+        <w:ind w:left="5760" w:hanging="360"/>
+      </w:pPr>
+      <w:rPr>
+        <w:rFonts w:ascii="Wingdings" w:hAnsi="Wingdings" w:hint="default"/>
+        <w:sz w:val="20"/>
+      </w:rPr>
+    </w:lvl>
+    <w:lvl w:ilvl="8" w:tentative="1">
+      <w:start w:val="1"/>
+      <w:numFmt w:val="bullet"/>
+      <w:lvlText w:val=""/>
+      <w:lvlJc w:val="left"/>
+      <w:pPr>
+        <w:tabs>
+          <w:tab w:val="num" w:pos="6480"/>
+        </w:tabs>
+        <w:ind w:left="6480" w:hanging="360"/>
+      </w:pPr>
+      <w:rPr>
+        <w:rFonts w:ascii="Wingdings" w:hAnsi="Wingdings" w:hint="default"/>
+        <w:sz w:val="20"/>
+      </w:rPr>
+    </w:lvl>
+  </w:abstractNum>
+  <w:abstractNum w:abstractNumId="2" w15:restartNumberingAfterBreak="0">
+    <w:nsid w:val="16C11EFD"/>
+    <w:multiLevelType w:val="multilevel"/>
+    <w:tmpl w:val="ED5A2E0C"/>
+    <w:lvl w:ilvl="0">
+      <w:start w:val="1"/>
+      <w:numFmt w:val="bullet"/>
+      <w:lvlText w:val=""/>
+      <w:lvlJc w:val="left"/>
+      <w:pPr>
+        <w:tabs>
+          <w:tab w:val="num" w:pos="720"/>
+        </w:tabs>
+        <w:ind w:left="720" w:hanging="360"/>
+      </w:pPr>
+      <w:rPr>
+        <w:rFonts w:ascii="Symbol" w:hAnsi="Symbol" w:hint="default"/>
+        <w:sz w:val="20"/>
+      </w:rPr>
+    </w:lvl>
+    <w:lvl w:ilvl="1" w:tentative="1">
+      <w:start w:val="1"/>
+      <w:numFmt w:val="bullet"/>
+      <w:lvlText w:val="o"/>
+      <w:lvlJc w:val="left"/>
+      <w:pPr>
+        <w:tabs>
+          <w:tab w:val="num" w:pos="1440"/>
+        </w:tabs>
+        <w:ind w:left="1440" w:hanging="360"/>
+      </w:pPr>
+      <w:rPr>
+        <w:rFonts w:ascii="Courier New" w:hAnsi="Courier New" w:hint="default"/>
+        <w:sz w:val="20"/>
+      </w:rPr>
+    </w:lvl>
+    <w:lvl w:ilvl="2" w:tentative="1">
+      <w:start w:val="1"/>
+      <w:numFmt w:val="bullet"/>
+      <w:lvlText w:val=""/>
+      <w:lvlJc w:val="left"/>
+      <w:pPr>
+        <w:tabs>
+          <w:tab w:val="num" w:pos="2160"/>
+        </w:tabs>
+        <w:ind w:left="2160" w:hanging="360"/>
+      </w:pPr>
+      <w:rPr>
+        <w:rFonts w:ascii="Wingdings" w:hAnsi="Wingdings" w:hint="default"/>
+        <w:sz w:val="20"/>
+      </w:rPr>
+    </w:lvl>
+    <w:lvl w:ilvl="3" w:tentative="1">
+      <w:start w:val="1"/>
+      <w:numFmt w:val="bullet"/>
+      <w:lvlText w:val=""/>
+      <w:lvlJc w:val="left"/>
+      <w:pPr>
+        <w:tabs>
+          <w:tab w:val="num" w:pos="2880"/>
+        </w:tabs>
+        <w:ind w:left="2880" w:hanging="360"/>
+      </w:pPr>
+      <w:rPr>
+        <w:rFonts w:ascii="Wingdings" w:hAnsi="Wingdings" w:hint="default"/>
+        <w:sz w:val="20"/>
+      </w:rPr>
+    </w:lvl>
+    <w:lvl w:ilvl="4" w:tentative="1">
+      <w:start w:val="1"/>
+      <w:numFmt w:val="bullet"/>
+      <w:lvlText w:val=""/>
+      <w:lvlJc w:val="left"/>
+      <w:pPr>
+        <w:tabs>
+          <w:tab w:val="num" w:pos="3600"/>
+        </w:tabs>
+        <w:ind w:left="3600" w:hanging="360"/>
+      </w:pPr>
+      <w:rPr>
+        <w:rFonts w:ascii="Wingdings" w:hAnsi="Wingdings" w:hint="default"/>
+        <w:sz w:val="20"/>
+      </w:rPr>
+    </w:lvl>
+    <w:lvl w:ilvl="5" w:tentative="1">
+      <w:start w:val="1"/>
+      <w:numFmt w:val="bullet"/>
+      <w:lvlText w:val=""/>
+      <w:lvlJc w:val="left"/>
+      <w:pPr>
+        <w:tabs>
+          <w:tab w:val="num" w:pos="4320"/>
+        </w:tabs>
+        <w:ind w:left="4320" w:hanging="360"/>
+      </w:pPr>
+      <w:rPr>
+        <w:rFonts w:ascii="Wingdings" w:hAnsi="Wingdings" w:hint="default"/>
+        <w:sz w:val="20"/>
+      </w:rPr>
+    </w:lvl>
+    <w:lvl w:ilvl="6" w:tentative="1">
+      <w:start w:val="1"/>
+      <w:numFmt w:val="bullet"/>
+      <w:lvlText w:val=""/>
+      <w:lvlJc w:val="left"/>
+      <w:pPr>
+        <w:tabs>
+          <w:tab w:val="num" w:pos="5040"/>
+        </w:tabs>
+        <w:ind w:left="5040" w:hanging="360"/>
+      </w:pPr>
+      <w:rPr>
+        <w:rFonts w:ascii="Wingdings" w:hAnsi="Wingdings" w:hint="default"/>
+        <w:sz w:val="20"/>
+      </w:rPr>
+    </w:lvl>
+    <w:lvl w:ilvl="7" w:tentative="1">
+      <w:start w:val="1"/>
+      <w:numFmt w:val="bullet"/>
+      <w:lvlText w:val=""/>
+      <w:lvlJc w:val="left"/>
+      <w:pPr>
+        <w:tabs>
+          <w:tab w:val="num" w:pos="5760"/>
+        </w:tabs>
+        <w:ind w:left="5760" w:hanging="360"/>
+      </w:pPr>
+      <w:rPr>
+        <w:rFonts w:ascii="Wingdings" w:hAnsi="Wingdings" w:hint="default"/>
+        <w:sz w:val="20"/>
+      </w:rPr>
+    </w:lvl>
+    <w:lvl w:ilvl="8" w:tentative="1">
+      <w:start w:val="1"/>
+      <w:numFmt w:val="bullet"/>
+      <w:lvlText w:val=""/>
+      <w:lvlJc w:val="left"/>
+      <w:pPr>
+        <w:tabs>
+          <w:tab w:val="num" w:pos="6480"/>
+        </w:tabs>
+        <w:ind w:left="6480" w:hanging="360"/>
+      </w:pPr>
+      <w:rPr>
+        <w:rFonts w:ascii="Wingdings" w:hAnsi="Wingdings" w:hint="default"/>
+        <w:sz w:val="20"/>
+      </w:rPr>
+    </w:lvl>
+  </w:abstractNum>
+  <w:abstractNum w:abstractNumId="3" w15:restartNumberingAfterBreak="0">
     <w:nsid w:val="3C315275"/>
     <w:multiLevelType w:val="hybridMultilevel"/>
     <w:tmpl w:val="55201092"/>
@@ -952,7 +2565,156 @@
       </w:rPr>
     </w:lvl>
   </w:abstractNum>
-  <w:abstractNum w:abstractNumId="1" w15:restartNumberingAfterBreak="0">
+  <w:abstractNum w:abstractNumId="4" w15:restartNumberingAfterBreak="0">
+    <w:nsid w:val="5E9428E0"/>
+    <w:multiLevelType w:val="multilevel"/>
+    <w:tmpl w:val="BAD4D41A"/>
+    <w:lvl w:ilvl="0">
+      <w:start w:val="1"/>
+      <w:numFmt w:val="bullet"/>
+      <w:lvlText w:val=""/>
+      <w:lvlJc w:val="left"/>
+      <w:pPr>
+        <w:tabs>
+          <w:tab w:val="num" w:pos="720"/>
+        </w:tabs>
+        <w:ind w:left="720" w:hanging="360"/>
+      </w:pPr>
+      <w:rPr>
+        <w:rFonts w:ascii="Symbol" w:hAnsi="Symbol" w:hint="default"/>
+        <w:sz w:val="20"/>
+      </w:rPr>
+    </w:lvl>
+    <w:lvl w:ilvl="1" w:tentative="1">
+      <w:start w:val="1"/>
+      <w:numFmt w:val="bullet"/>
+      <w:lvlText w:val="o"/>
+      <w:lvlJc w:val="left"/>
+      <w:pPr>
+        <w:tabs>
+          <w:tab w:val="num" w:pos="1440"/>
+        </w:tabs>
+        <w:ind w:left="1440" w:hanging="360"/>
+      </w:pPr>
+      <w:rPr>
+        <w:rFonts w:ascii="Courier New" w:hAnsi="Courier New" w:hint="default"/>
+        <w:sz w:val="20"/>
+      </w:rPr>
+    </w:lvl>
+    <w:lvl w:ilvl="2" w:tentative="1">
+      <w:start w:val="1"/>
+      <w:numFmt w:val="bullet"/>
+      <w:lvlText w:val=""/>
+      <w:lvlJc w:val="left"/>
+      <w:pPr>
+        <w:tabs>
+          <w:tab w:val="num" w:pos="2160"/>
+        </w:tabs>
+        <w:ind w:left="2160" w:hanging="360"/>
+      </w:pPr>
+      <w:rPr>
+        <w:rFonts w:ascii="Wingdings" w:hAnsi="Wingdings" w:hint="default"/>
+        <w:sz w:val="20"/>
+      </w:rPr>
+    </w:lvl>
+    <w:lvl w:ilvl="3" w:tentative="1">
+      <w:start w:val="1"/>
+      <w:numFmt w:val="bullet"/>
+      <w:lvlText w:val=""/>
+      <w:lvlJc w:val="left"/>
+      <w:pPr>
+        <w:tabs>
+          <w:tab w:val="num" w:pos="2880"/>
+        </w:tabs>
+        <w:ind w:left="2880" w:hanging="360"/>
+      </w:pPr>
+      <w:rPr>
+        <w:rFonts w:ascii="Wingdings" w:hAnsi="Wingdings" w:hint="default"/>
+        <w:sz w:val="20"/>
+      </w:rPr>
+    </w:lvl>
+    <w:lvl w:ilvl="4" w:tentative="1">
+      <w:start w:val="1"/>
+      <w:numFmt w:val="bullet"/>
+      <w:lvlText w:val=""/>
+      <w:lvlJc w:val="left"/>
+      <w:pPr>
+        <w:tabs>
+          <w:tab w:val="num" w:pos="3600"/>
+        </w:tabs>
+        <w:ind w:left="3600" w:hanging="360"/>
+      </w:pPr>
+      <w:rPr>
+        <w:rFonts w:ascii="Wingdings" w:hAnsi="Wingdings" w:hint="default"/>
+        <w:sz w:val="20"/>
+      </w:rPr>
+    </w:lvl>
+    <w:lvl w:ilvl="5" w:tentative="1">
+      <w:start w:val="1"/>
+      <w:numFmt w:val="bullet"/>
+      <w:lvlText w:val=""/>
+      <w:lvlJc w:val="left"/>
+      <w:pPr>
+        <w:tabs>
+          <w:tab w:val="num" w:pos="4320"/>
+        </w:tabs>
+        <w:ind w:left="4320" w:hanging="360"/>
+      </w:pPr>
+      <w:rPr>
+        <w:rFonts w:ascii="Wingdings" w:hAnsi="Wingdings" w:hint="default"/>
+        <w:sz w:val="20"/>
+      </w:rPr>
+    </w:lvl>
+    <w:lvl w:ilvl="6" w:tentative="1">
+      <w:start w:val="1"/>
+      <w:numFmt w:val="bullet"/>
+      <w:lvlText w:val=""/>
+      <w:lvlJc w:val="left"/>
+      <w:pPr>
+        <w:tabs>
+          <w:tab w:val="num" w:pos="5040"/>
+        </w:tabs>
+        <w:ind w:left="5040" w:hanging="360"/>
+      </w:pPr>
+      <w:rPr>
+        <w:rFonts w:ascii="Wingdings" w:hAnsi="Wingdings" w:hint="default"/>
+        <w:sz w:val="20"/>
+      </w:rPr>
+    </w:lvl>
+    <w:lvl w:ilvl="7" w:tentative="1">
+      <w:start w:val="1"/>
+      <w:numFmt w:val="bullet"/>
+      <w:lvlText w:val=""/>
+      <w:lvlJc w:val="left"/>
+      <w:pPr>
+        <w:tabs>
+          <w:tab w:val="num" w:pos="5760"/>
+        </w:tabs>
+        <w:ind w:left="5760" w:hanging="360"/>
+      </w:pPr>
+      <w:rPr>
+        <w:rFonts w:ascii="Wingdings" w:hAnsi="Wingdings" w:hint="default"/>
+        <w:sz w:val="20"/>
+      </w:rPr>
+    </w:lvl>
+    <w:lvl w:ilvl="8" w:tentative="1">
+      <w:start w:val="1"/>
+      <w:numFmt w:val="bullet"/>
+      <w:lvlText w:val=""/>
+      <w:lvlJc w:val="left"/>
+      <w:pPr>
+        <w:tabs>
+          <w:tab w:val="num" w:pos="6480"/>
+        </w:tabs>
+        <w:ind w:left="6480" w:hanging="360"/>
+      </w:pPr>
+      <w:rPr>
+        <w:rFonts w:ascii="Wingdings" w:hAnsi="Wingdings" w:hint="default"/>
+        <w:sz w:val="20"/>
+      </w:rPr>
+    </w:lvl>
+  </w:abstractNum>
+  <w:abstractNum w:abstractNumId="5" w15:restartNumberingAfterBreak="0">
     <w:nsid w:val="63AE4A21"/>
     <w:multiLevelType w:val="hybridMultilevel"/>
     <w:tmpl w:val="AB0C81BC"/>
@@ -1041,7 +2803,7 @@
       </w:pPr>
     </w:lvl>
   </w:abstractNum>
-  <w:abstractNum w:abstractNumId="2" w15:restartNumberingAfterBreak="0">
+  <w:abstractNum w:abstractNumId="6" w15:restartNumberingAfterBreak="0">
     <w:nsid w:val="78470C7A"/>
     <w:multiLevelType w:val="hybridMultilevel"/>
     <w:tmpl w:val="D234A6A2"/>
@@ -1154,14 +2916,142 @@
       </w:rPr>
     </w:lvl>
   </w:abstractNum>
+  <w:abstractNum w:abstractNumId="7" w15:restartNumberingAfterBreak="0">
+    <w:nsid w:val="7FC04B53"/>
+    <w:multiLevelType w:val="hybridMultilevel"/>
+    <w:tmpl w:val="E528DE40"/>
+    <w:lvl w:ilvl="0" w:tplc="240A0001">
+      <w:start w:val="1"/>
+      <w:numFmt w:val="bullet"/>
+      <w:lvlText w:val=""/>
+      <w:lvlJc w:val="left"/>
+      <w:pPr>
+        <w:ind w:left="720" w:hanging="360"/>
+      </w:pPr>
+      <w:rPr>
+        <w:rFonts w:ascii="Symbol" w:hAnsi="Symbol" w:hint="default"/>
+      </w:rPr>
+    </w:lvl>
+    <w:lvl w:ilvl="1" w:tplc="240A0003" w:tentative="1">
+      <w:start w:val="1"/>
+      <w:numFmt w:val="bullet"/>
+      <w:lvlText w:val="o"/>
+      <w:lvlJc w:val="left"/>
+      <w:pPr>
+        <w:ind w:left="1440" w:hanging="360"/>
+      </w:pPr>
+      <w:rPr>
+        <w:rFonts w:ascii="Courier New" w:hAnsi="Courier New" w:cs="Courier New" w:hint="default"/>
+      </w:rPr>
+    </w:lvl>
+    <w:lvl w:ilvl="2" w:tplc="240A0005" w:tentative="1">
+      <w:start w:val="1"/>
+      <w:numFmt w:val="bullet"/>
+      <w:lvlText w:val=""/>
+      <w:lvlJc w:val="left"/>
+      <w:pPr>
+        <w:ind w:left="2160" w:hanging="360"/>
+      </w:pPr>
+      <w:rPr>
+        <w:rFonts w:ascii="Wingdings" w:hAnsi="Wingdings" w:hint="default"/>
+      </w:rPr>
+    </w:lvl>
+    <w:lvl w:ilvl="3" w:tplc="240A0001" w:tentative="1">
+      <w:start w:val="1"/>
+      <w:numFmt w:val="bullet"/>
+      <w:lvlText w:val=""/>
+      <w:lvlJc w:val="left"/>
+      <w:pPr>
+        <w:ind w:left="2880" w:hanging="360"/>
+      </w:pPr>
+      <w:rPr>
+        <w:rFonts w:ascii="Symbol" w:hAnsi="Symbol" w:hint="default"/>
+      </w:rPr>
+    </w:lvl>
+    <w:lvl w:ilvl="4" w:tplc="240A0003" w:tentative="1">
+      <w:start w:val="1"/>
+      <w:numFmt w:val="bullet"/>
+      <w:lvlText w:val="o"/>
+      <w:lvlJc w:val="left"/>
+      <w:pPr>
+        <w:ind w:left="3600" w:hanging="360"/>
+      </w:pPr>
+      <w:rPr>
+        <w:rFonts w:ascii="Courier New" w:hAnsi="Courier New" w:cs="Courier New" w:hint="default"/>
+      </w:rPr>
+    </w:lvl>
+    <w:lvl w:ilvl="5" w:tplc="240A0005" w:tentative="1">
+      <w:start w:val="1"/>
+      <w:numFmt w:val="bullet"/>
+      <w:lvlText w:val=""/>
+      <w:lvlJc w:val="left"/>
+      <w:pPr>
+        <w:ind w:left="4320" w:hanging="360"/>
+      </w:pPr>
+      <w:rPr>
+        <w:rFonts w:ascii="Wingdings" w:hAnsi="Wingdings" w:hint="default"/>
+      </w:rPr>
+    </w:lvl>
+    <w:lvl w:ilvl="6" w:tplc="240A0001" w:tentative="1">
+      <w:start w:val="1"/>
+      <w:numFmt w:val="bullet"/>
+      <w:lvlText w:val=""/>
+      <w:lvlJc w:val="left"/>
+      <w:pPr>
+        <w:ind w:left="5040" w:hanging="360"/>
+      </w:pPr>
+      <w:rPr>
+        <w:rFonts w:ascii="Symbol" w:hAnsi="Symbol" w:hint="default"/>
+      </w:rPr>
+    </w:lvl>
+    <w:lvl w:ilvl="7" w:tplc="240A0003" w:tentative="1">
+      <w:start w:val="1"/>
+      <w:numFmt w:val="bullet"/>
+      <w:lvlText w:val="o"/>
+      <w:lvlJc w:val="left"/>
+      <w:pPr>
+        <w:ind w:left="5760" w:hanging="360"/>
+      </w:pPr>
+      <w:rPr>
+        <w:rFonts w:ascii="Courier New" w:hAnsi="Courier New" w:cs="Courier New" w:hint="default"/>
+      </w:rPr>
+    </w:lvl>
+    <w:lvl w:ilvl="8" w:tplc="240A0005" w:tentative="1">
+      <w:start w:val="1"/>
+      <w:numFmt w:val="bullet"/>
+      <w:lvlText w:val=""/>
+      <w:lvlJc w:val="left"/>
+      <w:pPr>
+        <w:ind w:left="6480" w:hanging="360"/>
+      </w:pPr>
+      <w:rPr>
+        <w:rFonts w:ascii="Wingdings" w:hAnsi="Wingdings" w:hint="default"/>
+      </w:rPr>
+    </w:lvl>
+  </w:abstractNum>
   <w:num w:numId="1" w16cid:durableId="2072918953">
+    <w:abstractNumId w:val="6"/>
+  </w:num>
+  <w:num w:numId="2" w16cid:durableId="531721828">
+    <w:abstractNumId w:val="3"/>
+  </w:num>
+  <w:num w:numId="3" w16cid:durableId="1537039708">
+    <w:abstractNumId w:val="5"/>
+  </w:num>
+  <w:num w:numId="4" w16cid:durableId="250312951">
+    <w:abstractNumId w:val="7"/>
+  </w:num>
+  <w:num w:numId="5" w16cid:durableId="1880506710">
     <w:abstractNumId w:val="2"/>
   </w:num>
-  <w:num w:numId="2" w16cid:durableId="531721828">
+  <w:num w:numId="6" w16cid:durableId="1324315780">
+    <w:abstractNumId w:val="1"/>
+  </w:num>
+  <w:num w:numId="7" w16cid:durableId="841971777">
+    <w:abstractNumId w:val="4"/>
+  </w:num>
+  <w:num w:numId="8" w16cid:durableId="860045031">
     <w:abstractNumId w:val="0"/>
-  </w:num>
-  <w:num w:numId="3" w16cid:durableId="1537039708">
-    <w:abstractNumId w:val="1"/>
   </w:num>
 </w:numbering>
 </file>
@@ -1567,11 +3457,11 @@
     <w:name w:val="Normal"/>
     <w:qFormat/>
   </w:style>
-  <w:style w:type="paragraph" w:styleId="Heading1">
+  <w:style w:type="paragraph" w:styleId="Ttulo1">
     <w:name w:val="heading 1"/>
     <w:basedOn w:val="Normal"/>
     <w:next w:val="Normal"/>
-    <w:link w:val="Heading1Char"/>
+    <w:link w:val="Ttulo1Car"/>
     <w:uiPriority w:val="9"/>
     <w:qFormat/>
     <w:rsid w:val="00742792"/>
@@ -1588,11 +3478,11 @@
       <w:szCs w:val="40"/>
     </w:rPr>
   </w:style>
-  <w:style w:type="paragraph" w:styleId="Heading2">
+  <w:style w:type="paragraph" w:styleId="Ttulo2">
     <w:name w:val="heading 2"/>
     <w:basedOn w:val="Normal"/>
     <w:next w:val="Normal"/>
-    <w:link w:val="Heading2Char"/>
+    <w:link w:val="Ttulo2Car"/>
     <w:uiPriority w:val="9"/>
     <w:semiHidden/>
     <w:unhideWhenUsed/>
@@ -1611,13 +3501,12 @@
       <w:szCs w:val="32"/>
     </w:rPr>
   </w:style>
-  <w:style w:type="paragraph" w:styleId="Heading3">
+  <w:style w:type="paragraph" w:styleId="Ttulo3">
     <w:name w:val="heading 3"/>
     <w:basedOn w:val="Normal"/>
     <w:next w:val="Normal"/>
-    <w:link w:val="Heading3Char"/>
+    <w:link w:val="Ttulo3Car"/>
     <w:uiPriority w:val="9"/>
-    <w:semiHidden/>
     <w:unhideWhenUsed/>
     <w:qFormat/>
     <w:rsid w:val="00742792"/>
@@ -1634,11 +3523,11 @@
       <w:szCs w:val="28"/>
     </w:rPr>
   </w:style>
-  <w:style w:type="paragraph" w:styleId="Heading4">
+  <w:style w:type="paragraph" w:styleId="Ttulo4">
     <w:name w:val="heading 4"/>
     <w:basedOn w:val="Normal"/>
     <w:next w:val="Normal"/>
-    <w:link w:val="Heading4Char"/>
+    <w:link w:val="Ttulo4Car"/>
     <w:uiPriority w:val="9"/>
     <w:semiHidden/>
     <w:unhideWhenUsed/>
@@ -1657,11 +3546,11 @@
       <w:color w:val="0F4761" w:themeColor="accent1" w:themeShade="BF"/>
     </w:rPr>
   </w:style>
-  <w:style w:type="paragraph" w:styleId="Heading5">
+  <w:style w:type="paragraph" w:styleId="Ttulo5">
     <w:name w:val="heading 5"/>
     <w:basedOn w:val="Normal"/>
     <w:next w:val="Normal"/>
-    <w:link w:val="Heading5Char"/>
+    <w:link w:val="Ttulo5Car"/>
     <w:uiPriority w:val="9"/>
     <w:semiHidden/>
     <w:unhideWhenUsed/>
@@ -1678,11 +3567,11 @@
       <w:color w:val="0F4761" w:themeColor="accent1" w:themeShade="BF"/>
     </w:rPr>
   </w:style>
-  <w:style w:type="paragraph" w:styleId="Heading6">
+  <w:style w:type="paragraph" w:styleId="Ttulo6">
     <w:name w:val="heading 6"/>
     <w:basedOn w:val="Normal"/>
     <w:next w:val="Normal"/>
-    <w:link w:val="Heading6Char"/>
+    <w:link w:val="Ttulo6Car"/>
     <w:uiPriority w:val="9"/>
     <w:semiHidden/>
     <w:unhideWhenUsed/>
@@ -1701,11 +3590,11 @@
       <w:color w:val="595959" w:themeColor="text1" w:themeTint="A6"/>
     </w:rPr>
   </w:style>
-  <w:style w:type="paragraph" w:styleId="Heading7">
+  <w:style w:type="paragraph" w:styleId="Ttulo7">
     <w:name w:val="heading 7"/>
     <w:basedOn w:val="Normal"/>
     <w:next w:val="Normal"/>
-    <w:link w:val="Heading7Char"/>
+    <w:link w:val="Ttulo7Car"/>
     <w:uiPriority w:val="9"/>
     <w:semiHidden/>
     <w:unhideWhenUsed/>
@@ -1722,11 +3611,11 @@
       <w:color w:val="595959" w:themeColor="text1" w:themeTint="A6"/>
     </w:rPr>
   </w:style>
-  <w:style w:type="paragraph" w:styleId="Heading8">
+  <w:style w:type="paragraph" w:styleId="Ttulo8">
     <w:name w:val="heading 8"/>
     <w:basedOn w:val="Normal"/>
     <w:next w:val="Normal"/>
-    <w:link w:val="Heading8Char"/>
+    <w:link w:val="Ttulo8Car"/>
     <w:uiPriority w:val="9"/>
     <w:semiHidden/>
     <w:unhideWhenUsed/>
@@ -1745,11 +3634,11 @@
       <w:color w:val="272727" w:themeColor="text1" w:themeTint="D8"/>
     </w:rPr>
   </w:style>
-  <w:style w:type="paragraph" w:styleId="Heading9">
+  <w:style w:type="paragraph" w:styleId="Ttulo9">
     <w:name w:val="heading 9"/>
     <w:basedOn w:val="Normal"/>
     <w:next w:val="Normal"/>
-    <w:link w:val="Heading9Char"/>
+    <w:link w:val="Ttulo9Car"/>
     <w:uiPriority w:val="9"/>
     <w:semiHidden/>
     <w:unhideWhenUsed/>
@@ -1766,13 +3655,12 @@
       <w:color w:val="272727" w:themeColor="text1" w:themeTint="D8"/>
     </w:rPr>
   </w:style>
-  <w:style w:type="character" w:default="1" w:styleId="DefaultParagraphFont">
+  <w:style w:type="character" w:default="1" w:styleId="Fuentedeprrafopredeter">
     <w:name w:val="Default Paragraph Font"/>
     <w:uiPriority w:val="1"/>
-    <w:semiHidden/>
     <w:unhideWhenUsed/>
   </w:style>
-  <w:style w:type="table" w:default="1" w:styleId="TableNormal">
+  <w:style w:type="table" w:default="1" w:styleId="Tablanormal">
     <w:name w:val="Normal Table"/>
     <w:uiPriority w:val="99"/>
     <w:semiHidden/>
@@ -1787,16 +3675,16 @@
       </w:tblCellMar>
     </w:tblPr>
   </w:style>
-  <w:style w:type="numbering" w:default="1" w:styleId="NoList">
+  <w:style w:type="numbering" w:default="1" w:styleId="Sinlista">
     <w:name w:val="No List"/>
     <w:uiPriority w:val="99"/>
     <w:semiHidden/>
     <w:unhideWhenUsed/>
   </w:style>
-  <w:style w:type="character" w:customStyle="1" w:styleId="Heading1Char">
-    <w:name w:val="Heading 1 Char"/>
-    <w:basedOn w:val="DefaultParagraphFont"/>
-    <w:link w:val="Heading1"/>
+  <w:style w:type="character" w:customStyle="1" w:styleId="Ttulo1Car">
+    <w:name w:val="Título 1 Car"/>
+    <w:basedOn w:val="Fuentedeprrafopredeter"/>
+    <w:link w:val="Ttulo1"/>
     <w:uiPriority w:val="9"/>
     <w:rsid w:val="00742792"/>
     <w:rPr>
@@ -1806,10 +3694,10 @@
       <w:szCs w:val="40"/>
     </w:rPr>
   </w:style>
-  <w:style w:type="character" w:customStyle="1" w:styleId="Heading2Char">
-    <w:name w:val="Heading 2 Char"/>
-    <w:basedOn w:val="DefaultParagraphFont"/>
-    <w:link w:val="Heading2"/>
+  <w:style w:type="character" w:customStyle="1" w:styleId="Ttulo2Car">
+    <w:name w:val="Título 2 Car"/>
+    <w:basedOn w:val="Fuentedeprrafopredeter"/>
+    <w:link w:val="Ttulo2"/>
     <w:uiPriority w:val="9"/>
     <w:semiHidden/>
     <w:rsid w:val="00742792"/>
@@ -1820,12 +3708,11 @@
       <w:szCs w:val="32"/>
     </w:rPr>
   </w:style>
-  <w:style w:type="character" w:customStyle="1" w:styleId="Heading3Char">
-    <w:name w:val="Heading 3 Char"/>
-    <w:basedOn w:val="DefaultParagraphFont"/>
-    <w:link w:val="Heading3"/>
+  <w:style w:type="character" w:customStyle="1" w:styleId="Ttulo3Car">
+    <w:name w:val="Título 3 Car"/>
+    <w:basedOn w:val="Fuentedeprrafopredeter"/>
+    <w:link w:val="Ttulo3"/>
     <w:uiPriority w:val="9"/>
-    <w:semiHidden/>
     <w:rsid w:val="00742792"/>
     <w:rPr>
       <w:rFonts w:eastAsiaTheme="majorEastAsia" w:cstheme="majorBidi"/>
@@ -1834,10 +3721,10 @@
       <w:szCs w:val="28"/>
     </w:rPr>
   </w:style>
-  <w:style w:type="character" w:customStyle="1" w:styleId="Heading4Char">
-    <w:name w:val="Heading 4 Char"/>
-    <w:basedOn w:val="DefaultParagraphFont"/>
-    <w:link w:val="Heading4"/>
+  <w:style w:type="character" w:customStyle="1" w:styleId="Ttulo4Car">
+    <w:name w:val="Título 4 Car"/>
+    <w:basedOn w:val="Fuentedeprrafopredeter"/>
+    <w:link w:val="Ttulo4"/>
     <w:uiPriority w:val="9"/>
     <w:semiHidden/>
     <w:rsid w:val="00742792"/>
@@ -1848,10 +3735,10 @@
       <w:color w:val="0F4761" w:themeColor="accent1" w:themeShade="BF"/>
     </w:rPr>
   </w:style>
-  <w:style w:type="character" w:customStyle="1" w:styleId="Heading5Char">
-    <w:name w:val="Heading 5 Char"/>
-    <w:basedOn w:val="DefaultParagraphFont"/>
-    <w:link w:val="Heading5"/>
+  <w:style w:type="character" w:customStyle="1" w:styleId="Ttulo5Car">
+    <w:name w:val="Título 5 Car"/>
+    <w:basedOn w:val="Fuentedeprrafopredeter"/>
+    <w:link w:val="Ttulo5"/>
     <w:uiPriority w:val="9"/>
     <w:semiHidden/>
     <w:rsid w:val="00742792"/>
@@ -1860,10 +3747,10 @@
       <w:color w:val="0F4761" w:themeColor="accent1" w:themeShade="BF"/>
     </w:rPr>
   </w:style>
-  <w:style w:type="character" w:customStyle="1" w:styleId="Heading6Char">
-    <w:name w:val="Heading 6 Char"/>
-    <w:basedOn w:val="DefaultParagraphFont"/>
-    <w:link w:val="Heading6"/>
+  <w:style w:type="character" w:customStyle="1" w:styleId="Ttulo6Car">
+    <w:name w:val="Título 6 Car"/>
+    <w:basedOn w:val="Fuentedeprrafopredeter"/>
+    <w:link w:val="Ttulo6"/>
     <w:uiPriority w:val="9"/>
     <w:semiHidden/>
     <w:rsid w:val="00742792"/>
@@ -1874,10 +3761,10 @@
       <w:color w:val="595959" w:themeColor="text1" w:themeTint="A6"/>
     </w:rPr>
   </w:style>
-  <w:style w:type="character" w:customStyle="1" w:styleId="Heading7Char">
-    <w:name w:val="Heading 7 Char"/>
-    <w:basedOn w:val="DefaultParagraphFont"/>
-    <w:link w:val="Heading7"/>
+  <w:style w:type="character" w:customStyle="1" w:styleId="Ttulo7Car">
+    <w:name w:val="Título 7 Car"/>
+    <w:basedOn w:val="Fuentedeprrafopredeter"/>
+    <w:link w:val="Ttulo7"/>
     <w:uiPriority w:val="9"/>
     <w:semiHidden/>
     <w:rsid w:val="00742792"/>
@@ -1886,10 +3773,10 @@
       <w:color w:val="595959" w:themeColor="text1" w:themeTint="A6"/>
     </w:rPr>
   </w:style>
-  <w:style w:type="character" w:customStyle="1" w:styleId="Heading8Char">
-    <w:name w:val="Heading 8 Char"/>
-    <w:basedOn w:val="DefaultParagraphFont"/>
-    <w:link w:val="Heading8"/>
+  <w:style w:type="character" w:customStyle="1" w:styleId="Ttulo8Car">
+    <w:name w:val="Título 8 Car"/>
+    <w:basedOn w:val="Fuentedeprrafopredeter"/>
+    <w:link w:val="Ttulo8"/>
     <w:uiPriority w:val="9"/>
     <w:semiHidden/>
     <w:rsid w:val="00742792"/>
@@ -1900,10 +3787,10 @@
       <w:color w:val="272727" w:themeColor="text1" w:themeTint="D8"/>
     </w:rPr>
   </w:style>
-  <w:style w:type="character" w:customStyle="1" w:styleId="Heading9Char">
-    <w:name w:val="Heading 9 Char"/>
-    <w:basedOn w:val="DefaultParagraphFont"/>
-    <w:link w:val="Heading9"/>
+  <w:style w:type="character" w:customStyle="1" w:styleId="Ttulo9Car">
+    <w:name w:val="Título 9 Car"/>
+    <w:basedOn w:val="Fuentedeprrafopredeter"/>
+    <w:link w:val="Ttulo9"/>
     <w:uiPriority w:val="9"/>
     <w:semiHidden/>
     <w:rsid w:val="00742792"/>
@@ -1912,11 +3799,11 @@
       <w:color w:val="272727" w:themeColor="text1" w:themeTint="D8"/>
     </w:rPr>
   </w:style>
-  <w:style w:type="paragraph" w:styleId="Title">
+  <w:style w:type="paragraph" w:styleId="Ttulo">
     <w:name w:val="Title"/>
     <w:basedOn w:val="Normal"/>
     <w:next w:val="Normal"/>
-    <w:link w:val="TitleChar"/>
+    <w:link w:val="TtuloCar"/>
     <w:uiPriority w:val="10"/>
     <w:qFormat/>
     <w:rsid w:val="00742792"/>
@@ -1932,10 +3819,10 @@
       <w:szCs w:val="56"/>
     </w:rPr>
   </w:style>
-  <w:style w:type="character" w:customStyle="1" w:styleId="TitleChar">
-    <w:name w:val="Title Char"/>
-    <w:basedOn w:val="DefaultParagraphFont"/>
-    <w:link w:val="Title"/>
+  <w:style w:type="character" w:customStyle="1" w:styleId="TtuloCar">
+    <w:name w:val="Título Car"/>
+    <w:basedOn w:val="Fuentedeprrafopredeter"/>
+    <w:link w:val="Ttulo"/>
     <w:uiPriority w:val="10"/>
     <w:rsid w:val="00742792"/>
     <w:rPr>
@@ -1946,11 +3833,11 @@
       <w:szCs w:val="56"/>
     </w:rPr>
   </w:style>
-  <w:style w:type="paragraph" w:styleId="Subtitle">
+  <w:style w:type="paragraph" w:styleId="Subttulo">
     <w:name w:val="Subtitle"/>
     <w:basedOn w:val="Normal"/>
     <w:next w:val="Normal"/>
-    <w:link w:val="SubtitleChar"/>
+    <w:link w:val="SubttuloCar"/>
     <w:uiPriority w:val="11"/>
     <w:qFormat/>
     <w:rsid w:val="00742792"/>
@@ -1967,10 +3854,10 @@
       <w:szCs w:val="28"/>
     </w:rPr>
   </w:style>
-  <w:style w:type="character" w:customStyle="1" w:styleId="SubtitleChar">
-    <w:name w:val="Subtitle Char"/>
-    <w:basedOn w:val="DefaultParagraphFont"/>
-    <w:link w:val="Subtitle"/>
+  <w:style w:type="character" w:customStyle="1" w:styleId="SubttuloCar">
+    <w:name w:val="Subtítulo Car"/>
+    <w:basedOn w:val="Fuentedeprrafopredeter"/>
+    <w:link w:val="Subttulo"/>
     <w:uiPriority w:val="11"/>
     <w:rsid w:val="00742792"/>
     <w:rPr>
@@ -1981,11 +3868,11 @@
       <w:szCs w:val="28"/>
     </w:rPr>
   </w:style>
-  <w:style w:type="paragraph" w:styleId="Quote">
+  <w:style w:type="paragraph" w:styleId="Cita">
     <w:name w:val="Quote"/>
     <w:basedOn w:val="Normal"/>
     <w:next w:val="Normal"/>
-    <w:link w:val="QuoteChar"/>
+    <w:link w:val="CitaCar"/>
     <w:uiPriority w:val="29"/>
     <w:qFormat/>
     <w:rsid w:val="00742792"/>
@@ -1999,10 +3886,10 @@
       <w:color w:val="404040" w:themeColor="text1" w:themeTint="BF"/>
     </w:rPr>
   </w:style>
-  <w:style w:type="character" w:customStyle="1" w:styleId="QuoteChar">
-    <w:name w:val="Quote Char"/>
-    <w:basedOn w:val="DefaultParagraphFont"/>
-    <w:link w:val="Quote"/>
+  <w:style w:type="character" w:customStyle="1" w:styleId="CitaCar">
+    <w:name w:val="Cita Car"/>
+    <w:basedOn w:val="Fuentedeprrafopredeter"/>
+    <w:link w:val="Cita"/>
     <w:uiPriority w:val="29"/>
     <w:rsid w:val="00742792"/>
     <w:rPr>
@@ -2011,7 +3898,7 @@
       <w:color w:val="404040" w:themeColor="text1" w:themeTint="BF"/>
     </w:rPr>
   </w:style>
-  <w:style w:type="paragraph" w:styleId="ListParagraph">
+  <w:style w:type="paragraph" w:styleId="Prrafodelista">
     <w:name w:val="List Paragraph"/>
     <w:basedOn w:val="Normal"/>
     <w:uiPriority w:val="34"/>
@@ -2022,9 +3909,9 @@
       <w:contextualSpacing/>
     </w:pPr>
   </w:style>
-  <w:style w:type="character" w:styleId="IntenseEmphasis">
+  <w:style w:type="character" w:styleId="nfasisintenso">
     <w:name w:val="Intense Emphasis"/>
-    <w:basedOn w:val="DefaultParagraphFont"/>
+    <w:basedOn w:val="Fuentedeprrafopredeter"/>
     <w:uiPriority w:val="21"/>
     <w:qFormat/>
     <w:rsid w:val="00742792"/>
@@ -2034,11 +3921,11 @@
       <w:color w:val="0F4761" w:themeColor="accent1" w:themeShade="BF"/>
     </w:rPr>
   </w:style>
-  <w:style w:type="paragraph" w:styleId="IntenseQuote">
+  <w:style w:type="paragraph" w:styleId="Citadestacada">
     <w:name w:val="Intense Quote"/>
     <w:basedOn w:val="Normal"/>
     <w:next w:val="Normal"/>
-    <w:link w:val="IntenseQuoteChar"/>
+    <w:link w:val="CitadestacadaCar"/>
     <w:uiPriority w:val="30"/>
     <w:qFormat/>
     <w:rsid w:val="00742792"/>
@@ -2057,10 +3944,10 @@
       <w:color w:val="0F4761" w:themeColor="accent1" w:themeShade="BF"/>
     </w:rPr>
   </w:style>
-  <w:style w:type="character" w:customStyle="1" w:styleId="IntenseQuoteChar">
-    <w:name w:val="Intense Quote Char"/>
-    <w:basedOn w:val="DefaultParagraphFont"/>
-    <w:link w:val="IntenseQuote"/>
+  <w:style w:type="character" w:customStyle="1" w:styleId="CitadestacadaCar">
+    <w:name w:val="Cita destacada Car"/>
+    <w:basedOn w:val="Fuentedeprrafopredeter"/>
+    <w:link w:val="Citadestacada"/>
     <w:uiPriority w:val="30"/>
     <w:rsid w:val="00742792"/>
     <w:rPr>
@@ -2069,9 +3956,9 @@
       <w:color w:val="0F4761" w:themeColor="accent1" w:themeShade="BF"/>
     </w:rPr>
   </w:style>
-  <w:style w:type="character" w:styleId="IntenseReference">
+  <w:style w:type="character" w:styleId="Referenciaintensa">
     <w:name w:val="Intense Reference"/>
-    <w:basedOn w:val="DefaultParagraphFont"/>
+    <w:basedOn w:val="Fuentedeprrafopredeter"/>
     <w:uiPriority w:val="32"/>
     <w:qFormat/>
     <w:rsid w:val="00742792"/>
@@ -2096,7 +3983,7 @@
     <w:rPr>
       <w:rFonts w:ascii="Times New Roman" w:eastAsia="Times New Roman" w:hAnsi="Times New Roman" w:cs="Times New Roman"/>
       <w:kern w:val="0"/>
-      <w:lang w:val="en-CO"/>
+      <w:lang/>
       <w14:ligatures w14:val="none"/>
     </w:rPr>
   </w:style>

</xml_diff>